<commit_message>
Daily dashboard update — 2026-09-13
</commit_message>
<xml_diff>
--- a/reports/CPL_Master_Report.docx
+++ b/reports/CPL_Master_Report.docx
@@ -141,7 +141,7 @@
           <w:szCs w:val="22"/>
           <w:rFonts w:ascii="Cambria" w:cs="Cambria" w:eastAsia="Cambria" w:hAnsi="Cambria"/>
         </w:rPr>
-        <w:t xml:space="preserve">As of September 12, 2026, the CPL initiative is ahead of schedule, with most 2025–2026 targets met or exceeded and core infrastructure nearing completion. The work has expanded student access, increased transcripted units, and established the foundation for a permanent, statewide CPL service under Vision 2030.</w:t>
+        <w:t xml:space="preserve">As of September 13, 2026, the CPL initiative is ahead of schedule, with most 2025–2026 targets met or exceeded and core infrastructure nearing completion. The work has expanded student access, increased transcripted units, and established the foundation for a permanent, statewide CPL service under Vision 2030.</w:t>
       </w:r>
     </w:p>
     <w:p>
@@ -29659,7 +29659,7 @@
           <w:szCs w:val="20"/>
           <w:rFonts w:ascii="Cambria" w:cs="Cambria" w:eastAsia="Cambria" w:hAnsi="Cambria"/>
         </w:rPr>
-        <w:t xml:space="preserve">September 12, 2026</w:t>
+        <w:t xml:space="preserve">September 13, 2026</w:t>
       </w:r>
     </w:p>
     <w:sectPr>
@@ -29696,7 +29696,7 @@
         <w:szCs w:val="14"/>
         <w:rFonts w:ascii="Cambria" w:cs="Cambria" w:eastAsia="Cambria" w:hAnsi="Cambria"/>
       </w:rPr>
-      <w:t xml:space="preserve">Generated September 12, 2026  |  California Community Colleges  |  CPL Initiative</w:t>
+      <w:t xml:space="preserve">Generated September 13, 2026  |  California Community Colleges  |  CPL Initiative</w:t>
     </w:r>
     <w:r>
       <w:rPr>

</xml_diff>

<commit_message>
Daily dashboard update — 2026-09-14
</commit_message>
<xml_diff>
--- a/reports/CPL_Master_Report.docx
+++ b/reports/CPL_Master_Report.docx
@@ -141,7 +141,7 @@
           <w:szCs w:val="22"/>
           <w:rFonts w:ascii="Cambria" w:cs="Cambria" w:eastAsia="Cambria" w:hAnsi="Cambria"/>
         </w:rPr>
-        <w:t xml:space="preserve">As of September 13, 2026, the CPL initiative is ahead of schedule, with most 2025–2026 targets met or exceeded and core infrastructure nearing completion. The work has expanded student access, increased transcripted units, and established the foundation for a permanent, statewide CPL service under Vision 2030.</w:t>
+        <w:t xml:space="preserve">As of September 14, 2026, the CPL initiative is ahead of schedule, with most 2025–2026 targets met or exceeded and core infrastructure nearing completion. The work has expanded student access, increased transcripted units, and established the foundation for a permanent, statewide CPL service under Vision 2030.</w:t>
       </w:r>
     </w:p>
     <w:p>
@@ -29659,7 +29659,7 @@
           <w:szCs w:val="20"/>
           <w:rFonts w:ascii="Cambria" w:cs="Cambria" w:eastAsia="Cambria" w:hAnsi="Cambria"/>
         </w:rPr>
-        <w:t xml:space="preserve">September 13, 2026</w:t>
+        <w:t xml:space="preserve">September 14, 2026</w:t>
       </w:r>
     </w:p>
     <w:sectPr>
@@ -29696,7 +29696,7 @@
         <w:szCs w:val="14"/>
         <w:rFonts w:ascii="Cambria" w:cs="Cambria" w:eastAsia="Cambria" w:hAnsi="Cambria"/>
       </w:rPr>
-      <w:t xml:space="preserve">Generated September 13, 2026  |  California Community Colleges  |  CPL Initiative</w:t>
+      <w:t xml:space="preserve">Generated September 14, 2026  |  California Community Colleges  |  CPL Initiative</w:t>
     </w:r>
     <w:r>
       <w:rPr>

</xml_diff>

<commit_message>
Daily dashboard update — 2026-09-15
</commit_message>
<xml_diff>
--- a/reports/CPL_Master_Report.docx
+++ b/reports/CPL_Master_Report.docx
@@ -141,7 +141,7 @@
           <w:szCs w:val="22"/>
           <w:rFonts w:ascii="Cambria" w:cs="Cambria" w:eastAsia="Cambria" w:hAnsi="Cambria"/>
         </w:rPr>
-        <w:t xml:space="preserve">As of September 14, 2026, the CPL initiative is ahead of schedule, with most 2025–2026 targets met or exceeded and core infrastructure nearing completion. The work has expanded student access, increased transcripted units, and established the foundation for a permanent, statewide CPL service under Vision 2030.</w:t>
+        <w:t xml:space="preserve">As of September 15, 2026, the CPL initiative is ahead of schedule, with most 2025–2026 targets met or exceeded and core infrastructure nearing completion. The work has expanded student access, increased transcripted units, and established the foundation for a permanent, statewide CPL service under Vision 2030.</w:t>
       </w:r>
     </w:p>
     <w:p>
@@ -167,7 +167,7 @@
           <w:szCs w:val="21"/>
           <w:rFonts w:ascii="Cambria" w:cs="Cambria" w:eastAsia="Cambria" w:hAnsi="Cambria"/>
         </w:rPr>
-        <w:t xml:space="preserve">51,473 cumulative students served with CPL awards, surpassing annual targets.</w:t>
+        <w:t xml:space="preserve">51,538 cumulative students served with CPL awards, surpassing annual targets.</w:t>
       </w:r>
     </w:p>
     <w:p>
@@ -239,7 +239,7 @@
           <w:szCs w:val="21"/>
           <w:rFonts w:ascii="Cambria" w:cs="Cambria" w:eastAsia="Cambria" w:hAnsi="Cambria"/>
         </w:rPr>
-        <w:t xml:space="preserve">The Veteran Sprint has uploaded 57 JSTs to MAP, with estimated student savings of $329M and projected 20-year economic impact of $1.31B.</w:t>
+        <w:t xml:space="preserve">The Veteran Sprint has uploaded 57 JSTs to MAP, with estimated student savings of $330M and projected 20-year economic impact of $1.31B.</w:t>
       </w:r>
     </w:p>
     <w:p>
@@ -424,7 +424,7 @@
                 <w:szCs w:val="20"/>
                 <w:rFonts w:ascii="Cambria" w:cs="Cambria" w:eastAsia="Cambria" w:hAnsi="Cambria"/>
               </w:rPr>
-              <w:t xml:space="preserve">51,473</w:t>
+              <w:t xml:space="preserve">51,538</w:t>
             </w:r>
           </w:p>
         </w:tc>
@@ -774,7 +774,7 @@
                 <w:szCs w:val="20"/>
                 <w:rFonts w:ascii="Cambria" w:cs="Cambria" w:eastAsia="Cambria" w:hAnsi="Cambria"/>
               </w:rPr>
-              <w:t xml:space="preserve">$329M</w:t>
+              <w:t xml:space="preserve">$330M</w:t>
             </w:r>
           </w:p>
         </w:tc>
@@ -29608,7 +29608,7 @@
           <w:szCs w:val="22"/>
           <w:rFonts w:ascii="Cambria" w:cs="Cambria" w:eastAsia="Cambria" w:hAnsi="Cambria"/>
         </w:rPr>
-        <w:t xml:space="preserve">The CPL Initiative has moved from pilot to scale, demonstrating measurable impact in student access, credit attainment, and system engagement. With 51,473 students served, 13,308 statewide credit recommendations, and 103 actively participating colleges, the initiative has surpassed most 2025–26 benchmarks ahead of schedule.</w:t>
+        <w:t xml:space="preserve">The CPL Initiative has moved from pilot to scale, demonstrating measurable impact in student access, credit attainment, and system engagement. With 51,538 students served, 13,308 statewide credit recommendations, and 103 actively participating colleges, the initiative has surpassed most 2025–26 benchmarks ahead of schedule.</w:t>
       </w:r>
     </w:p>
     <w:p>
@@ -29659,7 +29659,7 @@
           <w:szCs w:val="20"/>
           <w:rFonts w:ascii="Cambria" w:cs="Cambria" w:eastAsia="Cambria" w:hAnsi="Cambria"/>
         </w:rPr>
-        <w:t xml:space="preserve">September 14, 2026</w:t>
+        <w:t xml:space="preserve">September 15, 2026</w:t>
       </w:r>
     </w:p>
     <w:sectPr>
@@ -29696,7 +29696,7 @@
         <w:szCs w:val="14"/>
         <w:rFonts w:ascii="Cambria" w:cs="Cambria" w:eastAsia="Cambria" w:hAnsi="Cambria"/>
       </w:rPr>
-      <w:t xml:space="preserve">Generated September 14, 2026  |  California Community Colleges  |  CPL Initiative</w:t>
+      <w:t xml:space="preserve">Generated September 15, 2026  |  California Community Colleges  |  CPL Initiative</w:t>
     </w:r>
     <w:r>
       <w:rPr>

</xml_diff>

<commit_message>
Daily dashboard update — 2026-09-16
</commit_message>
<xml_diff>
--- a/reports/CPL_Master_Report.docx
+++ b/reports/CPL_Master_Report.docx
@@ -141,7 +141,7 @@
           <w:szCs w:val="22"/>
           <w:rFonts w:ascii="Cambria" w:cs="Cambria" w:eastAsia="Cambria" w:hAnsi="Cambria"/>
         </w:rPr>
-        <w:t xml:space="preserve">As of September 15, 2026, the CPL initiative is ahead of schedule, with most 2025–2026 targets met or exceeded and core infrastructure nearing completion. The work has expanded student access, increased transcripted units, and established the foundation for a permanent, statewide CPL service under Vision 2030.</w:t>
+        <w:t xml:space="preserve">As of September 16, 2026, the CPL initiative is ahead of schedule, with most 2025–2026 targets met or exceeded and core infrastructure nearing completion. The work has expanded student access, increased transcripted units, and established the foundation for a permanent, statewide CPL service under Vision 2030.</w:t>
       </w:r>
     </w:p>
     <w:p>
@@ -167,7 +167,7 @@
           <w:szCs w:val="21"/>
           <w:rFonts w:ascii="Cambria" w:cs="Cambria" w:eastAsia="Cambria" w:hAnsi="Cambria"/>
         </w:rPr>
-        <w:t xml:space="preserve">51,543 cumulative students served with CPL awards, surpassing annual targets.</w:t>
+        <w:t xml:space="preserve">51,594 cumulative students served with CPL awards, surpassing annual targets.</w:t>
       </w:r>
     </w:p>
     <w:p>
@@ -185,7 +185,7 @@
           <w:szCs w:val="21"/>
           <w:rFonts w:ascii="Cambria" w:cs="Cambria" w:eastAsia="Cambria" w:hAnsi="Cambria"/>
         </w:rPr>
-        <w:t xml:space="preserve">220k CPL units transcripted across the system.</w:t>
+        <w:t xml:space="preserve">221k CPL units transcripted across the system.</w:t>
       </w:r>
     </w:p>
     <w:p>
@@ -239,7 +239,7 @@
           <w:szCs w:val="21"/>
           <w:rFonts w:ascii="Cambria" w:cs="Cambria" w:eastAsia="Cambria" w:hAnsi="Cambria"/>
         </w:rPr>
-        <w:t xml:space="preserve">The Veteran Sprint has uploaded 57 JSTs to MAP, with estimated student savings of $330M and projected 20-year economic impact of $1.31B.</w:t>
+        <w:t xml:space="preserve">The Veteran Sprint has uploaded 57 JSTs to MAP, with estimated student savings of $331M and projected 20-year economic impact of $1.31B.</w:t>
       </w:r>
     </w:p>
     <w:p>
@@ -424,7 +424,7 @@
                 <w:szCs w:val="20"/>
                 <w:rFonts w:ascii="Cambria" w:cs="Cambria" w:eastAsia="Cambria" w:hAnsi="Cambria"/>
               </w:rPr>
-              <w:t xml:space="preserve">51,543</w:t>
+              <w:t xml:space="preserve">51,594</w:t>
             </w:r>
           </w:p>
         </w:tc>
@@ -494,7 +494,7 @@
                 <w:szCs w:val="20"/>
                 <w:rFonts w:ascii="Cambria" w:cs="Cambria" w:eastAsia="Cambria" w:hAnsi="Cambria"/>
               </w:rPr>
-              <w:t xml:space="preserve">220k</w:t>
+              <w:t xml:space="preserve">221k</w:t>
             </w:r>
           </w:p>
         </w:tc>
@@ -774,7 +774,7 @@
                 <w:szCs w:val="20"/>
                 <w:rFonts w:ascii="Cambria" w:cs="Cambria" w:eastAsia="Cambria" w:hAnsi="Cambria"/>
               </w:rPr>
-              <w:t xml:space="preserve">$330M</w:t>
+              <w:t xml:space="preserve">$331M</w:t>
             </w:r>
           </w:p>
         </w:tc>
@@ -18631,7 +18631,28 @@
                 <w:szCs w:val="20"/>
                 <w:rFonts w:ascii="Cambria" w:cs="Cambria" w:eastAsia="Cambria" w:hAnsi="Cambria"/>
               </w:rPr>
-              <w:t xml:space="preserve">The MAP team has made significant progress supporting Copper Mountain College's Credit for Prior Learning (CPL) Demonstration Project. Staff, faculty, and administrators (25+ in training room at Copper Mountain College) received comprehensive technical training, while the project was presented to the Copper Mountain College Board of Trustees and Chancellor's Office executives (supported with PowerPoint Slides from MAP Team). The college's CPL Landing Page is now live, with standardized exams, Credit by Exam, military, and industry CPL opportunities available to the public. Updated (Submitted by Dean O'Donnell and A&amp;R Team) MIS data resulted in 72 identified veterans (enrolled only) and 78 Joint Services Transcripts (JSTs) uploaded in the MAP Platform. To date, faculty have approved 578 CPL articulations across 15 disciplines (272 military and 306 non-military), representing an estimated $472,000 in student savings and more than $2 million in statewide economic impact. In addition, a campus CPL subject matter expert has been identified, and the PRT Team has been established to support continued implementation with the first visit set for 09OCTOBER2026 and second visit set for 16NOVEMBER2026. Included in the PRT Team is VS Lead, Calvin Gloria, and MAP Team extended team member, Arlene Serrato. Last note, during training, MAP Team members (C.G., T.N., and J.B.) also visited the Joint Education Center at 29 Palms Base and met with representatives to discuss collaboration and future partnerships.</w:t>
+              <w:t xml:space="preserve">•	The CCC CPL Initiative Team (MAP Team) provided a comprehensive in-person professional development to Copper Mountain College on June 3–4, 2026, engaging staff, faculty, administrators, key stakeholders, and all CPL Strike Team members. The training focused on strengthening institutional understanding and implementation of Credit for Prior Learning (CPL) practices with a focus on Military CPL Pathways. 
+•	Copper Mountain College has made significant progress toward all three Veteran Sprint goals: Goal 1, uploaded 80 enrolled veterans Joint Services Transcripts (JSTs) into the MAP Platform; Goal 2, submitting the Credit for Basic Military Service recommendation, which is currently awaiting discipline faculty review; and Goal 3, actively offering 22 courses aligned with ACE Credit Recommendations. Collectively, these efforts demonstrate Copper Mountain College’s commitment to expanding Credit for Prior Learning (CPL) opportunities and ensuring military-connected students receive meaningful academic credit for their military education and training.
+o	Implemented disciplines equating to 11 military pathways and more underway. 188 unique ACE IDs impacted with 37 unique Credit Commendations articulated to below courses. (see attached for reference) 
+	AUTO 004/020/036/044/060
+	BUMA 001
+	CD 010
+	CIS 070A
+	CJ 002/003/006/030
+	CNST 010/050
+	CS 001/003/004/005
+	EMR 001
+	EMT 084
+	HS 061 
+	SP 004
+•	The MAP Team conducted an onsite visit to the 29 Palms military installation and Joint Education Center (JEC), meeting with the Educational Services Officer (ESO) and key staff to strengthen support for active-duty service members through Credit for Prior Learning (CPL). The team continues to maintain ongoing communication with 29 Palms while keeping Mona Lisa Infante, Veteran Counselor, informed and engaged as the primary campus liaison.
+•	Key CPL Team members have actively engaged in CCC CPL Initiative Office Hours, CPL Counselor Workgroups, CPL Coordinator sessions, CPL Statewide Workgroups, and TACO webinars while also preparing to attend upcoming in-person CPL Coordinator and CPL Counselor Training at Mt. SAC. Additionally, key team members have registered for the 7th Annual CPL Summit to continue expanding their knowledge, collaboration, and capacity to implement effective CPL practices.
+•	Copper Mountain College (CMC) has successfully received the initial $50,000 in funding and submitted its IEPI PRT proposal for an additional $250,000 to further support CPL implementation and institutional capacity with a focus on Military CPL pathways from 29 Palms to CMC. The IEPI PRT Team, including Ioanna Latridis and Calvin Klein Gloria, completed its initial review in Burbank on September 11, with the official IEPI PRT visits scheduled for October 9 and November 16, 2026.
+•	Key CPL Team members will actively participate in FLEX activities to further strengthen their knowledge and implementation of Credit for Prior Learning (CPL) practices. Additionally, the CPL Team will present at Copper Mountain College’s annual curriculum training next week to support faculty and staff in advancing Military CPL pathways and institutional implementation.
+•	AP 4235 is currently under review with a proposed update to remove Credit by Examination (Cx) fees, helping reduce financial barriers and expand access to credit-earning opportunities for students.
+•	Copper Mountain College has established a dedicated CPL Landing Page Copper Mountain College - Credit for Prior Learning | Approved Courses for Credit featuring key CPL information and designated CPL contacts. 
+•	Marketing efforts to engage active-duty service members and promote educational pathways at Copper Mountain College are currently underway. These efforts are focused on increasing awareness of available programs, Credit for Prior Learning (CPL) opportunities, and support services for military-connected students.
+•	Copper Mountain College is exploring expanded Credit for Prior Learning (CPL) opportunities for military dependents (e.g., spouses, children, etc.). These efforts aim to identify pathways that recognize prior learning and to support military families.</w:t>
             </w:r>
           </w:p>
           <w:p>
@@ -29608,7 +29629,7 @@
           <w:szCs w:val="22"/>
           <w:rFonts w:ascii="Cambria" w:cs="Cambria" w:eastAsia="Cambria" w:hAnsi="Cambria"/>
         </w:rPr>
-        <w:t xml:space="preserve">The CPL Initiative has moved from pilot to scale, demonstrating measurable impact in student access, credit attainment, and system engagement. With 51,543 students served, 13,308 statewide credit recommendations, and 103 actively participating colleges, the initiative has surpassed most 2025–26 benchmarks ahead of schedule.</w:t>
+        <w:t xml:space="preserve">The CPL Initiative has moved from pilot to scale, demonstrating measurable impact in student access, credit attainment, and system engagement. With 51,594 students served, 13,308 statewide credit recommendations, and 103 actively participating colleges, the initiative has surpassed most 2025–26 benchmarks ahead of schedule.</w:t>
       </w:r>
     </w:p>
     <w:p>
@@ -29659,7 +29680,7 @@
           <w:szCs w:val="20"/>
           <w:rFonts w:ascii="Cambria" w:cs="Cambria" w:eastAsia="Cambria" w:hAnsi="Cambria"/>
         </w:rPr>
-        <w:t xml:space="preserve">September 15, 2026</w:t>
+        <w:t xml:space="preserve">September 16, 2026</w:t>
       </w:r>
     </w:p>
     <w:sectPr>
@@ -29696,7 +29717,7 @@
         <w:szCs w:val="14"/>
         <w:rFonts w:ascii="Cambria" w:cs="Cambria" w:eastAsia="Cambria" w:hAnsi="Cambria"/>
       </w:rPr>
-      <w:t xml:space="preserve">Generated September 15, 2026  |  California Community Colleges  |  CPL Initiative</w:t>
+      <w:t xml:space="preserve">Generated September 16, 2026  |  California Community Colleges  |  CPL Initiative</w:t>
     </w:r>
     <w:r>
       <w:rPr>

</xml_diff>

<commit_message>
Daily dashboard update — 2026-09-17
</commit_message>
<xml_diff>
--- a/reports/CPL_Master_Report.docx
+++ b/reports/CPL_Master_Report.docx
@@ -141,7 +141,7 @@
           <w:szCs w:val="22"/>
           <w:rFonts w:ascii="Cambria" w:cs="Cambria" w:eastAsia="Cambria" w:hAnsi="Cambria"/>
         </w:rPr>
-        <w:t xml:space="preserve">As of September 16, 2026, the CPL initiative is ahead of schedule, with most 2025–2026 targets met or exceeded and core infrastructure nearing completion. The work has expanded student access, increased transcripted units, and established the foundation for a permanent, statewide CPL service under Vision 2030.</w:t>
+        <w:t xml:space="preserve">As of September 17, 2026, the CPL initiative is ahead of schedule, with most 2025–2026 targets met or exceeded and core infrastructure nearing completion. The work has expanded student access, increased transcripted units, and established the foundation for a permanent, statewide CPL service under Vision 2030.</w:t>
       </w:r>
     </w:p>
     <w:p>
@@ -167,7 +167,7 @@
           <w:szCs w:val="21"/>
           <w:rFonts w:ascii="Cambria" w:cs="Cambria" w:eastAsia="Cambria" w:hAnsi="Cambria"/>
         </w:rPr>
-        <w:t xml:space="preserve">51,604 cumulative students served with CPL awards, surpassing annual targets.</w:t>
+        <w:t xml:space="preserve">51,640 cumulative students served with CPL awards, surpassing annual targets.</w:t>
       </w:r>
     </w:p>
     <w:p>
@@ -221,7 +221,7 @@
           <w:szCs w:val="21"/>
           <w:rFonts w:ascii="Cambria" w:cs="Cambria" w:eastAsia="Cambria" w:hAnsi="Cambria"/>
         </w:rPr>
-        <w:t xml:space="preserve">13,313 statewide credit recommendations, driven by faculty discipline workgroups spanning high-demand fields.</w:t>
+        <w:t xml:space="preserve">13,317 statewide credit recommendations, driven by faculty discipline workgroups spanning high-demand fields.</w:t>
       </w:r>
     </w:p>
     <w:p>
@@ -424,7 +424,7 @@
                 <w:szCs w:val="20"/>
                 <w:rFonts w:ascii="Cambria" w:cs="Cambria" w:eastAsia="Cambria" w:hAnsi="Cambria"/>
               </w:rPr>
-              <w:t xml:space="preserve">51,604</w:t>
+              <w:t xml:space="preserve">51,640</w:t>
             </w:r>
           </w:p>
         </w:tc>
@@ -564,7 +564,7 @@
                 <w:szCs w:val="20"/>
                 <w:rFonts w:ascii="Cambria" w:cs="Cambria" w:eastAsia="Cambria" w:hAnsi="Cambria"/>
               </w:rPr>
-              <w:t xml:space="preserve">13,313</w:t>
+              <w:t xml:space="preserve">13,317</w:t>
             </w:r>
           </w:p>
         </w:tc>
@@ -29629,7 +29629,7 @@
           <w:szCs w:val="22"/>
           <w:rFonts w:ascii="Cambria" w:cs="Cambria" w:eastAsia="Cambria" w:hAnsi="Cambria"/>
         </w:rPr>
-        <w:t xml:space="preserve">The CPL Initiative has moved from pilot to scale, demonstrating measurable impact in student access, credit attainment, and system engagement. With 51,604 students served, 13,313 statewide credit recommendations, and 103 actively participating colleges, the initiative has surpassed most 2025–26 benchmarks ahead of schedule.</w:t>
+        <w:t xml:space="preserve">The CPL Initiative has moved from pilot to scale, demonstrating measurable impact in student access, credit attainment, and system engagement. With 51,640 students served, 13,317 statewide credit recommendations, and 103 actively participating colleges, the initiative has surpassed most 2025–26 benchmarks ahead of schedule.</w:t>
       </w:r>
     </w:p>
     <w:p>
@@ -29680,7 +29680,7 @@
           <w:szCs w:val="20"/>
           <w:rFonts w:ascii="Cambria" w:cs="Cambria" w:eastAsia="Cambria" w:hAnsi="Cambria"/>
         </w:rPr>
-        <w:t xml:space="preserve">September 16, 2026</w:t>
+        <w:t xml:space="preserve">September 17, 2026</w:t>
       </w:r>
     </w:p>
     <w:sectPr>
@@ -29717,7 +29717,7 @@
         <w:szCs w:val="14"/>
         <w:rFonts w:ascii="Cambria" w:cs="Cambria" w:eastAsia="Cambria" w:hAnsi="Cambria"/>
       </w:rPr>
-      <w:t xml:space="preserve">Generated September 16, 2026  |  California Community Colleges  |  CPL Initiative</w:t>
+      <w:t xml:space="preserve">Generated September 17, 2026  |  California Community Colleges  |  CPL Initiative</w:t>
     </w:r>
     <w:r>
       <w:rPr>

</xml_diff>

<commit_message>
Daily dashboard update — 2026-09-18
</commit_message>
<xml_diff>
--- a/reports/CPL_Master_Report.docx
+++ b/reports/CPL_Master_Report.docx
@@ -141,7 +141,7 @@
           <w:szCs w:val="22"/>
           <w:rFonts w:ascii="Cambria" w:cs="Cambria" w:eastAsia="Cambria" w:hAnsi="Cambria"/>
         </w:rPr>
-        <w:t xml:space="preserve">As of September 17, 2026, the CPL initiative is ahead of schedule, with most 2025–2026 targets met or exceeded and core infrastructure nearing completion. The work has expanded student access, increased transcripted units, and established the foundation for a permanent, statewide CPL service under Vision 2030.</w:t>
+        <w:t xml:space="preserve">As of September 18, 2026, the CPL initiative is ahead of schedule, with most 2025–2026 targets met or exceeded and core infrastructure nearing completion. The work has expanded student access, increased transcripted units, and established the foundation for a permanent, statewide CPL service under Vision 2030.</w:t>
       </w:r>
     </w:p>
     <w:p>
@@ -167,7 +167,7 @@
           <w:szCs w:val="21"/>
           <w:rFonts w:ascii="Cambria" w:cs="Cambria" w:eastAsia="Cambria" w:hAnsi="Cambria"/>
         </w:rPr>
-        <w:t xml:space="preserve">51,657 cumulative students served with CPL awards, surpassing annual targets.</w:t>
+        <w:t xml:space="preserve">51,728 cumulative students served with CPL awards, surpassing annual targets.</w:t>
       </w:r>
     </w:p>
     <w:p>
@@ -185,7 +185,7 @@
           <w:szCs w:val="21"/>
           <w:rFonts w:ascii="Cambria" w:cs="Cambria" w:eastAsia="Cambria" w:hAnsi="Cambria"/>
         </w:rPr>
-        <w:t xml:space="preserve">221k CPL units transcripted across the system.</w:t>
+        <w:t xml:space="preserve">222k CPL units transcripted across the system.</w:t>
       </w:r>
     </w:p>
     <w:p>
@@ -221,7 +221,7 @@
           <w:szCs w:val="21"/>
           <w:rFonts w:ascii="Cambria" w:cs="Cambria" w:eastAsia="Cambria" w:hAnsi="Cambria"/>
         </w:rPr>
-        <w:t xml:space="preserve">13,319 statewide credit recommendations, driven by faculty discipline workgroups spanning high-demand fields.</w:t>
+        <w:t xml:space="preserve">13,330 statewide credit recommendations, driven by faculty discipline workgroups spanning high-demand fields.</w:t>
       </w:r>
     </w:p>
     <w:p>
@@ -239,7 +239,7 @@
           <w:szCs w:val="21"/>
           <w:rFonts w:ascii="Cambria" w:cs="Cambria" w:eastAsia="Cambria" w:hAnsi="Cambria"/>
         </w:rPr>
-        <w:t xml:space="preserve">The Veteran Sprint has uploaded 57 JSTs to MAP, with estimated student savings of $331M and projected 20-year economic impact of $1.31B.</w:t>
+        <w:t xml:space="preserve">The Veteran Sprint has uploaded 57 JSTs to MAP, with estimated student savings of $332M and projected 20-year economic impact of $1.32B.</w:t>
       </w:r>
     </w:p>
     <w:p>
@@ -424,7 +424,7 @@
                 <w:szCs w:val="20"/>
                 <w:rFonts w:ascii="Cambria" w:cs="Cambria" w:eastAsia="Cambria" w:hAnsi="Cambria"/>
               </w:rPr>
-              <w:t xml:space="preserve">51,657</w:t>
+              <w:t xml:space="preserve">51,728</w:t>
             </w:r>
           </w:p>
         </w:tc>
@@ -494,7 +494,7 @@
                 <w:szCs w:val="20"/>
                 <w:rFonts w:ascii="Cambria" w:cs="Cambria" w:eastAsia="Cambria" w:hAnsi="Cambria"/>
               </w:rPr>
-              <w:t xml:space="preserve">221k</w:t>
+              <w:t xml:space="preserve">222k</w:t>
             </w:r>
           </w:p>
         </w:tc>
@@ -564,7 +564,7 @@
                 <w:szCs w:val="20"/>
                 <w:rFonts w:ascii="Cambria" w:cs="Cambria" w:eastAsia="Cambria" w:hAnsi="Cambria"/>
               </w:rPr>
-              <w:t xml:space="preserve">13,319</w:t>
+              <w:t xml:space="preserve">13,330</w:t>
             </w:r>
           </w:p>
         </w:tc>
@@ -774,7 +774,7 @@
                 <w:szCs w:val="20"/>
                 <w:rFonts w:ascii="Cambria" w:cs="Cambria" w:eastAsia="Cambria" w:hAnsi="Cambria"/>
               </w:rPr>
-              <w:t xml:space="preserve">$331M</w:t>
+              <w:t xml:space="preserve">$332M</w:t>
             </w:r>
           </w:p>
         </w:tc>
@@ -844,7 +844,7 @@
                 <w:szCs w:val="20"/>
                 <w:rFonts w:ascii="Cambria" w:cs="Cambria" w:eastAsia="Cambria" w:hAnsi="Cambria"/>
               </w:rPr>
-              <w:t xml:space="preserve">$1.31B</w:t>
+              <w:t xml:space="preserve">$1.32B</w:t>
             </w:r>
           </w:p>
         </w:tc>
@@ -29629,7 +29629,7 @@
           <w:szCs w:val="22"/>
           <w:rFonts w:ascii="Cambria" w:cs="Cambria" w:eastAsia="Cambria" w:hAnsi="Cambria"/>
         </w:rPr>
-        <w:t xml:space="preserve">The CPL Initiative has moved from pilot to scale, demonstrating measurable impact in student access, credit attainment, and system engagement. With 51,657 students served, 13,319 statewide credit recommendations, and 103 actively participating colleges, the initiative has surpassed most 2025–26 benchmarks ahead of schedule.</w:t>
+        <w:t xml:space="preserve">The CPL Initiative has moved from pilot to scale, demonstrating measurable impact in student access, credit attainment, and system engagement. With 51,728 students served, 13,330 statewide credit recommendations, and 103 actively participating colleges, the initiative has surpassed most 2025–26 benchmarks ahead of schedule.</w:t>
       </w:r>
     </w:p>
     <w:p>
@@ -29680,7 +29680,7 @@
           <w:szCs w:val="20"/>
           <w:rFonts w:ascii="Cambria" w:cs="Cambria" w:eastAsia="Cambria" w:hAnsi="Cambria"/>
         </w:rPr>
-        <w:t xml:space="preserve">September 17, 2026</w:t>
+        <w:t xml:space="preserve">September 18, 2026</w:t>
       </w:r>
     </w:p>
     <w:sectPr>
@@ -29717,7 +29717,7 @@
         <w:szCs w:val="14"/>
         <w:rFonts w:ascii="Cambria" w:cs="Cambria" w:eastAsia="Cambria" w:hAnsi="Cambria"/>
       </w:rPr>
-      <w:t xml:space="preserve">Generated September 17, 2026  |  California Community Colleges  |  CPL Initiative</w:t>
+      <w:t xml:space="preserve">Generated September 18, 2026  |  California Community Colleges  |  CPL Initiative</w:t>
     </w:r>
     <w:r>
       <w:rPr>

</xml_diff>

<commit_message>
Daily dashboard update — 2026-09-19
</commit_message>
<xml_diff>
--- a/reports/CPL_Master_Report.docx
+++ b/reports/CPL_Master_Report.docx
@@ -141,7 +141,7 @@
           <w:szCs w:val="22"/>
           <w:rFonts w:ascii="Cambria" w:cs="Cambria" w:eastAsia="Cambria" w:hAnsi="Cambria"/>
         </w:rPr>
-        <w:t xml:space="preserve">As of September 18, 2026, the CPL initiative is ahead of schedule, with most 2025–2026 targets met or exceeded and core infrastructure nearing completion. The work has expanded student access, increased transcripted units, and established the foundation for a permanent, statewide CPL service under Vision 2030.</w:t>
+        <w:t xml:space="preserve">As of September 19, 2026, the CPL initiative is ahead of schedule, with most 2025–2026 targets met or exceeded and core infrastructure nearing completion. The work has expanded student access, increased transcripted units, and established the foundation for a permanent, statewide CPL service under Vision 2030.</w:t>
       </w:r>
     </w:p>
     <w:p>
@@ -167,7 +167,7 @@
           <w:szCs w:val="21"/>
           <w:rFonts w:ascii="Cambria" w:cs="Cambria" w:eastAsia="Cambria" w:hAnsi="Cambria"/>
         </w:rPr>
-        <w:t xml:space="preserve">51,731 cumulative students served with CPL awards, surpassing annual targets.</w:t>
+        <w:t xml:space="preserve">51,762 cumulative students served with CPL awards, surpassing annual targets.</w:t>
       </w:r>
     </w:p>
     <w:p>
@@ -221,7 +221,7 @@
           <w:szCs w:val="21"/>
           <w:rFonts w:ascii="Cambria" w:cs="Cambria" w:eastAsia="Cambria" w:hAnsi="Cambria"/>
         </w:rPr>
-        <w:t xml:space="preserve">13,331 statewide credit recommendations, driven by faculty discipline workgroups spanning high-demand fields.</w:t>
+        <w:t xml:space="preserve">13,346 statewide credit recommendations, driven by faculty discipline workgroups spanning high-demand fields.</w:t>
       </w:r>
     </w:p>
     <w:p>
@@ -239,7 +239,7 @@
           <w:szCs w:val="21"/>
           <w:rFonts w:ascii="Cambria" w:cs="Cambria" w:eastAsia="Cambria" w:hAnsi="Cambria"/>
         </w:rPr>
-        <w:t xml:space="preserve">The Veteran Sprint has uploaded 57 JSTs to MAP, with estimated student savings of $332M and projected 20-year economic impact of $1.32B.</w:t>
+        <w:t xml:space="preserve">The Veteran Sprint has uploaded 57 JSTs to MAP, with estimated student savings of $333M and projected 20-year economic impact of $1.32B.</w:t>
       </w:r>
     </w:p>
     <w:p>
@@ -424,7 +424,7 @@
                 <w:szCs w:val="20"/>
                 <w:rFonts w:ascii="Cambria" w:cs="Cambria" w:eastAsia="Cambria" w:hAnsi="Cambria"/>
               </w:rPr>
-              <w:t xml:space="preserve">51,731</w:t>
+              <w:t xml:space="preserve">51,762</w:t>
             </w:r>
           </w:p>
         </w:tc>
@@ -564,7 +564,7 @@
                 <w:szCs w:val="20"/>
                 <w:rFonts w:ascii="Cambria" w:cs="Cambria" w:eastAsia="Cambria" w:hAnsi="Cambria"/>
               </w:rPr>
-              <w:t xml:space="preserve">13,331</w:t>
+              <w:t xml:space="preserve">13,346</w:t>
             </w:r>
           </w:p>
         </w:tc>
@@ -774,7 +774,7 @@
                 <w:szCs w:val="20"/>
                 <w:rFonts w:ascii="Cambria" w:cs="Cambria" w:eastAsia="Cambria" w:hAnsi="Cambria"/>
               </w:rPr>
-              <w:t xml:space="preserve">$332M</w:t>
+              <w:t xml:space="preserve">$333M</w:t>
             </w:r>
           </w:p>
         </w:tc>
@@ -29629,7 +29629,7 @@
           <w:szCs w:val="22"/>
           <w:rFonts w:ascii="Cambria" w:cs="Cambria" w:eastAsia="Cambria" w:hAnsi="Cambria"/>
         </w:rPr>
-        <w:t xml:space="preserve">The CPL Initiative has moved from pilot to scale, demonstrating measurable impact in student access, credit attainment, and system engagement. With 51,731 students served, 13,331 statewide credit recommendations, and 103 actively participating colleges, the initiative has surpassed most 2025–26 benchmarks ahead of schedule.</w:t>
+        <w:t xml:space="preserve">The CPL Initiative has moved from pilot to scale, demonstrating measurable impact in student access, credit attainment, and system engagement. With 51,762 students served, 13,346 statewide credit recommendations, and 103 actively participating colleges, the initiative has surpassed most 2025–26 benchmarks ahead of schedule.</w:t>
       </w:r>
     </w:p>
     <w:p>
@@ -29680,7 +29680,7 @@
           <w:szCs w:val="20"/>
           <w:rFonts w:ascii="Cambria" w:cs="Cambria" w:eastAsia="Cambria" w:hAnsi="Cambria"/>
         </w:rPr>
-        <w:t xml:space="preserve">September 18, 2026</w:t>
+        <w:t xml:space="preserve">September 19, 2026</w:t>
       </w:r>
     </w:p>
     <w:sectPr>
@@ -29717,7 +29717,7 @@
         <w:szCs w:val="14"/>
         <w:rFonts w:ascii="Cambria" w:cs="Cambria" w:eastAsia="Cambria" w:hAnsi="Cambria"/>
       </w:rPr>
-      <w:t xml:space="preserve">Generated September 18, 2026  |  California Community Colleges  |  CPL Initiative</w:t>
+      <w:t xml:space="preserve">Generated September 19, 2026  |  California Community Colleges  |  CPL Initiative</w:t>
     </w:r>
     <w:r>
       <w:rPr>

</xml_diff>

<commit_message>
Daily dashboard update — 2026-09-20
</commit_message>
<xml_diff>
--- a/reports/CPL_Master_Report.docx
+++ b/reports/CPL_Master_Report.docx
@@ -141,7 +141,7 @@
           <w:szCs w:val="22"/>
           <w:rFonts w:ascii="Cambria" w:cs="Cambria" w:eastAsia="Cambria" w:hAnsi="Cambria"/>
         </w:rPr>
-        <w:t xml:space="preserve">As of September 19, 2026, the CPL initiative is ahead of schedule, with most 2025–2026 targets met or exceeded and core infrastructure nearing completion. The work has expanded student access, increased transcripted units, and established the foundation for a permanent, statewide CPL service under Vision 2030.</w:t>
+        <w:t xml:space="preserve">As of September 20, 2026, the CPL initiative is ahead of schedule, with most 2025–2026 targets met or exceeded and core infrastructure nearing completion. The work has expanded student access, increased transcripted units, and established the foundation for a permanent, statewide CPL service under Vision 2030.</w:t>
       </w:r>
     </w:p>
     <w:p>
@@ -221,7 +221,7 @@
           <w:szCs w:val="21"/>
           <w:rFonts w:ascii="Cambria" w:cs="Cambria" w:eastAsia="Cambria" w:hAnsi="Cambria"/>
         </w:rPr>
-        <w:t xml:space="preserve">13,346 statewide credit recommendations, driven by faculty discipline workgroups spanning high-demand fields.</w:t>
+        <w:t xml:space="preserve">13,359 statewide credit recommendations, driven by faculty discipline workgroups spanning high-demand fields.</w:t>
       </w:r>
     </w:p>
     <w:p>
@@ -564,7 +564,7 @@
                 <w:szCs w:val="20"/>
                 <w:rFonts w:ascii="Cambria" w:cs="Cambria" w:eastAsia="Cambria" w:hAnsi="Cambria"/>
               </w:rPr>
-              <w:t xml:space="preserve">13,346</w:t>
+              <w:t xml:space="preserve">13,359</w:t>
             </w:r>
           </w:p>
         </w:tc>
@@ -29629,7 +29629,7 @@
           <w:szCs w:val="22"/>
           <w:rFonts w:ascii="Cambria" w:cs="Cambria" w:eastAsia="Cambria" w:hAnsi="Cambria"/>
         </w:rPr>
-        <w:t xml:space="preserve">The CPL Initiative has moved from pilot to scale, demonstrating measurable impact in student access, credit attainment, and system engagement. With 51,762 students served, 13,346 statewide credit recommendations, and 103 actively participating colleges, the initiative has surpassed most 2025–26 benchmarks ahead of schedule.</w:t>
+        <w:t xml:space="preserve">The CPL Initiative has moved from pilot to scale, demonstrating measurable impact in student access, credit attainment, and system engagement. With 51,762 students served, 13,359 statewide credit recommendations, and 103 actively participating colleges, the initiative has surpassed most 2025–26 benchmarks ahead of schedule.</w:t>
       </w:r>
     </w:p>
     <w:p>
@@ -29680,7 +29680,7 @@
           <w:szCs w:val="20"/>
           <w:rFonts w:ascii="Cambria" w:cs="Cambria" w:eastAsia="Cambria" w:hAnsi="Cambria"/>
         </w:rPr>
-        <w:t xml:space="preserve">September 19, 2026</w:t>
+        <w:t xml:space="preserve">September 20, 2026</w:t>
       </w:r>
     </w:p>
     <w:sectPr>
@@ -29717,7 +29717,7 @@
         <w:szCs w:val="14"/>
         <w:rFonts w:ascii="Cambria" w:cs="Cambria" w:eastAsia="Cambria" w:hAnsi="Cambria"/>
       </w:rPr>
-      <w:t xml:space="preserve">Generated September 19, 2026  |  California Community Colleges  |  CPL Initiative</w:t>
+      <w:t xml:space="preserve">Generated September 20, 2026  |  California Community Colleges  |  CPL Initiative</w:t>
     </w:r>
     <w:r>
       <w:rPr>

</xml_diff>

<commit_message>
Daily dashboard update — 2026-09-21
</commit_message>
<xml_diff>
--- a/reports/CPL_Master_Report.docx
+++ b/reports/CPL_Master_Report.docx
@@ -141,7 +141,7 @@
           <w:szCs w:val="22"/>
           <w:rFonts w:ascii="Cambria" w:cs="Cambria" w:eastAsia="Cambria" w:hAnsi="Cambria"/>
         </w:rPr>
-        <w:t xml:space="preserve">As of September 20, 2026, the CPL initiative is ahead of schedule, with most 2025–2026 targets met or exceeded and core infrastructure nearing completion. The work has expanded student access, increased transcripted units, and established the foundation for a permanent, statewide CPL service under Vision 2030.</w:t>
+        <w:t xml:space="preserve">As of September 21, 2026, the CPL initiative is ahead of schedule, with most 2025–2026 targets met or exceeded and core infrastructure nearing completion. The work has expanded student access, increased transcripted units, and established the foundation for a permanent, statewide CPL service under Vision 2030.</w:t>
       </w:r>
     </w:p>
     <w:p>
@@ -29680,7 +29680,7 @@
           <w:szCs w:val="20"/>
           <w:rFonts w:ascii="Cambria" w:cs="Cambria" w:eastAsia="Cambria" w:hAnsi="Cambria"/>
         </w:rPr>
-        <w:t xml:space="preserve">September 20, 2026</w:t>
+        <w:t xml:space="preserve">September 21, 2026</w:t>
       </w:r>
     </w:p>
     <w:sectPr>
@@ -29717,7 +29717,7 @@
         <w:szCs w:val="14"/>
         <w:rFonts w:ascii="Cambria" w:cs="Cambria" w:eastAsia="Cambria" w:hAnsi="Cambria"/>
       </w:rPr>
-      <w:t xml:space="preserve">Generated September 20, 2026  |  California Community Colleges  |  CPL Initiative</w:t>
+      <w:t xml:space="preserve">Generated September 21, 2026  |  California Community Colleges  |  CPL Initiative</w:t>
     </w:r>
     <w:r>
       <w:rPr>

</xml_diff>

<commit_message>
Daily dashboard update — 2026-09-22
</commit_message>
<xml_diff>
--- a/reports/CPL_Master_Report.docx
+++ b/reports/CPL_Master_Report.docx
@@ -141,7 +141,7 @@
           <w:szCs w:val="22"/>
           <w:rFonts w:ascii="Cambria" w:cs="Cambria" w:eastAsia="Cambria" w:hAnsi="Cambria"/>
         </w:rPr>
-        <w:t xml:space="preserve">As of September 21, 2026, the CPL initiative is ahead of schedule, with most 2025–2026 targets met or exceeded and core infrastructure nearing completion. The work has expanded student access, increased transcripted units, and established the foundation for a permanent, statewide CPL service under Vision 2030.</w:t>
+        <w:t xml:space="preserve">As of September 22, 2026, the CPL initiative is ahead of schedule, with most 2025–2026 targets met or exceeded and core infrastructure nearing completion. The work has expanded student access, increased transcripted units, and established the foundation for a permanent, statewide CPL service under Vision 2030.</w:t>
       </w:r>
     </w:p>
     <w:p>
@@ -167,7 +167,7 @@
           <w:szCs w:val="21"/>
           <w:rFonts w:ascii="Cambria" w:cs="Cambria" w:eastAsia="Cambria" w:hAnsi="Cambria"/>
         </w:rPr>
-        <w:t xml:space="preserve">51,769 cumulative students served with CPL awards, surpassing annual targets.</w:t>
+        <w:t xml:space="preserve">51,788 cumulative students served with CPL awards, surpassing annual targets.</w:t>
       </w:r>
     </w:p>
     <w:p>
@@ -221,7 +221,7 @@
           <w:szCs w:val="21"/>
           <w:rFonts w:ascii="Cambria" w:cs="Cambria" w:eastAsia="Cambria" w:hAnsi="Cambria"/>
         </w:rPr>
-        <w:t xml:space="preserve">13,364 statewide credit recommendations, driven by faculty discipline workgroups spanning high-demand fields.</w:t>
+        <w:t xml:space="preserve">13,337 statewide credit recommendations, driven by faculty discipline workgroups spanning high-demand fields.</w:t>
       </w:r>
     </w:p>
     <w:p>
@@ -239,7 +239,7 @@
           <w:szCs w:val="21"/>
           <w:rFonts w:ascii="Cambria" w:cs="Cambria" w:eastAsia="Cambria" w:hAnsi="Cambria"/>
         </w:rPr>
-        <w:t xml:space="preserve">The Veteran Sprint has uploaded 57 JSTs to MAP, with estimated student savings of $333M and projected 20-year economic impact of $1.32B.</w:t>
+        <w:t xml:space="preserve">The Veteran Sprint has uploaded 58 JSTs to MAP, with estimated student savings of $333M and projected 20-year economic impact of $1.32B.</w:t>
       </w:r>
     </w:p>
     <w:p>
@@ -424,7 +424,7 @@
                 <w:szCs w:val="20"/>
                 <w:rFonts w:ascii="Cambria" w:cs="Cambria" w:eastAsia="Cambria" w:hAnsi="Cambria"/>
               </w:rPr>
-              <w:t xml:space="preserve">51,769</w:t>
+              <w:t xml:space="preserve">51,788</w:t>
             </w:r>
           </w:p>
         </w:tc>
@@ -564,7 +564,7 @@
                 <w:szCs w:val="20"/>
                 <w:rFonts w:ascii="Cambria" w:cs="Cambria" w:eastAsia="Cambria" w:hAnsi="Cambria"/>
               </w:rPr>
-              <w:t xml:space="preserve">13,364</w:t>
+              <w:t xml:space="preserve">13,337</w:t>
             </w:r>
           </w:p>
         </w:tc>
@@ -704,7 +704,7 @@
                 <w:szCs w:val="20"/>
                 <w:rFonts w:ascii="Cambria" w:cs="Cambria" w:eastAsia="Cambria" w:hAnsi="Cambria"/>
               </w:rPr>
-              <w:t xml:space="preserve">57</w:t>
+              <w:t xml:space="preserve">58</w:t>
             </w:r>
           </w:p>
         </w:tc>
@@ -29629,7 +29629,7 @@
           <w:szCs w:val="22"/>
           <w:rFonts w:ascii="Cambria" w:cs="Cambria" w:eastAsia="Cambria" w:hAnsi="Cambria"/>
         </w:rPr>
-        <w:t xml:space="preserve">The CPL Initiative has moved from pilot to scale, demonstrating measurable impact in student access, credit attainment, and system engagement. With 51,769 students served, 13,364 statewide credit recommendations, and 103 actively participating colleges, the initiative has surpassed most 2025–26 benchmarks ahead of schedule.</w:t>
+        <w:t xml:space="preserve">The CPL Initiative has moved from pilot to scale, demonstrating measurable impact in student access, credit attainment, and system engagement. With 51,788 students served, 13,337 statewide credit recommendations, and 103 actively participating colleges, the initiative has surpassed most 2025–26 benchmarks ahead of schedule.</w:t>
       </w:r>
     </w:p>
     <w:p>
@@ -29680,7 +29680,7 @@
           <w:szCs w:val="20"/>
           <w:rFonts w:ascii="Cambria" w:cs="Cambria" w:eastAsia="Cambria" w:hAnsi="Cambria"/>
         </w:rPr>
-        <w:t xml:space="preserve">September 21, 2026</w:t>
+        <w:t xml:space="preserve">September 22, 2026</w:t>
       </w:r>
     </w:p>
     <w:sectPr>
@@ -29717,7 +29717,7 @@
         <w:szCs w:val="14"/>
         <w:rFonts w:ascii="Cambria" w:cs="Cambria" w:eastAsia="Cambria" w:hAnsi="Cambria"/>
       </w:rPr>
-      <w:t xml:space="preserve">Generated September 21, 2026  |  California Community Colleges  |  CPL Initiative</w:t>
+      <w:t xml:space="preserve">Generated September 22, 2026  |  California Community Colleges  |  CPL Initiative</w:t>
     </w:r>
     <w:r>
       <w:rPr>

</xml_diff>

<commit_message>
Daily dashboard update — 2026-09-23
</commit_message>
<xml_diff>
--- a/reports/CPL_Master_Report.docx
+++ b/reports/CPL_Master_Report.docx
@@ -141,7 +141,7 @@
           <w:szCs w:val="22"/>
           <w:rFonts w:ascii="Cambria" w:cs="Cambria" w:eastAsia="Cambria" w:hAnsi="Cambria"/>
         </w:rPr>
-        <w:t xml:space="preserve">As of September 22, 2026, the CPL initiative is ahead of schedule, with most 2025–2026 targets met or exceeded and core infrastructure nearing completion. The work has expanded student access, increased transcripted units, and established the foundation for a permanent, statewide CPL service under Vision 2030.</w:t>
+        <w:t xml:space="preserve">As of September 23, 2026, the CPL initiative is ahead of schedule, with most 2025–2026 targets met or exceeded and core infrastructure nearing completion. The work has expanded student access, increased transcripted units, and established the foundation for a permanent, statewide CPL service under Vision 2030.</w:t>
       </w:r>
     </w:p>
     <w:p>
@@ -167,7 +167,7 @@
           <w:szCs w:val="21"/>
           <w:rFonts w:ascii="Cambria" w:cs="Cambria" w:eastAsia="Cambria" w:hAnsi="Cambria"/>
         </w:rPr>
-        <w:t xml:space="preserve">51,792 cumulative students served with CPL awards, surpassing annual targets.</w:t>
+        <w:t xml:space="preserve">51,840 cumulative students served with CPL awards, surpassing annual targets.</w:t>
       </w:r>
     </w:p>
     <w:p>
@@ -185,7 +185,7 @@
           <w:szCs w:val="21"/>
           <w:rFonts w:ascii="Cambria" w:cs="Cambria" w:eastAsia="Cambria" w:hAnsi="Cambria"/>
         </w:rPr>
-        <w:t xml:space="preserve">222k CPL units transcripted across the system.</w:t>
+        <w:t xml:space="preserve">223k CPL units transcripted across the system.</w:t>
       </w:r>
     </w:p>
     <w:p>
@@ -221,7 +221,7 @@
           <w:szCs w:val="21"/>
           <w:rFonts w:ascii="Cambria" w:cs="Cambria" w:eastAsia="Cambria" w:hAnsi="Cambria"/>
         </w:rPr>
-        <w:t xml:space="preserve">13,336 statewide credit recommendations, driven by faculty discipline workgroups spanning high-demand fields.</w:t>
+        <w:t xml:space="preserve">13,353 statewide credit recommendations, driven by faculty discipline workgroups spanning high-demand fields.</w:t>
       </w:r>
     </w:p>
     <w:p>
@@ -239,7 +239,7 @@
           <w:szCs w:val="21"/>
           <w:rFonts w:ascii="Cambria" w:cs="Cambria" w:eastAsia="Cambria" w:hAnsi="Cambria"/>
         </w:rPr>
-        <w:t xml:space="preserve">The Veteran Sprint has uploaded 58 JSTs to MAP, with estimated student savings of $333M and projected 20-year economic impact of $1.32B.</w:t>
+        <w:t xml:space="preserve">The Veteran Sprint has uploaded 58 JSTs to MAP, with estimated student savings of $334M and projected 20-year economic impact of $1.32B.</w:t>
       </w:r>
     </w:p>
     <w:p>
@@ -424,7 +424,7 @@
                 <w:szCs w:val="20"/>
                 <w:rFonts w:ascii="Cambria" w:cs="Cambria" w:eastAsia="Cambria" w:hAnsi="Cambria"/>
               </w:rPr>
-              <w:t xml:space="preserve">51,792</w:t>
+              <w:t xml:space="preserve">51,840</w:t>
             </w:r>
           </w:p>
         </w:tc>
@@ -494,7 +494,7 @@
                 <w:szCs w:val="20"/>
                 <w:rFonts w:ascii="Cambria" w:cs="Cambria" w:eastAsia="Cambria" w:hAnsi="Cambria"/>
               </w:rPr>
-              <w:t xml:space="preserve">222k</w:t>
+              <w:t xml:space="preserve">223k</w:t>
             </w:r>
           </w:p>
         </w:tc>
@@ -564,7 +564,7 @@
                 <w:szCs w:val="20"/>
                 <w:rFonts w:ascii="Cambria" w:cs="Cambria" w:eastAsia="Cambria" w:hAnsi="Cambria"/>
               </w:rPr>
-              <w:t xml:space="preserve">13,336</w:t>
+              <w:t xml:space="preserve">13,353</w:t>
             </w:r>
           </w:p>
         </w:tc>
@@ -774,7 +774,7 @@
                 <w:szCs w:val="20"/>
                 <w:rFonts w:ascii="Cambria" w:cs="Cambria" w:eastAsia="Cambria" w:hAnsi="Cambria"/>
               </w:rPr>
-              <w:t xml:space="preserve">$333M</w:t>
+              <w:t xml:space="preserve">$334M</w:t>
             </w:r>
           </w:p>
         </w:tc>
@@ -29629,7 +29629,7 @@
           <w:szCs w:val="22"/>
           <w:rFonts w:ascii="Cambria" w:cs="Cambria" w:eastAsia="Cambria" w:hAnsi="Cambria"/>
         </w:rPr>
-        <w:t xml:space="preserve">The CPL Initiative has moved from pilot to scale, demonstrating measurable impact in student access, credit attainment, and system engagement. With 51,792 students served, 13,336 statewide credit recommendations, and 103 actively participating colleges, the initiative has surpassed most 2025–26 benchmarks ahead of schedule.</w:t>
+        <w:t xml:space="preserve">The CPL Initiative has moved from pilot to scale, demonstrating measurable impact in student access, credit attainment, and system engagement. With 51,840 students served, 13,353 statewide credit recommendations, and 103 actively participating colleges, the initiative has surpassed most 2025–26 benchmarks ahead of schedule.</w:t>
       </w:r>
     </w:p>
     <w:p>
@@ -29680,7 +29680,7 @@
           <w:szCs w:val="20"/>
           <w:rFonts w:ascii="Cambria" w:cs="Cambria" w:eastAsia="Cambria" w:hAnsi="Cambria"/>
         </w:rPr>
-        <w:t xml:space="preserve">September 22, 2026</w:t>
+        <w:t xml:space="preserve">September 23, 2026</w:t>
       </w:r>
     </w:p>
     <w:sectPr>
@@ -29717,7 +29717,7 @@
         <w:szCs w:val="14"/>
         <w:rFonts w:ascii="Cambria" w:cs="Cambria" w:eastAsia="Cambria" w:hAnsi="Cambria"/>
       </w:rPr>
-      <w:t xml:space="preserve">Generated September 22, 2026  |  California Community Colleges  |  CPL Initiative</w:t>
+      <w:t xml:space="preserve">Generated September 23, 2026  |  California Community Colleges  |  CPL Initiative</w:t>
     </w:r>
     <w:r>
       <w:rPr>

</xml_diff>

<commit_message>
Daily dashboard update — 2026-09-24
</commit_message>
<xml_diff>
--- a/reports/CPL_Master_Report.docx
+++ b/reports/CPL_Master_Report.docx
@@ -141,7 +141,7 @@
           <w:szCs w:val="22"/>
           <w:rFonts w:ascii="Cambria" w:cs="Cambria" w:eastAsia="Cambria" w:hAnsi="Cambria"/>
         </w:rPr>
-        <w:t xml:space="preserve">As of September 23, 2026, the CPL initiative is ahead of schedule, with most 2025–2026 targets met or exceeded and core infrastructure nearing completion. The work has expanded student access, increased transcripted units, and established the foundation for a permanent, statewide CPL service under Vision 2030.</w:t>
+        <w:t xml:space="preserve">As of September 24, 2026, the CPL initiative is ahead of schedule, with most 2025–2026 targets met or exceeded and core infrastructure nearing completion. The work has expanded student access, increased transcripted units, and established the foundation for a permanent, statewide CPL service under Vision 2030.</w:t>
       </w:r>
     </w:p>
     <w:p>
@@ -167,7 +167,7 @@
           <w:szCs w:val="21"/>
           <w:rFonts w:ascii="Cambria" w:cs="Cambria" w:eastAsia="Cambria" w:hAnsi="Cambria"/>
         </w:rPr>
-        <w:t xml:space="preserve">51,850 cumulative students served with CPL awards, surpassing annual targets.</w:t>
+        <w:t xml:space="preserve">51,937 cumulative students served with CPL awards, surpassing annual targets.</w:t>
       </w:r>
     </w:p>
     <w:p>
@@ -221,7 +221,7 @@
           <w:szCs w:val="21"/>
           <w:rFonts w:ascii="Cambria" w:cs="Cambria" w:eastAsia="Cambria" w:hAnsi="Cambria"/>
         </w:rPr>
-        <w:t xml:space="preserve">13,379 statewide credit recommendations, driven by faculty discipline workgroups spanning high-demand fields.</w:t>
+        <w:t xml:space="preserve">13,526 statewide credit recommendations, driven by faculty discipline workgroups spanning high-demand fields.</w:t>
       </w:r>
     </w:p>
     <w:p>
@@ -239,7 +239,7 @@
           <w:szCs w:val="21"/>
           <w:rFonts w:ascii="Cambria" w:cs="Cambria" w:eastAsia="Cambria" w:hAnsi="Cambria"/>
         </w:rPr>
-        <w:t xml:space="preserve">The Veteran Sprint has uploaded 59 JSTs to MAP, with estimated student savings of $334M and projected 20-year economic impact of $1.32B.</w:t>
+        <w:t xml:space="preserve">The Veteran Sprint has uploaded 59 JSTs to MAP, with estimated student savings of $335M and projected 20-year economic impact of $1.32B.</w:t>
       </w:r>
     </w:p>
     <w:p>
@@ -424,7 +424,7 @@
                 <w:szCs w:val="20"/>
                 <w:rFonts w:ascii="Cambria" w:cs="Cambria" w:eastAsia="Cambria" w:hAnsi="Cambria"/>
               </w:rPr>
-              <w:t xml:space="preserve">51,850</w:t>
+              <w:t xml:space="preserve">51,937</w:t>
             </w:r>
           </w:p>
         </w:tc>
@@ -564,7 +564,7 @@
                 <w:szCs w:val="20"/>
                 <w:rFonts w:ascii="Cambria" w:cs="Cambria" w:eastAsia="Cambria" w:hAnsi="Cambria"/>
               </w:rPr>
-              <w:t xml:space="preserve">13,379</w:t>
+              <w:t xml:space="preserve">13,526</w:t>
             </w:r>
           </w:p>
         </w:tc>
@@ -774,7 +774,7 @@
                 <w:szCs w:val="20"/>
                 <w:rFonts w:ascii="Cambria" w:cs="Cambria" w:eastAsia="Cambria" w:hAnsi="Cambria"/>
               </w:rPr>
-              <w:t xml:space="preserve">$334M</w:t>
+              <w:t xml:space="preserve">$335M</w:t>
             </w:r>
           </w:p>
         </w:tc>
@@ -29629,7 +29629,7 @@
           <w:szCs w:val="22"/>
           <w:rFonts w:ascii="Cambria" w:cs="Cambria" w:eastAsia="Cambria" w:hAnsi="Cambria"/>
         </w:rPr>
-        <w:t xml:space="preserve">The CPL Initiative has moved from pilot to scale, demonstrating measurable impact in student access, credit attainment, and system engagement. With 51,850 students served, 13,379 statewide credit recommendations, and 103 actively participating colleges, the initiative has surpassed most 2025–26 benchmarks ahead of schedule.</w:t>
+        <w:t xml:space="preserve">The CPL Initiative has moved from pilot to scale, demonstrating measurable impact in student access, credit attainment, and system engagement. With 51,937 students served, 13,526 statewide credit recommendations, and 103 actively participating colleges, the initiative has surpassed most 2025–26 benchmarks ahead of schedule.</w:t>
       </w:r>
     </w:p>
     <w:p>
@@ -29680,7 +29680,7 @@
           <w:szCs w:val="20"/>
           <w:rFonts w:ascii="Cambria" w:cs="Cambria" w:eastAsia="Cambria" w:hAnsi="Cambria"/>
         </w:rPr>
-        <w:t xml:space="preserve">September 23, 2026</w:t>
+        <w:t xml:space="preserve">September 24, 2026</w:t>
       </w:r>
     </w:p>
     <w:sectPr>
@@ -29717,7 +29717,7 @@
         <w:szCs w:val="14"/>
         <w:rFonts w:ascii="Cambria" w:cs="Cambria" w:eastAsia="Cambria" w:hAnsi="Cambria"/>
       </w:rPr>
-      <w:t xml:space="preserve">Generated September 23, 2026  |  California Community Colleges  |  CPL Initiative</w:t>
+      <w:t xml:space="preserve">Generated September 24, 2026  |  California Community Colleges  |  CPL Initiative</w:t>
     </w:r>
     <w:r>
       <w:rPr>

</xml_diff>

<commit_message>
Daily dashboard update — 2026-09-25
</commit_message>
<xml_diff>
--- a/reports/CPL_Master_Report.docx
+++ b/reports/CPL_Master_Report.docx
@@ -141,7 +141,7 @@
           <w:szCs w:val="22"/>
           <w:rFonts w:ascii="Cambria" w:cs="Cambria" w:eastAsia="Cambria" w:hAnsi="Cambria"/>
         </w:rPr>
-        <w:t xml:space="preserve">As of September 24, 2026, the CPL initiative is ahead of schedule, with most 2025–2026 targets met or exceeded and core infrastructure nearing completion. The work has expanded student access, increased transcripted units, and established the foundation for a permanent, statewide CPL service under Vision 2030.</w:t>
+        <w:t xml:space="preserve">As of September 25, 2026, the CPL initiative is ahead of schedule, with most 2025–2026 targets met or exceeded and core infrastructure nearing completion. The work has expanded student access, increased transcripted units, and established the foundation for a permanent, statewide CPL service under Vision 2030.</w:t>
       </w:r>
     </w:p>
     <w:p>
@@ -167,7 +167,7 @@
           <w:szCs w:val="21"/>
           <w:rFonts w:ascii="Cambria" w:cs="Cambria" w:eastAsia="Cambria" w:hAnsi="Cambria"/>
         </w:rPr>
-        <w:t xml:space="preserve">51,953 cumulative students served with CPL awards, surpassing annual targets.</w:t>
+        <w:t xml:space="preserve">52,015 cumulative students served with CPL awards, surpassing annual targets.</w:t>
       </w:r>
     </w:p>
     <w:p>
@@ -185,7 +185,7 @@
           <w:szCs w:val="21"/>
           <w:rFonts w:ascii="Cambria" w:cs="Cambria" w:eastAsia="Cambria" w:hAnsi="Cambria"/>
         </w:rPr>
-        <w:t xml:space="preserve">223k CPL units transcripted across the system.</w:t>
+        <w:t xml:space="preserve">224k CPL units transcripted across the system.</w:t>
       </w:r>
     </w:p>
     <w:p>
@@ -221,7 +221,7 @@
           <w:szCs w:val="21"/>
           <w:rFonts w:ascii="Cambria" w:cs="Cambria" w:eastAsia="Cambria" w:hAnsi="Cambria"/>
         </w:rPr>
-        <w:t xml:space="preserve">13,526 statewide credit recommendations, driven by faculty discipline workgroups spanning high-demand fields.</w:t>
+        <w:t xml:space="preserve">13,528 statewide credit recommendations, driven by faculty discipline workgroups spanning high-demand fields.</w:t>
       </w:r>
     </w:p>
     <w:p>
@@ -424,7 +424,7 @@
                 <w:szCs w:val="20"/>
                 <w:rFonts w:ascii="Cambria" w:cs="Cambria" w:eastAsia="Cambria" w:hAnsi="Cambria"/>
               </w:rPr>
-              <w:t xml:space="preserve">51,953</w:t>
+              <w:t xml:space="preserve">52,015</w:t>
             </w:r>
           </w:p>
         </w:tc>
@@ -494,7 +494,7 @@
                 <w:szCs w:val="20"/>
                 <w:rFonts w:ascii="Cambria" w:cs="Cambria" w:eastAsia="Cambria" w:hAnsi="Cambria"/>
               </w:rPr>
-              <w:t xml:space="preserve">223k</w:t>
+              <w:t xml:space="preserve">224k</w:t>
             </w:r>
           </w:p>
         </w:tc>
@@ -564,7 +564,7 @@
                 <w:szCs w:val="20"/>
                 <w:rFonts w:ascii="Cambria" w:cs="Cambria" w:eastAsia="Cambria" w:hAnsi="Cambria"/>
               </w:rPr>
-              <w:t xml:space="preserve">13,526</w:t>
+              <w:t xml:space="preserve">13,528</w:t>
             </w:r>
           </w:p>
         </w:tc>
@@ -29629,7 +29629,7 @@
           <w:szCs w:val="22"/>
           <w:rFonts w:ascii="Cambria" w:cs="Cambria" w:eastAsia="Cambria" w:hAnsi="Cambria"/>
         </w:rPr>
-        <w:t xml:space="preserve">The CPL Initiative has moved from pilot to scale, demonstrating measurable impact in student access, credit attainment, and system engagement. With 51,953 students served, 13,526 statewide credit recommendations, and 103 actively participating colleges, the initiative has surpassed most 2025–26 benchmarks ahead of schedule.</w:t>
+        <w:t xml:space="preserve">The CPL Initiative has moved from pilot to scale, demonstrating measurable impact in student access, credit attainment, and system engagement. With 52,015 students served, 13,528 statewide credit recommendations, and 103 actively participating colleges, the initiative has surpassed most 2025–26 benchmarks ahead of schedule.</w:t>
       </w:r>
     </w:p>
     <w:p>
@@ -29680,7 +29680,7 @@
           <w:szCs w:val="20"/>
           <w:rFonts w:ascii="Cambria" w:cs="Cambria" w:eastAsia="Cambria" w:hAnsi="Cambria"/>
         </w:rPr>
-        <w:t xml:space="preserve">September 24, 2026</w:t>
+        <w:t xml:space="preserve">September 25, 2026</w:t>
       </w:r>
     </w:p>
     <w:sectPr>
@@ -29717,7 +29717,7 @@
         <w:szCs w:val="14"/>
         <w:rFonts w:ascii="Cambria" w:cs="Cambria" w:eastAsia="Cambria" w:hAnsi="Cambria"/>
       </w:rPr>
-      <w:t xml:space="preserve">Generated September 24, 2026  |  California Community Colleges  |  CPL Initiative</w:t>
+      <w:t xml:space="preserve">Generated September 25, 2026  |  California Community Colleges  |  CPL Initiative</w:t>
     </w:r>
     <w:r>
       <w:rPr>

</xml_diff>

<commit_message>
Daily dashboard update — 2026-09-26
</commit_message>
<xml_diff>
--- a/reports/CPL_Master_Report.docx
+++ b/reports/CPL_Master_Report.docx
@@ -141,7 +141,7 @@
           <w:szCs w:val="22"/>
           <w:rFonts w:ascii="Cambria" w:cs="Cambria" w:eastAsia="Cambria" w:hAnsi="Cambria"/>
         </w:rPr>
-        <w:t xml:space="preserve">As of September 25, 2026, the CPL initiative is ahead of schedule, with most 2025–2026 targets met or exceeded and core infrastructure nearing completion. The work has expanded student access, increased transcripted units, and established the foundation for a permanent, statewide CPL service under Vision 2030.</w:t>
+        <w:t xml:space="preserve">As of September 26, 2026, the CPL initiative is ahead of schedule, with most 2025–2026 targets met or exceeded and core infrastructure nearing completion. The work has expanded student access, increased transcripted units, and established the foundation for a permanent, statewide CPL service under Vision 2030.</w:t>
       </w:r>
     </w:p>
     <w:p>
@@ -167,7 +167,7 @@
           <w:szCs w:val="21"/>
           <w:rFonts w:ascii="Cambria" w:cs="Cambria" w:eastAsia="Cambria" w:hAnsi="Cambria"/>
         </w:rPr>
-        <w:t xml:space="preserve">52,016 cumulative students served with CPL awards, surpassing annual targets.</w:t>
+        <w:t xml:space="preserve">52,066 cumulative students served with CPL awards, surpassing annual targets.</w:t>
       </w:r>
     </w:p>
     <w:p>
@@ -221,7 +221,7 @@
           <w:szCs w:val="21"/>
           <w:rFonts w:ascii="Cambria" w:cs="Cambria" w:eastAsia="Cambria" w:hAnsi="Cambria"/>
         </w:rPr>
-        <w:t xml:space="preserve">13,528 statewide credit recommendations, driven by faculty discipline workgroups spanning high-demand fields.</w:t>
+        <w:t xml:space="preserve">13,828 statewide credit recommendations, driven by faculty discipline workgroups spanning high-demand fields.</w:t>
       </w:r>
     </w:p>
     <w:p>
@@ -239,7 +239,7 @@
           <w:szCs w:val="21"/>
           <w:rFonts w:ascii="Cambria" w:cs="Cambria" w:eastAsia="Cambria" w:hAnsi="Cambria"/>
         </w:rPr>
-        <w:t xml:space="preserve">The Veteran Sprint has uploaded 59 JSTs to MAP, with estimated student savings of $335M and projected 20-year economic impact of $1.33B.</w:t>
+        <w:t xml:space="preserve">The Veteran Sprint has uploaded 59 JSTs to MAP, with estimated student savings of $336M and projected 20-year economic impact of $1.33B.</w:t>
       </w:r>
     </w:p>
     <w:p>
@@ -424,7 +424,7 @@
                 <w:szCs w:val="20"/>
                 <w:rFonts w:ascii="Cambria" w:cs="Cambria" w:eastAsia="Cambria" w:hAnsi="Cambria"/>
               </w:rPr>
-              <w:t xml:space="preserve">52,016</w:t>
+              <w:t xml:space="preserve">52,066</w:t>
             </w:r>
           </w:p>
         </w:tc>
@@ -564,7 +564,7 @@
                 <w:szCs w:val="20"/>
                 <w:rFonts w:ascii="Cambria" w:cs="Cambria" w:eastAsia="Cambria" w:hAnsi="Cambria"/>
               </w:rPr>
-              <w:t xml:space="preserve">13,528</w:t>
+              <w:t xml:space="preserve">13,828</w:t>
             </w:r>
           </w:p>
         </w:tc>
@@ -774,7 +774,7 @@
                 <w:szCs w:val="20"/>
                 <w:rFonts w:ascii="Cambria" w:cs="Cambria" w:eastAsia="Cambria" w:hAnsi="Cambria"/>
               </w:rPr>
-              <w:t xml:space="preserve">$335M</w:t>
+              <w:t xml:space="preserve">$336M</w:t>
             </w:r>
           </w:p>
         </w:tc>
@@ -29629,7 +29629,7 @@
           <w:szCs w:val="22"/>
           <w:rFonts w:ascii="Cambria" w:cs="Cambria" w:eastAsia="Cambria" w:hAnsi="Cambria"/>
         </w:rPr>
-        <w:t xml:space="preserve">The CPL Initiative has moved from pilot to scale, demonstrating measurable impact in student access, credit attainment, and system engagement. With 52,016 students served, 13,528 statewide credit recommendations, and 103 actively participating colleges, the initiative has surpassed most 2025–26 benchmarks ahead of schedule.</w:t>
+        <w:t xml:space="preserve">The CPL Initiative has moved from pilot to scale, demonstrating measurable impact in student access, credit attainment, and system engagement. With 52,066 students served, 13,828 statewide credit recommendations, and 103 actively participating colleges, the initiative has surpassed most 2025–26 benchmarks ahead of schedule.</w:t>
       </w:r>
     </w:p>
     <w:p>
@@ -29680,7 +29680,7 @@
           <w:szCs w:val="20"/>
           <w:rFonts w:ascii="Cambria" w:cs="Cambria" w:eastAsia="Cambria" w:hAnsi="Cambria"/>
         </w:rPr>
-        <w:t xml:space="preserve">September 25, 2026</w:t>
+        <w:t xml:space="preserve">September 26, 2026</w:t>
       </w:r>
     </w:p>
     <w:sectPr>
@@ -29717,7 +29717,7 @@
         <w:szCs w:val="14"/>
         <w:rFonts w:ascii="Cambria" w:cs="Cambria" w:eastAsia="Cambria" w:hAnsi="Cambria"/>
       </w:rPr>
-      <w:t xml:space="preserve">Generated September 25, 2026  |  California Community Colleges  |  CPL Initiative</w:t>
+      <w:t xml:space="preserve">Generated September 26, 2026  |  California Community Colleges  |  CPL Initiative</w:t>
     </w:r>
     <w:r>
       <w:rPr>

</xml_diff>

<commit_message>
Daily dashboard update — 2026-09-27
</commit_message>
<xml_diff>
--- a/reports/CPL_Master_Report.docx
+++ b/reports/CPL_Master_Report.docx
@@ -141,7 +141,7 @@
           <w:szCs w:val="22"/>
           <w:rFonts w:ascii="Cambria" w:cs="Cambria" w:eastAsia="Cambria" w:hAnsi="Cambria"/>
         </w:rPr>
-        <w:t xml:space="preserve">As of September 26, 2026, the CPL initiative is ahead of schedule, with most 2025–2026 targets met or exceeded and core infrastructure nearing completion. The work has expanded student access, increased transcripted units, and established the foundation for a permanent, statewide CPL service under Vision 2030.</w:t>
+        <w:t xml:space="preserve">As of September 27, 2026, the CPL initiative is ahead of schedule, with most 2025–2026 targets met or exceeded and core infrastructure nearing completion. The work has expanded student access, increased transcripted units, and established the foundation for a permanent, statewide CPL service under Vision 2030.</w:t>
       </w:r>
     </w:p>
     <w:p>
@@ -167,7 +167,7 @@
           <w:szCs w:val="21"/>
           <w:rFonts w:ascii="Cambria" w:cs="Cambria" w:eastAsia="Cambria" w:hAnsi="Cambria"/>
         </w:rPr>
-        <w:t xml:space="preserve">52,067 cumulative students served with CPL awards, surpassing annual targets.</w:t>
+        <w:t xml:space="preserve">52,068 cumulative students served with CPL awards, surpassing annual targets.</w:t>
       </w:r>
     </w:p>
     <w:p>
@@ -424,7 +424,7 @@
                 <w:szCs w:val="20"/>
                 <w:rFonts w:ascii="Cambria" w:cs="Cambria" w:eastAsia="Cambria" w:hAnsi="Cambria"/>
               </w:rPr>
-              <w:t xml:space="preserve">52,067</w:t>
+              <w:t xml:space="preserve">52,068</w:t>
             </w:r>
           </w:p>
         </w:tc>
@@ -29629,7 +29629,7 @@
           <w:szCs w:val="22"/>
           <w:rFonts w:ascii="Cambria" w:cs="Cambria" w:eastAsia="Cambria" w:hAnsi="Cambria"/>
         </w:rPr>
-        <w:t xml:space="preserve">The CPL Initiative has moved from pilot to scale, demonstrating measurable impact in student access, credit attainment, and system engagement. With 52,067 students served, 13,828 statewide credit recommendations, and 103 actively participating colleges, the initiative has surpassed most 2025–26 benchmarks ahead of schedule.</w:t>
+        <w:t xml:space="preserve">The CPL Initiative has moved from pilot to scale, demonstrating measurable impact in student access, credit attainment, and system engagement. With 52,068 students served, 13,828 statewide credit recommendations, and 103 actively participating colleges, the initiative has surpassed most 2025–26 benchmarks ahead of schedule.</w:t>
       </w:r>
     </w:p>
     <w:p>
@@ -29680,7 +29680,7 @@
           <w:szCs w:val="20"/>
           <w:rFonts w:ascii="Cambria" w:cs="Cambria" w:eastAsia="Cambria" w:hAnsi="Cambria"/>
         </w:rPr>
-        <w:t xml:space="preserve">September 26, 2026</w:t>
+        <w:t xml:space="preserve">September 27, 2026</w:t>
       </w:r>
     </w:p>
     <w:sectPr>
@@ -29717,7 +29717,7 @@
         <w:szCs w:val="14"/>
         <w:rFonts w:ascii="Cambria" w:cs="Cambria" w:eastAsia="Cambria" w:hAnsi="Cambria"/>
       </w:rPr>
-      <w:t xml:space="preserve">Generated September 26, 2026  |  California Community Colleges  |  CPL Initiative</w:t>
+      <w:t xml:space="preserve">Generated September 27, 2026  |  California Community Colleges  |  CPL Initiative</w:t>
     </w:r>
     <w:r>
       <w:rPr>

</xml_diff>

<commit_message>
Daily dashboard update — 2026-09-28
</commit_message>
<xml_diff>
--- a/reports/CPL_Master_Report.docx
+++ b/reports/CPL_Master_Report.docx
@@ -141,7 +141,7 @@
           <w:szCs w:val="22"/>
           <w:rFonts w:ascii="Cambria" w:cs="Cambria" w:eastAsia="Cambria" w:hAnsi="Cambria"/>
         </w:rPr>
-        <w:t xml:space="preserve">As of September 27, 2026, the CPL initiative is ahead of schedule, with most 2025–2026 targets met or exceeded and core infrastructure nearing completion. The work has expanded student access, increased transcripted units, and established the foundation for a permanent, statewide CPL service under Vision 2030.</w:t>
+        <w:t xml:space="preserve">As of September 28, 2026, the CPL initiative is ahead of schedule, with most 2025–2026 targets met or exceeded and core infrastructure nearing completion. The work has expanded student access, increased transcripted units, and established the foundation for a permanent, statewide CPL service under Vision 2030.</w:t>
       </w:r>
     </w:p>
     <w:p>
@@ -167,7 +167,7 @@
           <w:szCs w:val="21"/>
           <w:rFonts w:ascii="Cambria" w:cs="Cambria" w:eastAsia="Cambria" w:hAnsi="Cambria"/>
         </w:rPr>
-        <w:t xml:space="preserve">52,068 cumulative students served with CPL awards, surpassing annual targets.</w:t>
+        <w:t xml:space="preserve">52,080 cumulative students served with CPL awards, surpassing annual targets.</w:t>
       </w:r>
     </w:p>
     <w:p>
@@ -221,7 +221,7 @@
           <w:szCs w:val="21"/>
           <w:rFonts w:ascii="Cambria" w:cs="Cambria" w:eastAsia="Cambria" w:hAnsi="Cambria"/>
         </w:rPr>
-        <w:t xml:space="preserve">13,828 statewide credit recommendations, driven by faculty discipline workgroups spanning high-demand fields.</w:t>
+        <w:t xml:space="preserve">13,863 statewide credit recommendations, driven by faculty discipline workgroups spanning high-demand fields.</w:t>
       </w:r>
     </w:p>
     <w:p>
@@ -424,7 +424,7 @@
                 <w:szCs w:val="20"/>
                 <w:rFonts w:ascii="Cambria" w:cs="Cambria" w:eastAsia="Cambria" w:hAnsi="Cambria"/>
               </w:rPr>
-              <w:t xml:space="preserve">52,068</w:t>
+              <w:t xml:space="preserve">52,080</w:t>
             </w:r>
           </w:p>
         </w:tc>
@@ -564,7 +564,7 @@
                 <w:szCs w:val="20"/>
                 <w:rFonts w:ascii="Cambria" w:cs="Cambria" w:eastAsia="Cambria" w:hAnsi="Cambria"/>
               </w:rPr>
-              <w:t xml:space="preserve">13,828</w:t>
+              <w:t xml:space="preserve">13,863</w:t>
             </w:r>
           </w:p>
         </w:tc>
@@ -29629,7 +29629,7 @@
           <w:szCs w:val="22"/>
           <w:rFonts w:ascii="Cambria" w:cs="Cambria" w:eastAsia="Cambria" w:hAnsi="Cambria"/>
         </w:rPr>
-        <w:t xml:space="preserve">The CPL Initiative has moved from pilot to scale, demonstrating measurable impact in student access, credit attainment, and system engagement. With 52,068 students served, 13,828 statewide credit recommendations, and 103 actively participating colleges, the initiative has surpassed most 2025–26 benchmarks ahead of schedule.</w:t>
+        <w:t xml:space="preserve">The CPL Initiative has moved from pilot to scale, demonstrating measurable impact in student access, credit attainment, and system engagement. With 52,080 students served, 13,863 statewide credit recommendations, and 103 actively participating colleges, the initiative has surpassed most 2025–26 benchmarks ahead of schedule.</w:t>
       </w:r>
     </w:p>
     <w:p>
@@ -29680,7 +29680,7 @@
           <w:szCs w:val="20"/>
           <w:rFonts w:ascii="Cambria" w:cs="Cambria" w:eastAsia="Cambria" w:hAnsi="Cambria"/>
         </w:rPr>
-        <w:t xml:space="preserve">September 27, 2026</w:t>
+        <w:t xml:space="preserve">September 28, 2026</w:t>
       </w:r>
     </w:p>
     <w:sectPr>
@@ -29717,7 +29717,7 @@
         <w:szCs w:val="14"/>
         <w:rFonts w:ascii="Cambria" w:cs="Cambria" w:eastAsia="Cambria" w:hAnsi="Cambria"/>
       </w:rPr>
-      <w:t xml:space="preserve">Generated September 27, 2026  |  California Community Colleges  |  CPL Initiative</w:t>
+      <w:t xml:space="preserve">Generated September 28, 2026  |  California Community Colleges  |  CPL Initiative</w:t>
     </w:r>
     <w:r>
       <w:rPr>

</xml_diff>

<commit_message>
Daily dashboard update — 2026-09-29
</commit_message>
<xml_diff>
--- a/reports/CPL_Master_Report.docx
+++ b/reports/CPL_Master_Report.docx
@@ -141,7 +141,7 @@
           <w:szCs w:val="22"/>
           <w:rFonts w:ascii="Cambria" w:cs="Cambria" w:eastAsia="Cambria" w:hAnsi="Cambria"/>
         </w:rPr>
-        <w:t xml:space="preserve">As of September 28, 2026, the CPL initiative is ahead of schedule, with most 2025–2026 targets met or exceeded and core infrastructure nearing completion. The work has expanded student access, increased transcripted units, and established the foundation for a permanent, statewide CPL service under Vision 2030.</w:t>
+        <w:t xml:space="preserve">As of September 29, 2026, the CPL initiative is ahead of schedule, with most 2025–2026 targets met or exceeded and core infrastructure nearing completion. The work has expanded student access, increased transcripted units, and established the foundation for a permanent, statewide CPL service under Vision 2030.</w:t>
       </w:r>
     </w:p>
     <w:p>
@@ -167,7 +167,7 @@
           <w:szCs w:val="21"/>
           <w:rFonts w:ascii="Cambria" w:cs="Cambria" w:eastAsia="Cambria" w:hAnsi="Cambria"/>
         </w:rPr>
-        <w:t xml:space="preserve">52,089 cumulative students served with CPL awards, surpassing annual targets.</w:t>
+        <w:t xml:space="preserve">52,103 cumulative students served with CPL awards, surpassing annual targets.</w:t>
       </w:r>
     </w:p>
     <w:p>
@@ -221,7 +221,7 @@
           <w:szCs w:val="21"/>
           <w:rFonts w:ascii="Cambria" w:cs="Cambria" w:eastAsia="Cambria" w:hAnsi="Cambria"/>
         </w:rPr>
-        <w:t xml:space="preserve">13,863 statewide credit recommendations, driven by faculty discipline workgroups spanning high-demand fields.</w:t>
+        <w:t xml:space="preserve">13,897 statewide credit recommendations, driven by faculty discipline workgroups spanning high-demand fields.</w:t>
       </w:r>
     </w:p>
     <w:p>
@@ -424,7 +424,7 @@
                 <w:szCs w:val="20"/>
                 <w:rFonts w:ascii="Cambria" w:cs="Cambria" w:eastAsia="Cambria" w:hAnsi="Cambria"/>
               </w:rPr>
-              <w:t xml:space="preserve">52,089</w:t>
+              <w:t xml:space="preserve">52,103</w:t>
             </w:r>
           </w:p>
         </w:tc>
@@ -564,7 +564,7 @@
                 <w:szCs w:val="20"/>
                 <w:rFonts w:ascii="Cambria" w:cs="Cambria" w:eastAsia="Cambria" w:hAnsi="Cambria"/>
               </w:rPr>
-              <w:t xml:space="preserve">13,863</w:t>
+              <w:t xml:space="preserve">13,897</w:t>
             </w:r>
           </w:p>
         </w:tc>
@@ -29629,7 +29629,7 @@
           <w:szCs w:val="22"/>
           <w:rFonts w:ascii="Cambria" w:cs="Cambria" w:eastAsia="Cambria" w:hAnsi="Cambria"/>
         </w:rPr>
-        <w:t xml:space="preserve">The CPL Initiative has moved from pilot to scale, demonstrating measurable impact in student access, credit attainment, and system engagement. With 52,089 students served, 13,863 statewide credit recommendations, and 103 actively participating colleges, the initiative has surpassed most 2025–26 benchmarks ahead of schedule.</w:t>
+        <w:t xml:space="preserve">The CPL Initiative has moved from pilot to scale, demonstrating measurable impact in student access, credit attainment, and system engagement. With 52,103 students served, 13,897 statewide credit recommendations, and 103 actively participating colleges, the initiative has surpassed most 2025–26 benchmarks ahead of schedule.</w:t>
       </w:r>
     </w:p>
     <w:p>
@@ -29680,7 +29680,7 @@
           <w:szCs w:val="20"/>
           <w:rFonts w:ascii="Cambria" w:cs="Cambria" w:eastAsia="Cambria" w:hAnsi="Cambria"/>
         </w:rPr>
-        <w:t xml:space="preserve">September 28, 2026</w:t>
+        <w:t xml:space="preserve">September 29, 2026</w:t>
       </w:r>
     </w:p>
     <w:sectPr>
@@ -29717,7 +29717,7 @@
         <w:szCs w:val="14"/>
         <w:rFonts w:ascii="Cambria" w:cs="Cambria" w:eastAsia="Cambria" w:hAnsi="Cambria"/>
       </w:rPr>
-      <w:t xml:space="preserve">Generated September 28, 2026  |  California Community Colleges  |  CPL Initiative</w:t>
+      <w:t xml:space="preserve">Generated September 29, 2026  |  California Community Colleges  |  CPL Initiative</w:t>
     </w:r>
     <w:r>
       <w:rPr>

</xml_diff>

<commit_message>
Daily dashboard update — 2026-09-30
</commit_message>
<xml_diff>
--- a/reports/CPL_Master_Report.docx
+++ b/reports/CPL_Master_Report.docx
@@ -141,7 +141,7 @@
           <w:szCs w:val="22"/>
           <w:rFonts w:ascii="Cambria" w:cs="Cambria" w:eastAsia="Cambria" w:hAnsi="Cambria"/>
         </w:rPr>
-        <w:t xml:space="preserve">As of September 29, 2026, the CPL initiative is ahead of schedule, with most 2025–2026 targets met or exceeded and core infrastructure nearing completion. The work has expanded student access, increased transcripted units, and established the foundation for a permanent, statewide CPL service under Vision 2030.</w:t>
+        <w:t xml:space="preserve">As of September 30, 2026, the CPL initiative is ahead of schedule, with most 2025–2026 targets met or exceeded and core infrastructure nearing completion. The work has expanded student access, increased transcripted units, and established the foundation for a permanent, statewide CPL service under Vision 2030.</w:t>
       </w:r>
     </w:p>
     <w:p>
@@ -167,7 +167,7 @@
           <w:szCs w:val="21"/>
           <w:rFonts w:ascii="Cambria" w:cs="Cambria" w:eastAsia="Cambria" w:hAnsi="Cambria"/>
         </w:rPr>
-        <w:t xml:space="preserve">52,178 cumulative students served with CPL awards, surpassing annual targets.</w:t>
+        <w:t xml:space="preserve">52,299 cumulative students served with CPL awards, surpassing annual targets.</w:t>
       </w:r>
     </w:p>
     <w:p>
@@ -185,7 +185,7 @@
           <w:szCs w:val="21"/>
           <w:rFonts w:ascii="Cambria" w:cs="Cambria" w:eastAsia="Cambria" w:hAnsi="Cambria"/>
         </w:rPr>
-        <w:t xml:space="preserve">225k CPL units transcripted across the system.</w:t>
+        <w:t xml:space="preserve">226k CPL units transcripted across the system.</w:t>
       </w:r>
     </w:p>
     <w:p>
@@ -221,7 +221,7 @@
           <w:szCs w:val="21"/>
           <w:rFonts w:ascii="Cambria" w:cs="Cambria" w:eastAsia="Cambria" w:hAnsi="Cambria"/>
         </w:rPr>
-        <w:t xml:space="preserve">13,900 statewide credit recommendations, driven by faculty discipline workgroups spanning high-demand fields.</w:t>
+        <w:t xml:space="preserve">13,927 statewide credit recommendations, driven by faculty discipline workgroups spanning high-demand fields.</w:t>
       </w:r>
     </w:p>
     <w:p>
@@ -239,7 +239,7 @@
           <w:szCs w:val="21"/>
           <w:rFonts w:ascii="Cambria" w:cs="Cambria" w:eastAsia="Cambria" w:hAnsi="Cambria"/>
         </w:rPr>
-        <w:t xml:space="preserve">The Veteran Sprint has uploaded 59 JSTs to MAP, with estimated student savings of $338M and projected 20-year economic impact of $1.33B.</w:t>
+        <w:t xml:space="preserve">The Veteran Sprint has uploaded 59 JSTs to MAP, with estimated student savings of $338M and projected 20-year economic impact of $1.34B.</w:t>
       </w:r>
     </w:p>
     <w:p>
@@ -424,7 +424,7 @@
                 <w:szCs w:val="20"/>
                 <w:rFonts w:ascii="Cambria" w:cs="Cambria" w:eastAsia="Cambria" w:hAnsi="Cambria"/>
               </w:rPr>
-              <w:t xml:space="preserve">52,178</w:t>
+              <w:t xml:space="preserve">52,299</w:t>
             </w:r>
           </w:p>
         </w:tc>
@@ -494,7 +494,7 @@
                 <w:szCs w:val="20"/>
                 <w:rFonts w:ascii="Cambria" w:cs="Cambria" w:eastAsia="Cambria" w:hAnsi="Cambria"/>
               </w:rPr>
-              <w:t xml:space="preserve">225k</w:t>
+              <w:t xml:space="preserve">226k</w:t>
             </w:r>
           </w:p>
         </w:tc>
@@ -564,7 +564,7 @@
                 <w:szCs w:val="20"/>
                 <w:rFonts w:ascii="Cambria" w:cs="Cambria" w:eastAsia="Cambria" w:hAnsi="Cambria"/>
               </w:rPr>
-              <w:t xml:space="preserve">13,900</w:t>
+              <w:t xml:space="preserve">13,927</w:t>
             </w:r>
           </w:p>
         </w:tc>
@@ -844,7 +844,7 @@
                 <w:szCs w:val="20"/>
                 <w:rFonts w:ascii="Cambria" w:cs="Cambria" w:eastAsia="Cambria" w:hAnsi="Cambria"/>
               </w:rPr>
-              <w:t xml:space="preserve">$1.33B</w:t>
+              <w:t xml:space="preserve">$1.34B</w:t>
             </w:r>
           </w:p>
         </w:tc>
@@ -29629,7 +29629,7 @@
           <w:szCs w:val="22"/>
           <w:rFonts w:ascii="Cambria" w:cs="Cambria" w:eastAsia="Cambria" w:hAnsi="Cambria"/>
         </w:rPr>
-        <w:t xml:space="preserve">The CPL Initiative has moved from pilot to scale, demonstrating measurable impact in student access, credit attainment, and system engagement. With 52,178 students served, 13,900 statewide credit recommendations, and 103 actively participating colleges, the initiative has surpassed most 2025–26 benchmarks ahead of schedule.</w:t>
+        <w:t xml:space="preserve">The CPL Initiative has moved from pilot to scale, demonstrating measurable impact in student access, credit attainment, and system engagement. With 52,299 students served, 13,927 statewide credit recommendations, and 103 actively participating colleges, the initiative has surpassed most 2025–26 benchmarks ahead of schedule.</w:t>
       </w:r>
     </w:p>
     <w:p>
@@ -29680,7 +29680,7 @@
           <w:szCs w:val="20"/>
           <w:rFonts w:ascii="Cambria" w:cs="Cambria" w:eastAsia="Cambria" w:hAnsi="Cambria"/>
         </w:rPr>
-        <w:t xml:space="preserve">September 29, 2026</w:t>
+        <w:t xml:space="preserve">September 30, 2026</w:t>
       </w:r>
     </w:p>
     <w:sectPr>
@@ -29717,7 +29717,7 @@
         <w:szCs w:val="14"/>
         <w:rFonts w:ascii="Cambria" w:cs="Cambria" w:eastAsia="Cambria" w:hAnsi="Cambria"/>
       </w:rPr>
-      <w:t xml:space="preserve">Generated September 29, 2026  |  California Community Colleges  |  CPL Initiative</w:t>
+      <w:t xml:space="preserve">Generated September 30, 2026  |  California Community Colleges  |  CPL Initiative</w:t>
     </w:r>
     <w:r>
       <w:rPr>

</xml_diff>

<commit_message>
Daily dashboard update — 2026-10-01
</commit_message>
<xml_diff>
--- a/reports/CPL_Master_Report.docx
+++ b/reports/CPL_Master_Report.docx
@@ -35,7 +35,7 @@
           <w:szCs w:val="36"/>
           <w:rFonts w:ascii="Cambria" w:cs="Cambria" w:eastAsia="Cambria" w:hAnsi="Cambria"/>
         </w:rPr>
-        <w:t xml:space="preserve">September 2026</w:t>
+        <w:t xml:space="preserve">October 2026</w:t>
       </w:r>
     </w:p>
     <w:p>
@@ -141,7 +141,7 @@
           <w:szCs w:val="22"/>
           <w:rFonts w:ascii="Cambria" w:cs="Cambria" w:eastAsia="Cambria" w:hAnsi="Cambria"/>
         </w:rPr>
-        <w:t xml:space="preserve">As of September 30, 2026, the CPL initiative is ahead of schedule, with most 2025–2026 targets met or exceeded and core infrastructure nearing completion. The work has expanded student access, increased transcripted units, and established the foundation for a permanent, statewide CPL service under Vision 2030.</w:t>
+        <w:t xml:space="preserve">As of October 1, 2026, the CPL initiative is ahead of schedule, with most 2025–2026 targets met or exceeded and core infrastructure nearing completion. The work has expanded student access, increased transcripted units, and established the foundation for a permanent, statewide CPL service under Vision 2030.</w:t>
       </w:r>
     </w:p>
     <w:p>
@@ -167,7 +167,7 @@
           <w:szCs w:val="21"/>
           <w:rFonts w:ascii="Cambria" w:cs="Cambria" w:eastAsia="Cambria" w:hAnsi="Cambria"/>
         </w:rPr>
-        <w:t xml:space="preserve">52,302 cumulative students served with CPL awards, surpassing annual targets.</w:t>
+        <w:t xml:space="preserve">52,307 cumulative students served with CPL awards, surpassing annual targets.</w:t>
       </w:r>
     </w:p>
     <w:p>
@@ -221,7 +221,7 @@
           <w:szCs w:val="21"/>
           <w:rFonts w:ascii="Cambria" w:cs="Cambria" w:eastAsia="Cambria" w:hAnsi="Cambria"/>
         </w:rPr>
-        <w:t xml:space="preserve">13,931 statewide credit recommendations, driven by faculty discipline workgroups spanning high-demand fields.</w:t>
+        <w:t xml:space="preserve">13,956 statewide credit recommendations, driven by faculty discipline workgroups spanning high-demand fields.</w:t>
       </w:r>
     </w:p>
     <w:p>
@@ -424,7 +424,7 @@
                 <w:szCs w:val="20"/>
                 <w:rFonts w:ascii="Cambria" w:cs="Cambria" w:eastAsia="Cambria" w:hAnsi="Cambria"/>
               </w:rPr>
-              <w:t xml:space="preserve">52,302</w:t>
+              <w:t xml:space="preserve">52,307</w:t>
             </w:r>
           </w:p>
         </w:tc>
@@ -564,7 +564,7 @@
                 <w:szCs w:val="20"/>
                 <w:rFonts w:ascii="Cambria" w:cs="Cambria" w:eastAsia="Cambria" w:hAnsi="Cambria"/>
               </w:rPr>
-              <w:t xml:space="preserve">13,931</w:t>
+              <w:t xml:space="preserve">13,956</w:t>
             </w:r>
           </w:p>
         </w:tc>
@@ -29629,7 +29629,7 @@
           <w:szCs w:val="22"/>
           <w:rFonts w:ascii="Cambria" w:cs="Cambria" w:eastAsia="Cambria" w:hAnsi="Cambria"/>
         </w:rPr>
-        <w:t xml:space="preserve">The CPL Initiative has moved from pilot to scale, demonstrating measurable impact in student access, credit attainment, and system engagement. With 52,302 students served, 13,931 statewide credit recommendations, and 103 actively participating colleges, the initiative has surpassed most 2025–26 benchmarks ahead of schedule.</w:t>
+        <w:t xml:space="preserve">The CPL Initiative has moved from pilot to scale, demonstrating measurable impact in student access, credit attainment, and system engagement. With 52,307 students served, 13,956 statewide credit recommendations, and 103 actively participating colleges, the initiative has surpassed most 2025–26 benchmarks ahead of schedule.</w:t>
       </w:r>
     </w:p>
     <w:p>
@@ -29680,7 +29680,7 @@
           <w:szCs w:val="20"/>
           <w:rFonts w:ascii="Cambria" w:cs="Cambria" w:eastAsia="Cambria" w:hAnsi="Cambria"/>
         </w:rPr>
-        <w:t xml:space="preserve">September 30, 2026</w:t>
+        <w:t xml:space="preserve">October 1, 2026</w:t>
       </w:r>
     </w:p>
     <w:sectPr>
@@ -29717,7 +29717,7 @@
         <w:szCs w:val="14"/>
         <w:rFonts w:ascii="Cambria" w:cs="Cambria" w:eastAsia="Cambria" w:hAnsi="Cambria"/>
       </w:rPr>
-      <w:t xml:space="preserve">Generated September 30, 2026  |  California Community Colleges  |  CPL Initiative</w:t>
+      <w:t xml:space="preserve">Generated October 1, 2026  |  California Community Colleges  |  CPL Initiative</w:t>
     </w:r>
     <w:r>
       <w:rPr>

</xml_diff>

<commit_message>
Daily dashboard update — 2026-10-02
</commit_message>
<xml_diff>
--- a/reports/CPL_Master_Report.docx
+++ b/reports/CPL_Master_Report.docx
@@ -141,7 +141,7 @@
           <w:szCs w:val="22"/>
           <w:rFonts w:ascii="Cambria" w:cs="Cambria" w:eastAsia="Cambria" w:hAnsi="Cambria"/>
         </w:rPr>
-        <w:t xml:space="preserve">As of October 1, 2026, the CPL initiative is ahead of schedule, with most 2025–2026 targets met or exceeded and core infrastructure nearing completion. The work has expanded student access, increased transcripted units, and established the foundation for a permanent, statewide CPL service under Vision 2030.</w:t>
+        <w:t xml:space="preserve">As of October 2, 2026, the CPL initiative is ahead of schedule, with most 2025–2026 targets met or exceeded and core infrastructure nearing completion. The work has expanded student access, increased transcripted units, and established the foundation for a permanent, statewide CPL service under Vision 2030.</w:t>
       </w:r>
     </w:p>
     <w:p>
@@ -167,7 +167,7 @@
           <w:szCs w:val="21"/>
           <w:rFonts w:ascii="Cambria" w:cs="Cambria" w:eastAsia="Cambria" w:hAnsi="Cambria"/>
         </w:rPr>
-        <w:t xml:space="preserve">52,332 cumulative students served with CPL awards, surpassing annual targets.</w:t>
+        <w:t xml:space="preserve">52,355 cumulative students served with CPL awards, surpassing annual targets.</w:t>
       </w:r>
     </w:p>
     <w:p>
@@ -221,7 +221,7 @@
           <w:szCs w:val="21"/>
           <w:rFonts w:ascii="Cambria" w:cs="Cambria" w:eastAsia="Cambria" w:hAnsi="Cambria"/>
         </w:rPr>
-        <w:t xml:space="preserve">13,946 statewide credit recommendations, driven by faculty discipline workgroups spanning high-demand fields.</w:t>
+        <w:t xml:space="preserve">13,969 statewide credit recommendations, driven by faculty discipline workgroups spanning high-demand fields.</w:t>
       </w:r>
     </w:p>
     <w:p>
@@ -239,7 +239,7 @@
           <w:szCs w:val="21"/>
           <w:rFonts w:ascii="Cambria" w:cs="Cambria" w:eastAsia="Cambria" w:hAnsi="Cambria"/>
         </w:rPr>
-        <w:t xml:space="preserve">The Veteran Sprint has uploaded 59 JSTs to MAP, with estimated student savings of $339M and projected 20-year economic impact of $1.34B.</w:t>
+        <w:t xml:space="preserve">The Veteran Sprint has uploaded 58 JSTs to MAP, with estimated student savings of $339M and projected 20-year economic impact of $1.34B.</w:t>
       </w:r>
     </w:p>
     <w:p>
@@ -424,7 +424,7 @@
                 <w:szCs w:val="20"/>
                 <w:rFonts w:ascii="Cambria" w:cs="Cambria" w:eastAsia="Cambria" w:hAnsi="Cambria"/>
               </w:rPr>
-              <w:t xml:space="preserve">52,332</w:t>
+              <w:t xml:space="preserve">52,355</w:t>
             </w:r>
           </w:p>
         </w:tc>
@@ -564,7 +564,7 @@
                 <w:szCs w:val="20"/>
                 <w:rFonts w:ascii="Cambria" w:cs="Cambria" w:eastAsia="Cambria" w:hAnsi="Cambria"/>
               </w:rPr>
-              <w:t xml:space="preserve">13,946</w:t>
+              <w:t xml:space="preserve">13,969</w:t>
             </w:r>
           </w:p>
         </w:tc>
@@ -704,7 +704,7 @@
                 <w:szCs w:val="20"/>
                 <w:rFonts w:ascii="Cambria" w:cs="Cambria" w:eastAsia="Cambria" w:hAnsi="Cambria"/>
               </w:rPr>
-              <w:t xml:space="preserve">59</w:t>
+              <w:t xml:space="preserve">58</w:t>
             </w:r>
           </w:p>
         </w:tc>
@@ -29629,7 +29629,7 @@
           <w:szCs w:val="22"/>
           <w:rFonts w:ascii="Cambria" w:cs="Cambria" w:eastAsia="Cambria" w:hAnsi="Cambria"/>
         </w:rPr>
-        <w:t xml:space="preserve">The CPL Initiative has moved from pilot to scale, demonstrating measurable impact in student access, credit attainment, and system engagement. With 52,332 students served, 13,946 statewide credit recommendations, and 103 actively participating colleges, the initiative has surpassed most 2025–26 benchmarks ahead of schedule.</w:t>
+        <w:t xml:space="preserve">The CPL Initiative has moved from pilot to scale, demonstrating measurable impact in student access, credit attainment, and system engagement. With 52,355 students served, 13,969 statewide credit recommendations, and 103 actively participating colleges, the initiative has surpassed most 2025–26 benchmarks ahead of schedule.</w:t>
       </w:r>
     </w:p>
     <w:p>
@@ -29680,7 +29680,7 @@
           <w:szCs w:val="20"/>
           <w:rFonts w:ascii="Cambria" w:cs="Cambria" w:eastAsia="Cambria" w:hAnsi="Cambria"/>
         </w:rPr>
-        <w:t xml:space="preserve">October 1, 2026</w:t>
+        <w:t xml:space="preserve">October 2, 2026</w:t>
       </w:r>
     </w:p>
     <w:sectPr>
@@ -29717,7 +29717,7 @@
         <w:szCs w:val="14"/>
         <w:rFonts w:ascii="Cambria" w:cs="Cambria" w:eastAsia="Cambria" w:hAnsi="Cambria"/>
       </w:rPr>
-      <w:t xml:space="preserve">Generated October 1, 2026  |  California Community Colleges  |  CPL Initiative</w:t>
+      <w:t xml:space="preserve">Generated October 2, 2026  |  California Community Colleges  |  CPL Initiative</w:t>
     </w:r>
     <w:r>
       <w:rPr>

</xml_diff>

<commit_message>
Daily dashboard update — 2026-10-03
</commit_message>
<xml_diff>
--- a/reports/CPL_Master_Report.docx
+++ b/reports/CPL_Master_Report.docx
@@ -141,7 +141,7 @@
           <w:szCs w:val="22"/>
           <w:rFonts w:ascii="Cambria" w:cs="Cambria" w:eastAsia="Cambria" w:hAnsi="Cambria"/>
         </w:rPr>
-        <w:t xml:space="preserve">As of October 2, 2026, the CPL initiative is ahead of schedule, with most 2025–2026 targets met or exceeded and core infrastructure nearing completion. The work has expanded student access, increased transcripted units, and established the foundation for a permanent, statewide CPL service under Vision 2030.</w:t>
+        <w:t xml:space="preserve">As of October 3, 2026, the CPL initiative is ahead of schedule, with most 2025–2026 targets met or exceeded and core infrastructure nearing completion. The work has expanded student access, increased transcripted units, and established the foundation for a permanent, statewide CPL service under Vision 2030.</w:t>
       </w:r>
     </w:p>
     <w:p>
@@ -221,7 +221,7 @@
           <w:szCs w:val="21"/>
           <w:rFonts w:ascii="Cambria" w:cs="Cambria" w:eastAsia="Cambria" w:hAnsi="Cambria"/>
         </w:rPr>
-        <w:t xml:space="preserve">13,978 statewide credit recommendations, driven by faculty discipline workgroups spanning high-demand fields.</w:t>
+        <w:t xml:space="preserve">13,980 statewide credit recommendations, driven by faculty discipline workgroups spanning high-demand fields.</w:t>
       </w:r>
     </w:p>
     <w:p>
@@ -564,7 +564,7 @@
                 <w:szCs w:val="20"/>
                 <w:rFonts w:ascii="Cambria" w:cs="Cambria" w:eastAsia="Cambria" w:hAnsi="Cambria"/>
               </w:rPr>
-              <w:t xml:space="preserve">13,978</w:t>
+              <w:t xml:space="preserve">13,980</w:t>
             </w:r>
           </w:p>
         </w:tc>
@@ -29629,7 +29629,7 @@
           <w:szCs w:val="22"/>
           <w:rFonts w:ascii="Cambria" w:cs="Cambria" w:eastAsia="Cambria" w:hAnsi="Cambria"/>
         </w:rPr>
-        <w:t xml:space="preserve">The CPL Initiative has moved from pilot to scale, demonstrating measurable impact in student access, credit attainment, and system engagement. With 52,359 students served, 13,978 statewide credit recommendations, and 103 actively participating colleges, the initiative has surpassed most 2025–26 benchmarks ahead of schedule.</w:t>
+        <w:t xml:space="preserve">The CPL Initiative has moved from pilot to scale, demonstrating measurable impact in student access, credit attainment, and system engagement. With 52,359 students served, 13,980 statewide credit recommendations, and 103 actively participating colleges, the initiative has surpassed most 2025–26 benchmarks ahead of schedule.</w:t>
       </w:r>
     </w:p>
     <w:p>
@@ -29680,7 +29680,7 @@
           <w:szCs w:val="20"/>
           <w:rFonts w:ascii="Cambria" w:cs="Cambria" w:eastAsia="Cambria" w:hAnsi="Cambria"/>
         </w:rPr>
-        <w:t xml:space="preserve">October 2, 2026</w:t>
+        <w:t xml:space="preserve">October 3, 2026</w:t>
       </w:r>
     </w:p>
     <w:sectPr>
@@ -29717,7 +29717,7 @@
         <w:szCs w:val="14"/>
         <w:rFonts w:ascii="Cambria" w:cs="Cambria" w:eastAsia="Cambria" w:hAnsi="Cambria"/>
       </w:rPr>
-      <w:t xml:space="preserve">Generated October 2, 2026  |  California Community Colleges  |  CPL Initiative</w:t>
+      <w:t xml:space="preserve">Generated October 3, 2026  |  California Community Colleges  |  CPL Initiative</w:t>
     </w:r>
     <w:r>
       <w:rPr>

</xml_diff>

<commit_message>
Daily dashboard update — 2026-10-04
</commit_message>
<xml_diff>
--- a/reports/CPL_Master_Report.docx
+++ b/reports/CPL_Master_Report.docx
@@ -141,7 +141,7 @@
           <w:szCs w:val="22"/>
           <w:rFonts w:ascii="Cambria" w:cs="Cambria" w:eastAsia="Cambria" w:hAnsi="Cambria"/>
         </w:rPr>
-        <w:t xml:space="preserve">As of October 3, 2026, the CPL initiative is ahead of schedule, with most 2025–2026 targets met or exceeded and core infrastructure nearing completion. The work has expanded student access, increased transcripted units, and established the foundation for a permanent, statewide CPL service under Vision 2030.</w:t>
+        <w:t xml:space="preserve">As of October 4, 2026, the CPL initiative is ahead of schedule, with most 2025–2026 targets met or exceeded and core infrastructure nearing completion. The work has expanded student access, increased transcripted units, and established the foundation for a permanent, statewide CPL service under Vision 2030.</w:t>
       </w:r>
     </w:p>
     <w:p>
@@ -167,7 +167,7 @@
           <w:szCs w:val="21"/>
           <w:rFonts w:ascii="Cambria" w:cs="Cambria" w:eastAsia="Cambria" w:hAnsi="Cambria"/>
         </w:rPr>
-        <w:t xml:space="preserve">52,359 cumulative students served with CPL awards, surpassing annual targets.</w:t>
+        <w:t xml:space="preserve">52,384 cumulative students served with CPL awards, surpassing annual targets.</w:t>
       </w:r>
     </w:p>
     <w:p>
@@ -239,7 +239,7 @@
           <w:szCs w:val="21"/>
           <w:rFonts w:ascii="Cambria" w:cs="Cambria" w:eastAsia="Cambria" w:hAnsi="Cambria"/>
         </w:rPr>
-        <w:t xml:space="preserve">The Veteran Sprint has uploaded 58 JSTs to MAP, with estimated student savings of $339M and projected 20-year economic impact of $1.34B.</w:t>
+        <w:t xml:space="preserve">The Veteran Sprint has uploaded 58 JSTs to MAP, with estimated student savings of $340M and projected 20-year economic impact of $1.34B.</w:t>
       </w:r>
     </w:p>
     <w:p>
@@ -424,7 +424,7 @@
                 <w:szCs w:val="20"/>
                 <w:rFonts w:ascii="Cambria" w:cs="Cambria" w:eastAsia="Cambria" w:hAnsi="Cambria"/>
               </w:rPr>
-              <w:t xml:space="preserve">52,359</w:t>
+              <w:t xml:space="preserve">52,384</w:t>
             </w:r>
           </w:p>
         </w:tc>
@@ -774,7 +774,7 @@
                 <w:szCs w:val="20"/>
                 <w:rFonts w:ascii="Cambria" w:cs="Cambria" w:eastAsia="Cambria" w:hAnsi="Cambria"/>
               </w:rPr>
-              <w:t xml:space="preserve">$339M</w:t>
+              <w:t xml:space="preserve">$340M</w:t>
             </w:r>
           </w:p>
         </w:tc>
@@ -29629,7 +29629,7 @@
           <w:szCs w:val="22"/>
           <w:rFonts w:ascii="Cambria" w:cs="Cambria" w:eastAsia="Cambria" w:hAnsi="Cambria"/>
         </w:rPr>
-        <w:t xml:space="preserve">The CPL Initiative has moved from pilot to scale, demonstrating measurable impact in student access, credit attainment, and system engagement. With 52,359 students served, 13,980 statewide credit recommendations, and 103 actively participating colleges, the initiative has surpassed most 2025–26 benchmarks ahead of schedule.</w:t>
+        <w:t xml:space="preserve">The CPL Initiative has moved from pilot to scale, demonstrating measurable impact in student access, credit attainment, and system engagement. With 52,384 students served, 13,980 statewide credit recommendations, and 103 actively participating colleges, the initiative has surpassed most 2025–26 benchmarks ahead of schedule.</w:t>
       </w:r>
     </w:p>
     <w:p>
@@ -29680,7 +29680,7 @@
           <w:szCs w:val="20"/>
           <w:rFonts w:ascii="Cambria" w:cs="Cambria" w:eastAsia="Cambria" w:hAnsi="Cambria"/>
         </w:rPr>
-        <w:t xml:space="preserve">October 3, 2026</w:t>
+        <w:t xml:space="preserve">October 4, 2026</w:t>
       </w:r>
     </w:p>
     <w:sectPr>
@@ -29717,7 +29717,7 @@
         <w:szCs w:val="14"/>
         <w:rFonts w:ascii="Cambria" w:cs="Cambria" w:eastAsia="Cambria" w:hAnsi="Cambria"/>
       </w:rPr>
-      <w:t xml:space="preserve">Generated October 3, 2026  |  California Community Colleges  |  CPL Initiative</w:t>
+      <w:t xml:space="preserve">Generated October 4, 2026  |  California Community Colleges  |  CPL Initiative</w:t>
     </w:r>
     <w:r>
       <w:rPr>

</xml_diff>

<commit_message>
Daily dashboard update — 2026-10-05
</commit_message>
<xml_diff>
--- a/reports/CPL_Master_Report.docx
+++ b/reports/CPL_Master_Report.docx
@@ -141,7 +141,7 @@
           <w:szCs w:val="22"/>
           <w:rFonts w:ascii="Cambria" w:cs="Cambria" w:eastAsia="Cambria" w:hAnsi="Cambria"/>
         </w:rPr>
-        <w:t xml:space="preserve">As of October 4, 2026, the CPL initiative is ahead of schedule, with most 2025–2026 targets met or exceeded and core infrastructure nearing completion. The work has expanded student access, increased transcripted units, and established the foundation for a permanent, statewide CPL service under Vision 2030.</w:t>
+        <w:t xml:space="preserve">As of October 5, 2026, the CPL initiative is ahead of schedule, with most 2025–2026 targets met or exceeded and core infrastructure nearing completion. The work has expanded student access, increased transcripted units, and established the foundation for a permanent, statewide CPL service under Vision 2030.</w:t>
       </w:r>
     </w:p>
     <w:p>
@@ -167,7 +167,7 @@
           <w:szCs w:val="21"/>
           <w:rFonts w:ascii="Cambria" w:cs="Cambria" w:eastAsia="Cambria" w:hAnsi="Cambria"/>
         </w:rPr>
-        <w:t xml:space="preserve">52,385 cumulative students served with CPL awards, surpassing annual targets.</w:t>
+        <w:t xml:space="preserve">52,393 cumulative students served with CPL awards, surpassing annual targets.</w:t>
       </w:r>
     </w:p>
     <w:p>
@@ -424,7 +424,7 @@
                 <w:szCs w:val="20"/>
                 <w:rFonts w:ascii="Cambria" w:cs="Cambria" w:eastAsia="Cambria" w:hAnsi="Cambria"/>
               </w:rPr>
-              <w:t xml:space="preserve">52,385</w:t>
+              <w:t xml:space="preserve">52,393</w:t>
             </w:r>
           </w:p>
         </w:tc>
@@ -29629,7 +29629,7 @@
           <w:szCs w:val="22"/>
           <w:rFonts w:ascii="Cambria" w:cs="Cambria" w:eastAsia="Cambria" w:hAnsi="Cambria"/>
         </w:rPr>
-        <w:t xml:space="preserve">The CPL Initiative has moved from pilot to scale, demonstrating measurable impact in student access, credit attainment, and system engagement. With 52,385 students served, 13,980 statewide credit recommendations, and 103 actively participating colleges, the initiative has surpassed most 2025–26 benchmarks ahead of schedule.</w:t>
+        <w:t xml:space="preserve">The CPL Initiative has moved from pilot to scale, demonstrating measurable impact in student access, credit attainment, and system engagement. With 52,393 students served, 13,980 statewide credit recommendations, and 103 actively participating colleges, the initiative has surpassed most 2025–26 benchmarks ahead of schedule.</w:t>
       </w:r>
     </w:p>
     <w:p>
@@ -29680,7 +29680,7 @@
           <w:szCs w:val="20"/>
           <w:rFonts w:ascii="Cambria" w:cs="Cambria" w:eastAsia="Cambria" w:hAnsi="Cambria"/>
         </w:rPr>
-        <w:t xml:space="preserve">October 4, 2026</w:t>
+        <w:t xml:space="preserve">October 5, 2026</w:t>
       </w:r>
     </w:p>
     <w:sectPr>
@@ -29717,7 +29717,7 @@
         <w:szCs w:val="14"/>
         <w:rFonts w:ascii="Cambria" w:cs="Cambria" w:eastAsia="Cambria" w:hAnsi="Cambria"/>
       </w:rPr>
-      <w:t xml:space="preserve">Generated October 4, 2026  |  California Community Colleges  |  CPL Initiative</w:t>
+      <w:t xml:space="preserve">Generated October 5, 2026  |  California Community Colleges  |  CPL Initiative</w:t>
     </w:r>
     <w:r>
       <w:rPr>

</xml_diff>

<commit_message>
Daily dashboard update — 2026-10-06
</commit_message>
<xml_diff>
--- a/reports/CPL_Master_Report.docx
+++ b/reports/CPL_Master_Report.docx
@@ -141,7 +141,7 @@
           <w:szCs w:val="22"/>
           <w:rFonts w:ascii="Cambria" w:cs="Cambria" w:eastAsia="Cambria" w:hAnsi="Cambria"/>
         </w:rPr>
-        <w:t xml:space="preserve">As of October 5, 2026, the CPL initiative is ahead of schedule, with most 2025–2026 targets met or exceeded and core infrastructure nearing completion. The work has expanded student access, increased transcripted units, and established the foundation for a permanent, statewide CPL service under Vision 2030.</w:t>
+        <w:t xml:space="preserve">As of October 6, 2026, the CPL initiative is ahead of schedule, with most 2025–2026 targets met or exceeded and core infrastructure nearing completion. The work has expanded student access, increased transcripted units, and established the foundation for a permanent, statewide CPL service under Vision 2030.</w:t>
       </w:r>
     </w:p>
     <w:p>
@@ -167,7 +167,7 @@
           <w:szCs w:val="21"/>
           <w:rFonts w:ascii="Cambria" w:cs="Cambria" w:eastAsia="Cambria" w:hAnsi="Cambria"/>
         </w:rPr>
-        <w:t xml:space="preserve">52,424 cumulative students served with CPL awards, surpassing annual targets.</w:t>
+        <w:t xml:space="preserve">52,450 cumulative students served with CPL awards, surpassing annual targets.</w:t>
       </w:r>
     </w:p>
     <w:p>
@@ -221,7 +221,7 @@
           <w:szCs w:val="21"/>
           <w:rFonts w:ascii="Cambria" w:cs="Cambria" w:eastAsia="Cambria" w:hAnsi="Cambria"/>
         </w:rPr>
-        <w:t xml:space="preserve">13,980 statewide credit recommendations, driven by faculty discipline workgroups spanning high-demand fields.</w:t>
+        <w:t xml:space="preserve">14,023 statewide credit recommendations, driven by faculty discipline workgroups spanning high-demand fields.</w:t>
       </w:r>
     </w:p>
     <w:p>
@@ -239,7 +239,7 @@
           <w:szCs w:val="21"/>
           <w:rFonts w:ascii="Cambria" w:cs="Cambria" w:eastAsia="Cambria" w:hAnsi="Cambria"/>
         </w:rPr>
-        <w:t xml:space="preserve">The Veteran Sprint has uploaded 58 JSTs to MAP, with estimated student savings of $340M and projected 20-year economic impact of $1.34B.</w:t>
+        <w:t xml:space="preserve">The Veteran Sprint has uploaded 58 JSTs to MAP, with estimated student savings of $340M and projected 20-year economic impact of $1.35B.</w:t>
       </w:r>
     </w:p>
     <w:p>
@@ -424,7 +424,7 @@
                 <w:szCs w:val="20"/>
                 <w:rFonts w:ascii="Cambria" w:cs="Cambria" w:eastAsia="Cambria" w:hAnsi="Cambria"/>
               </w:rPr>
-              <w:t xml:space="preserve">52,424</w:t>
+              <w:t xml:space="preserve">52,450</w:t>
             </w:r>
           </w:p>
         </w:tc>
@@ -564,7 +564,7 @@
                 <w:szCs w:val="20"/>
                 <w:rFonts w:ascii="Cambria" w:cs="Cambria" w:eastAsia="Cambria" w:hAnsi="Cambria"/>
               </w:rPr>
-              <w:t xml:space="preserve">13,980</w:t>
+              <w:t xml:space="preserve">14,023</w:t>
             </w:r>
           </w:p>
         </w:tc>
@@ -844,7 +844,7 @@
                 <w:szCs w:val="20"/>
                 <w:rFonts w:ascii="Cambria" w:cs="Cambria" w:eastAsia="Cambria" w:hAnsi="Cambria"/>
               </w:rPr>
-              <w:t xml:space="preserve">$1.34B</w:t>
+              <w:t xml:space="preserve">$1.35B</w:t>
             </w:r>
           </w:p>
         </w:tc>
@@ -29629,7 +29629,7 @@
           <w:szCs w:val="22"/>
           <w:rFonts w:ascii="Cambria" w:cs="Cambria" w:eastAsia="Cambria" w:hAnsi="Cambria"/>
         </w:rPr>
-        <w:t xml:space="preserve">The CPL Initiative has moved from pilot to scale, demonstrating measurable impact in student access, credit attainment, and system engagement. With 52,424 students served, 13,980 statewide credit recommendations, and 103 actively participating colleges, the initiative has surpassed most 2025–26 benchmarks ahead of schedule.</w:t>
+        <w:t xml:space="preserve">The CPL Initiative has moved from pilot to scale, demonstrating measurable impact in student access, credit attainment, and system engagement. With 52,450 students served, 14,023 statewide credit recommendations, and 103 actively participating colleges, the initiative has surpassed most 2025–26 benchmarks ahead of schedule.</w:t>
       </w:r>
     </w:p>
     <w:p>
@@ -29680,7 +29680,7 @@
           <w:szCs w:val="20"/>
           <w:rFonts w:ascii="Cambria" w:cs="Cambria" w:eastAsia="Cambria" w:hAnsi="Cambria"/>
         </w:rPr>
-        <w:t xml:space="preserve">October 5, 2026</w:t>
+        <w:t xml:space="preserve">October 6, 2026</w:t>
       </w:r>
     </w:p>
     <w:sectPr>
@@ -29717,7 +29717,7 @@
         <w:szCs w:val="14"/>
         <w:rFonts w:ascii="Cambria" w:cs="Cambria" w:eastAsia="Cambria" w:hAnsi="Cambria"/>
       </w:rPr>
-      <w:t xml:space="preserve">Generated October 5, 2026  |  California Community Colleges  |  CPL Initiative</w:t>
+      <w:t xml:space="preserve">Generated October 6, 2026  |  California Community Colleges  |  CPL Initiative</w:t>
     </w:r>
     <w:r>
       <w:rPr>

</xml_diff>

<commit_message>
Daily dashboard update — 2026-10-07
</commit_message>
<xml_diff>
--- a/reports/CPL_Master_Report.docx
+++ b/reports/CPL_Master_Report.docx
@@ -141,7 +141,7 @@
           <w:szCs w:val="22"/>
           <w:rFonts w:ascii="Cambria" w:cs="Cambria" w:eastAsia="Cambria" w:hAnsi="Cambria"/>
         </w:rPr>
-        <w:t xml:space="preserve">As of October 6, 2026, the CPL initiative is ahead of schedule, with most 2025–2026 targets met or exceeded and core infrastructure nearing completion. The work has expanded student access, increased transcripted units, and established the foundation for a permanent, statewide CPL service under Vision 2030.</w:t>
+        <w:t xml:space="preserve">As of October 7, 2026, the CPL initiative is ahead of schedule, with most 2025–2026 targets met or exceeded and core infrastructure nearing completion. The work has expanded student access, increased transcripted units, and established the foundation for a permanent, statewide CPL service under Vision 2030.</w:t>
       </w:r>
     </w:p>
     <w:p>
@@ -167,7 +167,7 @@
           <w:szCs w:val="21"/>
           <w:rFonts w:ascii="Cambria" w:cs="Cambria" w:eastAsia="Cambria" w:hAnsi="Cambria"/>
         </w:rPr>
-        <w:t xml:space="preserve">52,463 cumulative students served with CPL awards, surpassing annual targets.</w:t>
+        <w:t xml:space="preserve">52,663 cumulative students served with CPL awards, surpassing annual targets.</w:t>
       </w:r>
     </w:p>
     <w:p>
@@ -185,7 +185,7 @@
           <w:szCs w:val="21"/>
           <w:rFonts w:ascii="Cambria" w:cs="Cambria" w:eastAsia="Cambria" w:hAnsi="Cambria"/>
         </w:rPr>
-        <w:t xml:space="preserve">227k CPL units transcripted across the system.</w:t>
+        <w:t xml:space="preserve">228k CPL units transcripted across the system.</w:t>
       </w:r>
     </w:p>
     <w:p>
@@ -221,7 +221,7 @@
           <w:szCs w:val="21"/>
           <w:rFonts w:ascii="Cambria" w:cs="Cambria" w:eastAsia="Cambria" w:hAnsi="Cambria"/>
         </w:rPr>
-        <w:t xml:space="preserve">14,024 statewide credit recommendations, driven by faculty discipline workgroups spanning high-demand fields.</w:t>
+        <w:t xml:space="preserve">14,033 statewide credit recommendations, driven by faculty discipline workgroups spanning high-demand fields.</w:t>
       </w:r>
     </w:p>
     <w:p>
@@ -239,7 +239,7 @@
           <w:szCs w:val="21"/>
           <w:rFonts w:ascii="Cambria" w:cs="Cambria" w:eastAsia="Cambria" w:hAnsi="Cambria"/>
         </w:rPr>
-        <w:t xml:space="preserve">The Veteran Sprint has uploaded 58 JSTs to MAP, with estimated student savings of $341M and projected 20-year economic impact of $1.35B.</w:t>
+        <w:t xml:space="preserve">The Veteran Sprint has uploaded 58 JSTs to MAP, with estimated student savings of $343M and projected 20-year economic impact of $1.36B.</w:t>
       </w:r>
     </w:p>
     <w:p>
@@ -424,7 +424,7 @@
                 <w:szCs w:val="20"/>
                 <w:rFonts w:ascii="Cambria" w:cs="Cambria" w:eastAsia="Cambria" w:hAnsi="Cambria"/>
               </w:rPr>
-              <w:t xml:space="preserve">52,463</w:t>
+              <w:t xml:space="preserve">52,663</w:t>
             </w:r>
           </w:p>
         </w:tc>
@@ -494,7 +494,7 @@
                 <w:szCs w:val="20"/>
                 <w:rFonts w:ascii="Cambria" w:cs="Cambria" w:eastAsia="Cambria" w:hAnsi="Cambria"/>
               </w:rPr>
-              <w:t xml:space="preserve">227k</w:t>
+              <w:t xml:space="preserve">228k</w:t>
             </w:r>
           </w:p>
         </w:tc>
@@ -564,7 +564,7 @@
                 <w:szCs w:val="20"/>
                 <w:rFonts w:ascii="Cambria" w:cs="Cambria" w:eastAsia="Cambria" w:hAnsi="Cambria"/>
               </w:rPr>
-              <w:t xml:space="preserve">14,024</w:t>
+              <w:t xml:space="preserve">14,033</w:t>
             </w:r>
           </w:p>
         </w:tc>
@@ -774,7 +774,7 @@
                 <w:szCs w:val="20"/>
                 <w:rFonts w:ascii="Cambria" w:cs="Cambria" w:eastAsia="Cambria" w:hAnsi="Cambria"/>
               </w:rPr>
-              <w:t xml:space="preserve">$341M</w:t>
+              <w:t xml:space="preserve">$343M</w:t>
             </w:r>
           </w:p>
         </w:tc>
@@ -844,7 +844,7 @@
                 <w:szCs w:val="20"/>
                 <w:rFonts w:ascii="Cambria" w:cs="Cambria" w:eastAsia="Cambria" w:hAnsi="Cambria"/>
               </w:rPr>
-              <w:t xml:space="preserve">$1.35B</w:t>
+              <w:t xml:space="preserve">$1.36B</w:t>
             </w:r>
           </w:p>
         </w:tc>
@@ -29629,7 +29629,7 @@
           <w:szCs w:val="22"/>
           <w:rFonts w:ascii="Cambria" w:cs="Cambria" w:eastAsia="Cambria" w:hAnsi="Cambria"/>
         </w:rPr>
-        <w:t xml:space="preserve">The CPL Initiative has moved from pilot to scale, demonstrating measurable impact in student access, credit attainment, and system engagement. With 52,463 students served, 14,024 statewide credit recommendations, and 103 actively participating colleges, the initiative has surpassed most 2025–26 benchmarks ahead of schedule.</w:t>
+        <w:t xml:space="preserve">The CPL Initiative has moved from pilot to scale, demonstrating measurable impact in student access, credit attainment, and system engagement. With 52,663 students served, 14,033 statewide credit recommendations, and 103 actively participating colleges, the initiative has surpassed most 2025–26 benchmarks ahead of schedule.</w:t>
       </w:r>
     </w:p>
     <w:p>
@@ -29680,7 +29680,7 @@
           <w:szCs w:val="20"/>
           <w:rFonts w:ascii="Cambria" w:cs="Cambria" w:eastAsia="Cambria" w:hAnsi="Cambria"/>
         </w:rPr>
-        <w:t xml:space="preserve">October 6, 2026</w:t>
+        <w:t xml:space="preserve">October 7, 2026</w:t>
       </w:r>
     </w:p>
     <w:sectPr>
@@ -29717,7 +29717,7 @@
         <w:szCs w:val="14"/>
         <w:rFonts w:ascii="Cambria" w:cs="Cambria" w:eastAsia="Cambria" w:hAnsi="Cambria"/>
       </w:rPr>
-      <w:t xml:space="preserve">Generated October 6, 2026  |  California Community Colleges  |  CPL Initiative</w:t>
+      <w:t xml:space="preserve">Generated October 7, 2026  |  California Community Colleges  |  CPL Initiative</w:t>
     </w:r>
     <w:r>
       <w:rPr>

</xml_diff>

<commit_message>
Daily dashboard update — 2026-10-08
</commit_message>
<xml_diff>
--- a/reports/CPL_Master_Report.docx
+++ b/reports/CPL_Master_Report.docx
@@ -141,7 +141,7 @@
           <w:szCs w:val="22"/>
           <w:rFonts w:ascii="Cambria" w:cs="Cambria" w:eastAsia="Cambria" w:hAnsi="Cambria"/>
         </w:rPr>
-        <w:t xml:space="preserve">As of October 7, 2026, the CPL initiative is ahead of schedule, with most 2025–2026 targets met or exceeded and core infrastructure nearing completion. The work has expanded student access, increased transcripted units, and established the foundation for a permanent, statewide CPL service under Vision 2030.</w:t>
+        <w:t xml:space="preserve">As of October 8, 2026, the CPL initiative is ahead of schedule, with most 2025–2026 targets met or exceeded and core infrastructure nearing completion. The work has expanded student access, increased transcripted units, and established the foundation for a permanent, statewide CPL service under Vision 2030.</w:t>
       </w:r>
     </w:p>
     <w:p>
@@ -167,7 +167,7 @@
           <w:szCs w:val="21"/>
           <w:rFonts w:ascii="Cambria" w:cs="Cambria" w:eastAsia="Cambria" w:hAnsi="Cambria"/>
         </w:rPr>
-        <w:t xml:space="preserve">52,744 cumulative students served with CPL awards, surpassing annual targets.</w:t>
+        <w:t xml:space="preserve">54,700 cumulative students served with CPL awards, surpassing annual targets.</w:t>
       </w:r>
     </w:p>
     <w:p>
@@ -185,7 +185,7 @@
           <w:szCs w:val="21"/>
           <w:rFonts w:ascii="Cambria" w:cs="Cambria" w:eastAsia="Cambria" w:hAnsi="Cambria"/>
         </w:rPr>
-        <w:t xml:space="preserve">229k CPL units transcripted across the system.</w:t>
+        <w:t xml:space="preserve">238k CPL units transcripted across the system.</w:t>
       </w:r>
     </w:p>
     <w:p>
@@ -221,7 +221,7 @@
           <w:szCs w:val="21"/>
           <w:rFonts w:ascii="Cambria" w:cs="Cambria" w:eastAsia="Cambria" w:hAnsi="Cambria"/>
         </w:rPr>
-        <w:t xml:space="preserve">14,047 statewide credit recommendations, driven by faculty discipline workgroups spanning high-demand fields.</w:t>
+        <w:t xml:space="preserve">14,122 statewide credit recommendations, driven by faculty discipline workgroups spanning high-demand fields.</w:t>
       </w:r>
     </w:p>
     <w:p>
@@ -239,7 +239,7 @@
           <w:szCs w:val="21"/>
           <w:rFonts w:ascii="Cambria" w:cs="Cambria" w:eastAsia="Cambria" w:hAnsi="Cambria"/>
         </w:rPr>
-        <w:t xml:space="preserve">The Veteran Sprint has uploaded 59 JSTs to MAP, with estimated student savings of $344M and projected 20-year economic impact of $1.36B.</w:t>
+        <w:t xml:space="preserve">The Veteran Sprint has uploaded 60 JSTs to MAP, with estimated student savings of $353M and projected 20-year economic impact of $1.4B.</w:t>
       </w:r>
     </w:p>
     <w:p>
@@ -424,7 +424,7 @@
                 <w:szCs w:val="20"/>
                 <w:rFonts w:ascii="Cambria" w:cs="Cambria" w:eastAsia="Cambria" w:hAnsi="Cambria"/>
               </w:rPr>
-              <w:t xml:space="preserve">52,744</w:t>
+              <w:t xml:space="preserve">54,700</w:t>
             </w:r>
           </w:p>
         </w:tc>
@@ -494,7 +494,7 @@
                 <w:szCs w:val="20"/>
                 <w:rFonts w:ascii="Cambria" w:cs="Cambria" w:eastAsia="Cambria" w:hAnsi="Cambria"/>
               </w:rPr>
-              <w:t xml:space="preserve">229k</w:t>
+              <w:t xml:space="preserve">238k</w:t>
             </w:r>
           </w:p>
         </w:tc>
@@ -564,7 +564,7 @@
                 <w:szCs w:val="20"/>
                 <w:rFonts w:ascii="Cambria" w:cs="Cambria" w:eastAsia="Cambria" w:hAnsi="Cambria"/>
               </w:rPr>
-              <w:t xml:space="preserve">14,047</w:t>
+              <w:t xml:space="preserve">14,122</w:t>
             </w:r>
           </w:p>
         </w:tc>
@@ -704,7 +704,7 @@
                 <w:szCs w:val="20"/>
                 <w:rFonts w:ascii="Cambria" w:cs="Cambria" w:eastAsia="Cambria" w:hAnsi="Cambria"/>
               </w:rPr>
-              <w:t xml:space="preserve">59</w:t>
+              <w:t xml:space="preserve">60</w:t>
             </w:r>
           </w:p>
         </w:tc>
@@ -774,7 +774,7 @@
                 <w:szCs w:val="20"/>
                 <w:rFonts w:ascii="Cambria" w:cs="Cambria" w:eastAsia="Cambria" w:hAnsi="Cambria"/>
               </w:rPr>
-              <w:t xml:space="preserve">$344M</w:t>
+              <w:t xml:space="preserve">$353M</w:t>
             </w:r>
           </w:p>
         </w:tc>
@@ -844,7 +844,7 @@
                 <w:szCs w:val="20"/>
                 <w:rFonts w:ascii="Cambria" w:cs="Cambria" w:eastAsia="Cambria" w:hAnsi="Cambria"/>
               </w:rPr>
-              <w:t xml:space="preserve">$1.36B</w:t>
+              <w:t xml:space="preserve">$1.4B</w:t>
             </w:r>
           </w:p>
         </w:tc>
@@ -29629,7 +29629,7 @@
           <w:szCs w:val="22"/>
           <w:rFonts w:ascii="Cambria" w:cs="Cambria" w:eastAsia="Cambria" w:hAnsi="Cambria"/>
         </w:rPr>
-        <w:t xml:space="preserve">The CPL Initiative has moved from pilot to scale, demonstrating measurable impact in student access, credit attainment, and system engagement. With 52,744 students served, 14,047 statewide credit recommendations, and 103 actively participating colleges, the initiative has surpassed most 2025–26 benchmarks ahead of schedule.</w:t>
+        <w:t xml:space="preserve">The CPL Initiative has moved from pilot to scale, demonstrating measurable impact in student access, credit attainment, and system engagement. With 54,700 students served, 14,122 statewide credit recommendations, and 103 actively participating colleges, the initiative has surpassed most 2025–26 benchmarks ahead of schedule.</w:t>
       </w:r>
     </w:p>
     <w:p>
@@ -29680,7 +29680,7 @@
           <w:szCs w:val="20"/>
           <w:rFonts w:ascii="Cambria" w:cs="Cambria" w:eastAsia="Cambria" w:hAnsi="Cambria"/>
         </w:rPr>
-        <w:t xml:space="preserve">October 7, 2026</w:t>
+        <w:t xml:space="preserve">October 8, 2026</w:t>
       </w:r>
     </w:p>
     <w:sectPr>
@@ -29717,7 +29717,7 @@
         <w:szCs w:val="14"/>
         <w:rFonts w:ascii="Cambria" w:cs="Cambria" w:eastAsia="Cambria" w:hAnsi="Cambria"/>
       </w:rPr>
-      <w:t xml:space="preserve">Generated October 7, 2026  |  California Community Colleges  |  CPL Initiative</w:t>
+      <w:t xml:space="preserve">Generated October 8, 2026  |  California Community Colleges  |  CPL Initiative</w:t>
     </w:r>
     <w:r>
       <w:rPr>

</xml_diff>

<commit_message>
Daily dashboard update — 2026-10-09
</commit_message>
<xml_diff>
--- a/reports/CPL_Master_Report.docx
+++ b/reports/CPL_Master_Report.docx
@@ -141,7 +141,7 @@
           <w:szCs w:val="22"/>
           <w:rFonts w:ascii="Cambria" w:cs="Cambria" w:eastAsia="Cambria" w:hAnsi="Cambria"/>
         </w:rPr>
-        <w:t xml:space="preserve">As of October 8, 2026, the CPL initiative is ahead of schedule, with most 2025–2026 targets met or exceeded and core infrastructure nearing completion. The work has expanded student access, increased transcripted units, and established the foundation for a permanent, statewide CPL service under Vision 2030.</w:t>
+        <w:t xml:space="preserve">As of October 9, 2026, the CPL initiative is ahead of schedule, with most 2025–2026 targets met or exceeded and core infrastructure nearing completion. The work has expanded student access, increased transcripted units, and established the foundation for a permanent, statewide CPL service under Vision 2030.</w:t>
       </w:r>
     </w:p>
     <w:p>
@@ -167,7 +167,7 @@
           <w:szCs w:val="21"/>
           <w:rFonts w:ascii="Cambria" w:cs="Cambria" w:eastAsia="Cambria" w:hAnsi="Cambria"/>
         </w:rPr>
-        <w:t xml:space="preserve">54,714 cumulative students served with CPL awards, surpassing annual targets.</w:t>
+        <w:t xml:space="preserve">54,736 cumulative students served with CPL awards, surpassing annual targets.</w:t>
       </w:r>
     </w:p>
     <w:p>
@@ -221,7 +221,7 @@
           <w:szCs w:val="21"/>
           <w:rFonts w:ascii="Cambria" w:cs="Cambria" w:eastAsia="Cambria" w:hAnsi="Cambria"/>
         </w:rPr>
-        <w:t xml:space="preserve">14,136 statewide credit recommendations, driven by faculty discipline workgroups spanning high-demand fields.</w:t>
+        <w:t xml:space="preserve">14,165 statewide credit recommendations, driven by faculty discipline workgroups spanning high-demand fields.</w:t>
       </w:r>
     </w:p>
     <w:p>
@@ -424,7 +424,7 @@
                 <w:szCs w:val="20"/>
                 <w:rFonts w:ascii="Cambria" w:cs="Cambria" w:eastAsia="Cambria" w:hAnsi="Cambria"/>
               </w:rPr>
-              <w:t xml:space="preserve">54,714</w:t>
+              <w:t xml:space="preserve">54,736</w:t>
             </w:r>
           </w:p>
         </w:tc>
@@ -564,7 +564,7 @@
                 <w:szCs w:val="20"/>
                 <w:rFonts w:ascii="Cambria" w:cs="Cambria" w:eastAsia="Cambria" w:hAnsi="Cambria"/>
               </w:rPr>
-              <w:t xml:space="preserve">14,136</w:t>
+              <w:t xml:space="preserve">14,165</w:t>
             </w:r>
           </w:p>
         </w:tc>
@@ -29629,7 +29629,7 @@
           <w:szCs w:val="22"/>
           <w:rFonts w:ascii="Cambria" w:cs="Cambria" w:eastAsia="Cambria" w:hAnsi="Cambria"/>
         </w:rPr>
-        <w:t xml:space="preserve">The CPL Initiative has moved from pilot to scale, demonstrating measurable impact in student access, credit attainment, and system engagement. With 54,714 students served, 14,136 statewide credit recommendations, and 103 actively participating colleges, the initiative has surpassed most 2025–26 benchmarks ahead of schedule.</w:t>
+        <w:t xml:space="preserve">The CPL Initiative has moved from pilot to scale, demonstrating measurable impact in student access, credit attainment, and system engagement. With 54,736 students served, 14,165 statewide credit recommendations, and 103 actively participating colleges, the initiative has surpassed most 2025–26 benchmarks ahead of schedule.</w:t>
       </w:r>
     </w:p>
     <w:p>
@@ -29680,7 +29680,7 @@
           <w:szCs w:val="20"/>
           <w:rFonts w:ascii="Cambria" w:cs="Cambria" w:eastAsia="Cambria" w:hAnsi="Cambria"/>
         </w:rPr>
-        <w:t xml:space="preserve">October 8, 2026</w:t>
+        <w:t xml:space="preserve">October 9, 2026</w:t>
       </w:r>
     </w:p>
     <w:sectPr>
@@ -29717,7 +29717,7 @@
         <w:szCs w:val="14"/>
         <w:rFonts w:ascii="Cambria" w:cs="Cambria" w:eastAsia="Cambria" w:hAnsi="Cambria"/>
       </w:rPr>
-      <w:t xml:space="preserve">Generated October 8, 2026  |  California Community Colleges  |  CPL Initiative</w:t>
+      <w:t xml:space="preserve">Generated October 9, 2026  |  California Community Colleges  |  CPL Initiative</w:t>
     </w:r>
     <w:r>
       <w:rPr>

</xml_diff>

<commit_message>
Daily dashboard update — 2026-10-10
</commit_message>
<xml_diff>
--- a/reports/CPL_Master_Report.docx
+++ b/reports/CPL_Master_Report.docx
@@ -141,7 +141,7 @@
           <w:szCs w:val="22"/>
           <w:rFonts w:ascii="Cambria" w:cs="Cambria" w:eastAsia="Cambria" w:hAnsi="Cambria"/>
         </w:rPr>
-        <w:t xml:space="preserve">As of October 9, 2026, the CPL initiative is ahead of schedule, with most 2025–2026 targets met or exceeded and core infrastructure nearing completion. The work has expanded student access, increased transcripted units, and established the foundation for a permanent, statewide CPL service under Vision 2030.</w:t>
+        <w:t xml:space="preserve">As of October 10, 2026, the CPL initiative is ahead of schedule, with most 2025–2026 targets met or exceeded and core infrastructure nearing completion. The work has expanded student access, increased transcripted units, and established the foundation for a permanent, statewide CPL service under Vision 2030.</w:t>
       </w:r>
     </w:p>
     <w:p>
@@ -167,7 +167,7 @@
           <w:szCs w:val="21"/>
           <w:rFonts w:ascii="Cambria" w:cs="Cambria" w:eastAsia="Cambria" w:hAnsi="Cambria"/>
         </w:rPr>
-        <w:t xml:space="preserve">54,755 cumulative students served with CPL awards, surpassing annual targets.</w:t>
+        <w:t xml:space="preserve">54,963 cumulative students served with CPL awards, surpassing annual targets.</w:t>
       </w:r>
     </w:p>
     <w:p>
@@ -185,7 +185,7 @@
           <w:szCs w:val="21"/>
           <w:rFonts w:ascii="Cambria" w:cs="Cambria" w:eastAsia="Cambria" w:hAnsi="Cambria"/>
         </w:rPr>
-        <w:t xml:space="preserve">238k CPL units transcripted across the system.</w:t>
+        <w:t xml:space="preserve">239k CPL units transcripted across the system.</w:t>
       </w:r>
     </w:p>
     <w:p>
@@ -221,7 +221,7 @@
           <w:szCs w:val="21"/>
           <w:rFonts w:ascii="Cambria" w:cs="Cambria" w:eastAsia="Cambria" w:hAnsi="Cambria"/>
         </w:rPr>
-        <w:t xml:space="preserve">14,166 statewide credit recommendations, driven by faculty discipline workgroups spanning high-demand fields.</w:t>
+        <w:t xml:space="preserve">14,195 statewide credit recommendations, driven by faculty discipline workgroups spanning high-demand fields.</w:t>
       </w:r>
     </w:p>
     <w:p>
@@ -239,7 +239,7 @@
           <w:szCs w:val="21"/>
           <w:rFonts w:ascii="Cambria" w:cs="Cambria" w:eastAsia="Cambria" w:hAnsi="Cambria"/>
         </w:rPr>
-        <w:t xml:space="preserve">The Veteran Sprint has uploaded 60 JSTs to MAP, with estimated student savings of $353M and projected 20-year economic impact of $1.41B.</w:t>
+        <w:t xml:space="preserve">The Veteran Sprint has uploaded 60 JSTs to MAP, with estimated student savings of $354M and projected 20-year economic impact of $1.41B.</w:t>
       </w:r>
     </w:p>
     <w:p>
@@ -424,7 +424,7 @@
                 <w:szCs w:val="20"/>
                 <w:rFonts w:ascii="Cambria" w:cs="Cambria" w:eastAsia="Cambria" w:hAnsi="Cambria"/>
               </w:rPr>
-              <w:t xml:space="preserve">54,755</w:t>
+              <w:t xml:space="preserve">54,963</w:t>
             </w:r>
           </w:p>
         </w:tc>
@@ -494,7 +494,7 @@
                 <w:szCs w:val="20"/>
                 <w:rFonts w:ascii="Cambria" w:cs="Cambria" w:eastAsia="Cambria" w:hAnsi="Cambria"/>
               </w:rPr>
-              <w:t xml:space="preserve">238k</w:t>
+              <w:t xml:space="preserve">239k</w:t>
             </w:r>
           </w:p>
         </w:tc>
@@ -564,7 +564,7 @@
                 <w:szCs w:val="20"/>
                 <w:rFonts w:ascii="Cambria" w:cs="Cambria" w:eastAsia="Cambria" w:hAnsi="Cambria"/>
               </w:rPr>
-              <w:t xml:space="preserve">14,166</w:t>
+              <w:t xml:space="preserve">14,195</w:t>
             </w:r>
           </w:p>
         </w:tc>
@@ -774,7 +774,7 @@
                 <w:szCs w:val="20"/>
                 <w:rFonts w:ascii="Cambria" w:cs="Cambria" w:eastAsia="Cambria" w:hAnsi="Cambria"/>
               </w:rPr>
-              <w:t xml:space="preserve">$353M</w:t>
+              <w:t xml:space="preserve">$354M</w:t>
             </w:r>
           </w:p>
         </w:tc>
@@ -29629,7 +29629,7 @@
           <w:szCs w:val="22"/>
           <w:rFonts w:ascii="Cambria" w:cs="Cambria" w:eastAsia="Cambria" w:hAnsi="Cambria"/>
         </w:rPr>
-        <w:t xml:space="preserve">The CPL Initiative has moved from pilot to scale, demonstrating measurable impact in student access, credit attainment, and system engagement. With 54,755 students served, 14,166 statewide credit recommendations, and 103 actively participating colleges, the initiative has surpassed most 2025–26 benchmarks ahead of schedule.</w:t>
+        <w:t xml:space="preserve">The CPL Initiative has moved from pilot to scale, demonstrating measurable impact in student access, credit attainment, and system engagement. With 54,963 students served, 14,195 statewide credit recommendations, and 103 actively participating colleges, the initiative has surpassed most 2025–26 benchmarks ahead of schedule.</w:t>
       </w:r>
     </w:p>
     <w:p>
@@ -29680,7 +29680,7 @@
           <w:szCs w:val="20"/>
           <w:rFonts w:ascii="Cambria" w:cs="Cambria" w:eastAsia="Cambria" w:hAnsi="Cambria"/>
         </w:rPr>
-        <w:t xml:space="preserve">October 9, 2026</w:t>
+        <w:t xml:space="preserve">October 10, 2026</w:t>
       </w:r>
     </w:p>
     <w:sectPr>
@@ -29717,7 +29717,7 @@
         <w:szCs w:val="14"/>
         <w:rFonts w:ascii="Cambria" w:cs="Cambria" w:eastAsia="Cambria" w:hAnsi="Cambria"/>
       </w:rPr>
-      <w:t xml:space="preserve">Generated October 9, 2026  |  California Community Colleges  |  CPL Initiative</w:t>
+      <w:t xml:space="preserve">Generated October 10, 2026  |  California Community Colleges  |  CPL Initiative</w:t>
     </w:r>
     <w:r>
       <w:rPr>

</xml_diff>

<commit_message>
Daily dashboard update — 2026-10-11
</commit_message>
<xml_diff>
--- a/reports/CPL_Master_Report.docx
+++ b/reports/CPL_Master_Report.docx
@@ -141,7 +141,7 @@
           <w:szCs w:val="22"/>
           <w:rFonts w:ascii="Cambria" w:cs="Cambria" w:eastAsia="Cambria" w:hAnsi="Cambria"/>
         </w:rPr>
-        <w:t xml:space="preserve">As of October 10, 2026, the CPL initiative is ahead of schedule, with most 2025–2026 targets met or exceeded and core infrastructure nearing completion. The work has expanded student access, increased transcripted units, and established the foundation for a permanent, statewide CPL service under Vision 2030.</w:t>
+        <w:t xml:space="preserve">As of October 11, 2026, the CPL initiative is ahead of schedule, with most 2025–2026 targets met or exceeded and core infrastructure nearing completion. The work has expanded student access, increased transcripted units, and established the foundation for a permanent, statewide CPL service under Vision 2030.</w:t>
       </w:r>
     </w:p>
     <w:p>
@@ -29680,7 +29680,7 @@
           <w:szCs w:val="20"/>
           <w:rFonts w:ascii="Cambria" w:cs="Cambria" w:eastAsia="Cambria" w:hAnsi="Cambria"/>
         </w:rPr>
-        <w:t xml:space="preserve">October 10, 2026</w:t>
+        <w:t xml:space="preserve">October 11, 2026</w:t>
       </w:r>
     </w:p>
     <w:sectPr>
@@ -29717,7 +29717,7 @@
         <w:szCs w:val="14"/>
         <w:rFonts w:ascii="Cambria" w:cs="Cambria" w:eastAsia="Cambria" w:hAnsi="Cambria"/>
       </w:rPr>
-      <w:t xml:space="preserve">Generated October 10, 2026  |  California Community Colleges  |  CPL Initiative</w:t>
+      <w:t xml:space="preserve">Generated October 11, 2026  |  California Community Colleges  |  CPL Initiative</w:t>
     </w:r>
     <w:r>
       <w:rPr>

</xml_diff>

<commit_message>
Daily dashboard update — 2026-10-12
</commit_message>
<xml_diff>
--- a/reports/CPL_Master_Report.docx
+++ b/reports/CPL_Master_Report.docx
@@ -141,7 +141,7 @@
           <w:szCs w:val="22"/>
           <w:rFonts w:ascii="Cambria" w:cs="Cambria" w:eastAsia="Cambria" w:hAnsi="Cambria"/>
         </w:rPr>
-        <w:t xml:space="preserve">As of October 11, 2026, the CPL initiative is ahead of schedule, with most 2025–2026 targets met or exceeded and core infrastructure nearing completion. The work has expanded student access, increased transcripted units, and established the foundation for a permanent, statewide CPL service under Vision 2030.</w:t>
+        <w:t xml:space="preserve">As of October 12, 2026, the CPL initiative is ahead of schedule, with most 2025–2026 targets met or exceeded and core infrastructure nearing completion. The work has expanded student access, increased transcripted units, and established the foundation for a permanent, statewide CPL service under Vision 2030.</w:t>
       </w:r>
     </w:p>
     <w:p>
@@ -167,7 +167,7 @@
           <w:szCs w:val="21"/>
           <w:rFonts w:ascii="Cambria" w:cs="Cambria" w:eastAsia="Cambria" w:hAnsi="Cambria"/>
         </w:rPr>
-        <w:t xml:space="preserve">54,964 cumulative students served with CPL awards, surpassing annual targets.</w:t>
+        <w:t xml:space="preserve">55,003 cumulative students served with CPL awards, surpassing annual targets.</w:t>
       </w:r>
     </w:p>
     <w:p>
@@ -239,7 +239,7 @@
           <w:szCs w:val="21"/>
           <w:rFonts w:ascii="Cambria" w:cs="Cambria" w:eastAsia="Cambria" w:hAnsi="Cambria"/>
         </w:rPr>
-        <w:t xml:space="preserve">The Veteran Sprint has uploaded 60 JSTs to MAP, with estimated student savings of $354M and projected 20-year economic impact of $1.41B.</w:t>
+        <w:t xml:space="preserve">The Veteran Sprint has uploaded 60 JSTs to MAP, with estimated student savings of $355M and projected 20-year economic impact of $1.41B.</w:t>
       </w:r>
     </w:p>
     <w:p>
@@ -424,7 +424,7 @@
                 <w:szCs w:val="20"/>
                 <w:rFonts w:ascii="Cambria" w:cs="Cambria" w:eastAsia="Cambria" w:hAnsi="Cambria"/>
               </w:rPr>
-              <w:t xml:space="preserve">54,964</w:t>
+              <w:t xml:space="preserve">55,003</w:t>
             </w:r>
           </w:p>
         </w:tc>
@@ -774,7 +774,7 @@
                 <w:szCs w:val="20"/>
                 <w:rFonts w:ascii="Cambria" w:cs="Cambria" w:eastAsia="Cambria" w:hAnsi="Cambria"/>
               </w:rPr>
-              <w:t xml:space="preserve">$354M</w:t>
+              <w:t xml:space="preserve">$355M</w:t>
             </w:r>
           </w:p>
         </w:tc>
@@ -29629,7 +29629,7 @@
           <w:szCs w:val="22"/>
           <w:rFonts w:ascii="Cambria" w:cs="Cambria" w:eastAsia="Cambria" w:hAnsi="Cambria"/>
         </w:rPr>
-        <w:t xml:space="preserve">The CPL Initiative has moved from pilot to scale, demonstrating measurable impact in student access, credit attainment, and system engagement. With 54,964 students served, 14,195 statewide credit recommendations, and 103 actively participating colleges, the initiative has surpassed most 2025–26 benchmarks ahead of schedule.</w:t>
+        <w:t xml:space="preserve">The CPL Initiative has moved from pilot to scale, demonstrating measurable impact in student access, credit attainment, and system engagement. With 55,003 students served, 14,195 statewide credit recommendations, and 103 actively participating colleges, the initiative has surpassed most 2025–26 benchmarks ahead of schedule.</w:t>
       </w:r>
     </w:p>
     <w:p>
@@ -29680,7 +29680,7 @@
           <w:szCs w:val="20"/>
           <w:rFonts w:ascii="Cambria" w:cs="Cambria" w:eastAsia="Cambria" w:hAnsi="Cambria"/>
         </w:rPr>
-        <w:t xml:space="preserve">October 11, 2026</w:t>
+        <w:t xml:space="preserve">October 12, 2026</w:t>
       </w:r>
     </w:p>
     <w:sectPr>
@@ -29717,7 +29717,7 @@
         <w:szCs w:val="14"/>
         <w:rFonts w:ascii="Cambria" w:cs="Cambria" w:eastAsia="Cambria" w:hAnsi="Cambria"/>
       </w:rPr>
-      <w:t xml:space="preserve">Generated October 11, 2026  |  California Community Colleges  |  CPL Initiative</w:t>
+      <w:t xml:space="preserve">Generated October 12, 2026  |  California Community Colleges  |  CPL Initiative</w:t>
     </w:r>
     <w:r>
       <w:rPr>

</xml_diff>

<commit_message>
Daily dashboard update — 2026-10-13
</commit_message>
<xml_diff>
--- a/reports/CPL_Master_Report.docx
+++ b/reports/CPL_Master_Report.docx
@@ -141,7 +141,7 @@
           <w:szCs w:val="22"/>
           <w:rFonts w:ascii="Cambria" w:cs="Cambria" w:eastAsia="Cambria" w:hAnsi="Cambria"/>
         </w:rPr>
-        <w:t xml:space="preserve">As of October 12, 2026, the CPL initiative is ahead of schedule, with most 2025–2026 targets met or exceeded and core infrastructure nearing completion. The work has expanded student access, increased transcripted units, and established the foundation for a permanent, statewide CPL service under Vision 2030.</w:t>
+        <w:t xml:space="preserve">As of October 13, 2026, the CPL initiative is ahead of schedule, with most 2025–2026 targets met or exceeded and core infrastructure nearing completion. The work has expanded student access, increased transcripted units, and established the foundation for a permanent, statewide CPL service under Vision 2030.</w:t>
       </w:r>
     </w:p>
     <w:p>
@@ -167,7 +167,7 @@
           <w:szCs w:val="21"/>
           <w:rFonts w:ascii="Cambria" w:cs="Cambria" w:eastAsia="Cambria" w:hAnsi="Cambria"/>
         </w:rPr>
-        <w:t xml:space="preserve">55,017 cumulative students served with CPL awards, surpassing annual targets.</w:t>
+        <w:t xml:space="preserve">55,021 cumulative students served with CPL awards, surpassing annual targets.</w:t>
       </w:r>
     </w:p>
     <w:p>
@@ -424,7 +424,7 @@
                 <w:szCs w:val="20"/>
                 <w:rFonts w:ascii="Cambria" w:cs="Cambria" w:eastAsia="Cambria" w:hAnsi="Cambria"/>
               </w:rPr>
-              <w:t xml:space="preserve">55,017</w:t>
+              <w:t xml:space="preserve">55,021</w:t>
             </w:r>
           </w:p>
         </w:tc>
@@ -29629,7 +29629,7 @@
           <w:szCs w:val="22"/>
           <w:rFonts w:ascii="Cambria" w:cs="Cambria" w:eastAsia="Cambria" w:hAnsi="Cambria"/>
         </w:rPr>
-        <w:t xml:space="preserve">The CPL Initiative has moved from pilot to scale, demonstrating measurable impact in student access, credit attainment, and system engagement. With 55,017 students served, 14,195 statewide credit recommendations, and 103 actively participating colleges, the initiative has surpassed most 2025–26 benchmarks ahead of schedule.</w:t>
+        <w:t xml:space="preserve">The CPL Initiative has moved from pilot to scale, demonstrating measurable impact in student access, credit attainment, and system engagement. With 55,021 students served, 14,195 statewide credit recommendations, and 103 actively participating colleges, the initiative has surpassed most 2025–26 benchmarks ahead of schedule.</w:t>
       </w:r>
     </w:p>
     <w:p>
@@ -29680,7 +29680,7 @@
           <w:szCs w:val="20"/>
           <w:rFonts w:ascii="Cambria" w:cs="Cambria" w:eastAsia="Cambria" w:hAnsi="Cambria"/>
         </w:rPr>
-        <w:t xml:space="preserve">October 12, 2026</w:t>
+        <w:t xml:space="preserve">October 13, 2026</w:t>
       </w:r>
     </w:p>
     <w:sectPr>
@@ -29717,7 +29717,7 @@
         <w:szCs w:val="14"/>
         <w:rFonts w:ascii="Cambria" w:cs="Cambria" w:eastAsia="Cambria" w:hAnsi="Cambria"/>
       </w:rPr>
-      <w:t xml:space="preserve">Generated October 12, 2026  |  California Community Colleges  |  CPL Initiative</w:t>
+      <w:t xml:space="preserve">Generated October 13, 2026  |  California Community Colleges  |  CPL Initiative</w:t>
     </w:r>
     <w:r>
       <w:rPr>

</xml_diff>

<commit_message>
Daily dashboard update — 2026-10-14
</commit_message>
<xml_diff>
--- a/reports/CPL_Master_Report.docx
+++ b/reports/CPL_Master_Report.docx
@@ -141,7 +141,7 @@
           <w:szCs w:val="22"/>
           <w:rFonts w:ascii="Cambria" w:cs="Cambria" w:eastAsia="Cambria" w:hAnsi="Cambria"/>
         </w:rPr>
-        <w:t xml:space="preserve">As of October 13, 2026, the CPL initiative is ahead of schedule, with most 2025–2026 targets met or exceeded and core infrastructure nearing completion. The work has expanded student access, increased transcripted units, and established the foundation for a permanent, statewide CPL service under Vision 2030.</w:t>
+        <w:t xml:space="preserve">As of October 14, 2026, the CPL initiative is ahead of schedule, with most 2025–2026 targets met or exceeded and core infrastructure nearing completion. The work has expanded student access, increased transcripted units, and established the foundation for a permanent, statewide CPL service under Vision 2030.</w:t>
       </w:r>
     </w:p>
     <w:p>
@@ -167,7 +167,7 @@
           <w:szCs w:val="21"/>
           <w:rFonts w:ascii="Cambria" w:cs="Cambria" w:eastAsia="Cambria" w:hAnsi="Cambria"/>
         </w:rPr>
-        <w:t xml:space="preserve">55,046 cumulative students served with CPL awards, surpassing annual targets.</w:t>
+        <w:t xml:space="preserve">55,053 cumulative students served with CPL awards, surpassing annual targets.</w:t>
       </w:r>
     </w:p>
     <w:p>
@@ -221,7 +221,7 @@
           <w:szCs w:val="21"/>
           <w:rFonts w:ascii="Cambria" w:cs="Cambria" w:eastAsia="Cambria" w:hAnsi="Cambria"/>
         </w:rPr>
-        <w:t xml:space="preserve">14,281 statewide credit recommendations, driven by faculty discipline workgroups spanning high-demand fields.</w:t>
+        <w:t xml:space="preserve">14,279 statewide credit recommendations, driven by faculty discipline workgroups spanning high-demand fields.</w:t>
       </w:r>
     </w:p>
     <w:p>
@@ -424,7 +424,7 @@
                 <w:szCs w:val="20"/>
                 <w:rFonts w:ascii="Cambria" w:cs="Cambria" w:eastAsia="Cambria" w:hAnsi="Cambria"/>
               </w:rPr>
-              <w:t xml:space="preserve">55,046</w:t>
+              <w:t xml:space="preserve">55,053</w:t>
             </w:r>
           </w:p>
         </w:tc>
@@ -564,7 +564,7 @@
                 <w:szCs w:val="20"/>
                 <w:rFonts w:ascii="Cambria" w:cs="Cambria" w:eastAsia="Cambria" w:hAnsi="Cambria"/>
               </w:rPr>
-              <w:t xml:space="preserve">14,281</w:t>
+              <w:t xml:space="preserve">14,279</w:t>
             </w:r>
           </w:p>
         </w:tc>
@@ -31229,7 +31229,7 @@
           <w:szCs w:val="22"/>
           <w:rFonts w:ascii="Cambria" w:cs="Cambria" w:eastAsia="Cambria" w:hAnsi="Cambria"/>
         </w:rPr>
-        <w:t xml:space="preserve">The CPL Initiative has moved from pilot to scale, demonstrating measurable impact in student access, credit attainment, and system engagement. With 55,046 students served, 14,281 statewide credit recommendations, and 103 actively participating colleges, the initiative has surpassed most 2025–26 benchmarks ahead of schedule.</w:t>
+        <w:t xml:space="preserve">The CPL Initiative has moved from pilot to scale, demonstrating measurable impact in student access, credit attainment, and system engagement. With 55,053 students served, 14,279 statewide credit recommendations, and 103 actively participating colleges, the initiative has surpassed most 2025–26 benchmarks ahead of schedule.</w:t>
       </w:r>
     </w:p>
     <w:p>
@@ -31280,7 +31280,7 @@
           <w:szCs w:val="20"/>
           <w:rFonts w:ascii="Cambria" w:cs="Cambria" w:eastAsia="Cambria" w:hAnsi="Cambria"/>
         </w:rPr>
-        <w:t xml:space="preserve">October 13, 2026</w:t>
+        <w:t xml:space="preserve">October 14, 2026</w:t>
       </w:r>
     </w:p>
     <w:sectPr>
@@ -31317,7 +31317,7 @@
         <w:szCs w:val="14"/>
         <w:rFonts w:ascii="Cambria" w:cs="Cambria" w:eastAsia="Cambria" w:hAnsi="Cambria"/>
       </w:rPr>
-      <w:t xml:space="preserve">Generated October 13, 2026  |  California Community Colleges  |  CPL Initiative</w:t>
+      <w:t xml:space="preserve">Generated October 14, 2026  |  California Community Colleges  |  CPL Initiative</w:t>
     </w:r>
     <w:r>
       <w:rPr>

</xml_diff>

<commit_message>
Daily dashboard update — 2026-10-15
</commit_message>
<xml_diff>
--- a/reports/CPL_Master_Report.docx
+++ b/reports/CPL_Master_Report.docx
@@ -167,7 +167,7 @@
           <w:szCs w:val="21"/>
           <w:rFonts w:ascii="Cambria" w:cs="Cambria" w:eastAsia="Cambria" w:hAnsi="Cambria"/>
         </w:rPr>
-        <w:t xml:space="preserve">55,128 cumulative students served with CPL awards, surpassing annual targets.</w:t>
+        <w:t xml:space="preserve">55,133 cumulative students served with CPL awards, surpassing annual targets.</w:t>
       </w:r>
     </w:p>
     <w:p>
@@ -221,7 +221,7 @@
           <w:szCs w:val="21"/>
           <w:rFonts w:ascii="Cambria" w:cs="Cambria" w:eastAsia="Cambria" w:hAnsi="Cambria"/>
         </w:rPr>
-        <w:t xml:space="preserve">14,312 statewide credit recommendations, driven by faculty discipline workgroups spanning high-demand fields.</w:t>
+        <w:t xml:space="preserve">14,356 statewide credit recommendations, driven by faculty discipline workgroups spanning high-demand fields.</w:t>
       </w:r>
     </w:p>
     <w:p>
@@ -424,7 +424,7 @@
                 <w:szCs w:val="20"/>
                 <w:rFonts w:ascii="Cambria" w:cs="Cambria" w:eastAsia="Cambria" w:hAnsi="Cambria"/>
               </w:rPr>
-              <w:t xml:space="preserve">55,128</w:t>
+              <w:t xml:space="preserve">55,133</w:t>
             </w:r>
           </w:p>
         </w:tc>
@@ -564,7 +564,7 @@
                 <w:szCs w:val="20"/>
                 <w:rFonts w:ascii="Cambria" w:cs="Cambria" w:eastAsia="Cambria" w:hAnsi="Cambria"/>
               </w:rPr>
-              <w:t xml:space="preserve">14,312</w:t>
+              <w:t xml:space="preserve">14,356</w:t>
             </w:r>
           </w:p>
         </w:tc>
@@ -11638,7 +11638,8 @@
                 <w:szCs w:val="20"/>
                 <w:rFonts w:ascii="Cambria" w:cs="Cambria" w:eastAsia="Cambria" w:hAnsi="Cambria"/>
               </w:rPr>
-              <w:t xml:space="preserve">More than 100,000 CPL units have been transcripted statewide, exceeding the 2025–26 cumulative target. Growth is driven by expanded institutional participation, improved transcription practices, statewide technical assistance, faculty and counselor training, and implementation support through the MAP Initiative. Progress continues toward the 2030 goal of 750,000 transcripted CPL units.</w:t>
+              <w:t xml:space="preserve">As of October 15, 2026, the statewide CPL Dashboard reports 83,917 transcribed CPL units and 239,997 eligible units across 55,133 students served. Current transcription represents 43% of the 2026–27 cumulative goal of 195,000 units and approximately 22% of the stretch target of 390,000 units.
+Statewide efforts continue to focus on increasing CPL transcription through expanded college participation, improved institutional processes, faculty and counselor training, and MAP implementation support. With approximately 156,080 eligible units not yet transcribed, continued emphasis is being placed on helping colleges move students from CPL eligibility to awarded and transcribed credit.</w:t>
             </w:r>
           </w:p>
           <w:p>
@@ -20836,7 +20837,7 @@
                 <w:szCs w:val="20"/>
                 <w:rFonts w:ascii="Cambria" w:cs="Cambria" w:eastAsia="Cambria" w:hAnsi="Cambria"/>
               </w:rPr>
-              <w:t xml:space="preserve">25 trainings delivered incl. 6th Annual CPL Summit and 4 Regional Trainings; 1,000+ staff/faculty/admins trained</w:t>
+              <w:t xml:space="preserve">Continued expansion of statewide CPL technical assistance and professional development, with trainings delivered weekly to support college implementation. Most recently, the CPL Counselor and Coordinator Training reached over 300 attendees, and six additional colleges are scheduled for department-wide counseling professional development sessions. Ongoing efforts include statewide webinars, regional workshops, college-specific trainings, office hours, and individualized technical assistance. Training delivery continues to exceed previously reported totals, with updated participation and training counts being compiled.</w:t>
             </w:r>
           </w:p>
           <w:p>
@@ -21524,7 +21525,7 @@
                 <w:szCs w:val="20"/>
                 <w:rFonts w:ascii="Cambria" w:cs="Cambria" w:eastAsia="Cambria" w:hAnsi="Cambria"/>
               </w:rPr>
-              <w:t xml:space="preserve">Continued coordination with CCCF/Success Center on the CPL VRC module revision project, with two core modules (CPL 101/Introductory Module and CPL Leads/Coordinators) finalized and handed off to the Vision Resource Center. Several audience-specific modules (faculty, counseling, articulation, classified professionals, curriculum, apprenticeship, veterans, administrators, and MAP platform training) are progressing through review, with current work focused on incorporating reviewer feedback, coordinating subject matter expert input, and advancing remaining modules through group and secondary review toward finalization.</w:t>
+              <w:t xml:space="preserve">Continued progress on CPL Vision Resource Center module revision: 10 of 14 modules (71%) are finalized, with 8 submitted to VRC, 2 awaiting handoff, and 4 in development or review. Current focus is on completing remaining reviews, incorporating subject matter expert feedback, and submitting outstanding modules.</w:t>
             </w:r>
           </w:p>
           <w:p>
@@ -29676,7 +29677,7 @@
           <w:szCs w:val="22"/>
           <w:rFonts w:ascii="Cambria" w:cs="Cambria" w:eastAsia="Cambria" w:hAnsi="Cambria"/>
         </w:rPr>
-        <w:t xml:space="preserve">The CPL Initiative has moved from pilot to scale, demonstrating measurable impact in student access, credit attainment, and system engagement. With 55,128 students served, 14,312 statewide credit recommendations, and 103 actively participating colleges, the initiative has surpassed most 2025–26 benchmarks ahead of schedule.</w:t>
+        <w:t xml:space="preserve">The CPL Initiative has moved from pilot to scale, demonstrating measurable impact in student access, credit attainment, and system engagement. With 55,133 students served, 14,356 statewide credit recommendations, and 103 actively participating colleges, the initiative has surpassed most 2025–26 benchmarks ahead of schedule.</w:t>
       </w:r>
     </w:p>
     <w:p>

</xml_diff>

<commit_message>
Daily dashboard update — 2026-10-16
</commit_message>
<xml_diff>
--- a/reports/CPL_Master_Report.docx
+++ b/reports/CPL_Master_Report.docx
@@ -141,7 +141,7 @@
           <w:szCs w:val="22"/>
           <w:rFonts w:ascii="Cambria" w:cs="Cambria" w:eastAsia="Cambria" w:hAnsi="Cambria"/>
         </w:rPr>
-        <w:t xml:space="preserve">As of October 15, 2026, the CPL initiative is ahead of schedule, with most 2025–2026 targets met or exceeded and core infrastructure nearing completion. The work has expanded student access, increased transcripted units, and established the foundation for a permanent, statewide CPL service under Vision 2030.</w:t>
+        <w:t xml:space="preserve">As of October 16, 2026, the CPL initiative is ahead of schedule, with most 2025–2026 targets met or exceeded and core infrastructure nearing completion. The work has expanded student access, increased transcripted units, and established the foundation for a permanent, statewide CPL service under Vision 2030.</w:t>
       </w:r>
     </w:p>
     <w:p>
@@ -167,7 +167,7 @@
           <w:szCs w:val="21"/>
           <w:rFonts w:ascii="Cambria" w:cs="Cambria" w:eastAsia="Cambria" w:hAnsi="Cambria"/>
         </w:rPr>
-        <w:t xml:space="preserve">55,133 cumulative students served with CPL awards, surpassing annual targets.</w:t>
+        <w:t xml:space="preserve">57,395 cumulative students served with CPL awards, surpassing annual targets.</w:t>
       </w:r>
     </w:p>
     <w:p>
@@ -185,7 +185,7 @@
           <w:szCs w:val="21"/>
           <w:rFonts w:ascii="Cambria" w:cs="Cambria" w:eastAsia="Cambria" w:hAnsi="Cambria"/>
         </w:rPr>
-        <w:t xml:space="preserve">240k CPL units transcripted across the system.</w:t>
+        <w:t xml:space="preserve">276k CPL units transcripted across the system.</w:t>
       </w:r>
     </w:p>
     <w:p>
@@ -221,7 +221,7 @@
           <w:szCs w:val="21"/>
           <w:rFonts w:ascii="Cambria" w:cs="Cambria" w:eastAsia="Cambria" w:hAnsi="Cambria"/>
         </w:rPr>
-        <w:t xml:space="preserve">14,356 statewide credit recommendations, driven by faculty discipline workgroups spanning high-demand fields.</w:t>
+        <w:t xml:space="preserve">14,361 statewide credit recommendations, driven by faculty discipline workgroups spanning high-demand fields.</w:t>
       </w:r>
     </w:p>
     <w:p>
@@ -239,7 +239,7 @@
           <w:szCs w:val="21"/>
           <w:rFonts w:ascii="Cambria" w:cs="Cambria" w:eastAsia="Cambria" w:hAnsi="Cambria"/>
         </w:rPr>
-        <w:t xml:space="preserve">The Veteran Sprint has uploaded 61 JSTs to MAP, with estimated student savings of $356M and projected 20-year economic impact of $1.42B.</w:t>
+        <w:t xml:space="preserve">The Veteran Sprint has uploaded 62 JSTs to MAP, with estimated student savings of $391M and projected 20-year economic impact of $1.59B.</w:t>
       </w:r>
     </w:p>
     <w:p>
@@ -424,7 +424,7 @@
                 <w:szCs w:val="20"/>
                 <w:rFonts w:ascii="Cambria" w:cs="Cambria" w:eastAsia="Cambria" w:hAnsi="Cambria"/>
               </w:rPr>
-              <w:t xml:space="preserve">55,133</w:t>
+              <w:t xml:space="preserve">57,395</w:t>
             </w:r>
           </w:p>
         </w:tc>
@@ -494,7 +494,7 @@
                 <w:szCs w:val="20"/>
                 <w:rFonts w:ascii="Cambria" w:cs="Cambria" w:eastAsia="Cambria" w:hAnsi="Cambria"/>
               </w:rPr>
-              <w:t xml:space="preserve">240k</w:t>
+              <w:t xml:space="preserve">276k</w:t>
             </w:r>
           </w:p>
         </w:tc>
@@ -564,7 +564,7 @@
                 <w:szCs w:val="20"/>
                 <w:rFonts w:ascii="Cambria" w:cs="Cambria" w:eastAsia="Cambria" w:hAnsi="Cambria"/>
               </w:rPr>
-              <w:t xml:space="preserve">14,356</w:t>
+              <w:t xml:space="preserve">14,361</w:t>
             </w:r>
           </w:p>
         </w:tc>
@@ -704,7 +704,7 @@
                 <w:szCs w:val="20"/>
                 <w:rFonts w:ascii="Cambria" w:cs="Cambria" w:eastAsia="Cambria" w:hAnsi="Cambria"/>
               </w:rPr>
-              <w:t xml:space="preserve">61</w:t>
+              <w:t xml:space="preserve">62</w:t>
             </w:r>
           </w:p>
         </w:tc>
@@ -774,7 +774,7 @@
                 <w:szCs w:val="20"/>
                 <w:rFonts w:ascii="Cambria" w:cs="Cambria" w:eastAsia="Cambria" w:hAnsi="Cambria"/>
               </w:rPr>
-              <w:t xml:space="preserve">$356M</w:t>
+              <w:t xml:space="preserve">$391M</w:t>
             </w:r>
           </w:p>
         </w:tc>
@@ -844,7 +844,7 @@
                 <w:szCs w:val="20"/>
                 <w:rFonts w:ascii="Cambria" w:cs="Cambria" w:eastAsia="Cambria" w:hAnsi="Cambria"/>
               </w:rPr>
-              <w:t xml:space="preserve">$1.42B</w:t>
+              <w:t xml:space="preserve">$1.59B</w:t>
             </w:r>
           </w:p>
         </w:tc>
@@ -1534,8 +1534,7 @@
                 <w:szCs w:val="20"/>
                 <w:rFonts w:ascii="Cambria" w:cs="Cambria" w:eastAsia="Cambria" w:hAnsi="Cambria"/>
               </w:rPr>
-              <w:t xml:space="preserve">Continued MAP development across Student Portal, JST processing, credential/evidence matching, dashboards, notifications, articulation workflows, landing pages, and accessibility/security. Major progress included Student Portal intake/review improvements, JST parsing and matching logic, CPL dashboard and landing page accessibility fixes, Quick Adopt/MCCR improvements, email notification fixes, exhibit/articulation workflow refinements, and 2FA/password reset work.
-DevOps export shows 500+ items created during the period, with 300+ verified and additional items advanced through UAT, release, or prod testing. Overall, the “50+ tickets completed” statement is accurate and likely conservative.</w:t>
+              <w:t xml:space="preserve">Since June, MAP has delivered improvements across the Student Portal, intake and matching, dashboards, notifications, accessibility, security, bulk data processing, and articulation workflows, including a recent Student Portal release addressing approximately 30 tickets. The Exhibit Module is undergoing intensive QA and remediation for email routing and new-data-model regressions before production release.</w:t>
             </w:r>
           </w:p>
           <w:p>
@@ -2224,7 +2223,7 @@
                 <w:szCs w:val="20"/>
                 <w:rFonts w:ascii="Cambria" w:cs="Cambria" w:eastAsia="Cambria" w:hAnsi="Cambria"/>
               </w:rPr>
-              <w:t xml:space="preserve">The CPL/AI project advanced significantly, with the industry certifications identified and catalogued, a working course-to-certification mapping algorithm developed in partnership with EQS, and mapping logic reviewed through Academic Senate channels to support faculty trust and statewide adoption. Current work is focused on refining the model, preserving the validated academic logic, strengthening the certification and course data infrastructure, and planning for long-term sustainability and future integration with MAP’s broader CPL ecosystem.</w:t>
+              <w:t xml:space="preserve">The pilot generated approximately 33,000 proposed credit recommendations across 115 industry certifications, extending Phase 1 work. A 90-day transition of code, database, algorithm, and documentation from EQS to the Foundation/MAP team is underway, with priorities focused on reproducing, securing, and documenting the system before MAP integration and faculty validation.</w:t>
             </w:r>
           </w:p>
           <w:p>
@@ -2912,7 +2911,7 @@
                 <w:szCs w:val="20"/>
                 <w:rFonts w:ascii="Cambria" w:cs="Cambria" w:eastAsia="Cambria" w:hAnsi="Cambria"/>
               </w:rPr>
-              <w:t xml:space="preserve">MAP's collaboration with WestEd has completed Phase 1, which included a multi-state landscape scan, job posting analysis, stakeholder engagement, and a report addressing trusted credential data, evaluation burden, practice consistency, and equity-centered access. The next phase is shifting toward Credential Registry planning, Career Passport alignment, workforce and training data integration, and exploration of AI-assisted competency-to-course alignment, with coordination across WestEd, Career Passport, CDE, and other statewide partners to support shared infrastructure for credential transparency and CPL.</w:t>
+              <w:t xml:space="preserve">Phase 1 is complete, and follow-on work has advanced into Credential Registry technical design, governance, user-centered design, and workforce and apprenticeship data integration. Contracting and coordination are progressing among WestEd, the Chancellor's Office, Labor Agency, Credential Engine, Career Passport, and MAP, with current focus on clarifying roles, data requirements, governance, and initial registry experience.</w:t>
             </w:r>
           </w:p>
           <w:p>
@@ -3600,7 +3599,7 @@
                 <w:szCs w:val="20"/>
                 <w:rFonts w:ascii="Cambria" w:cs="Cambria" w:eastAsia="Cambria" w:hAnsi="Cambria"/>
               </w:rPr>
-              <w:t xml:space="preserve">MAP continued advancing statewide interoperability and infrastructure work to support CPL, pathways, credential transparency, and student mobility across connected systems. Credential Engine integration has been established, with competency-level CTDL alignment and Credential Registry planning underway. Phase 1 Program Pathways Mapper integration is complete, CVC integration is underway, and Career Passport integration is planned as part of broader alignment with student-facing credential and achievement records. MAP also began or continued strategic conversations with LWDA, eTranscript, CCCApply, and the Common Cloud Data Platform to ensure CPL data can be tracked, processed, reported, and shared more seamlessly across the statewide technology ecosystem.</w:t>
+              <w:t xml:space="preserve">System Integration &amp; Interoperability work continues across multiple fronts: MAP-to-CTDL mapping has advanced from planning to detailed schema and sample publishing; Program Pathways Mapper Phase 1 is complete; integration efforts are ongoing with Credential Engine, ACE, Career Passport, CVC, COCI, SIS vendors, and other statewide systems; and a project with N2N demonstrated MAP's API integration capabilities with third-party systems. Local API implementation conversations have begun with Chaffey College IT, with the API complete and functional but not yet in production use.</w:t>
             </w:r>
           </w:p>
           <w:p>
@@ -4288,7 +4287,7 @@
                 <w:szCs w:val="20"/>
                 <w:rFonts w:ascii="Cambria" w:cs="Cambria" w:eastAsia="Cambria" w:hAnsi="Cambria"/>
               </w:rPr>
-              <w:t xml:space="preserve">MAP made major progress on the Student Portal, creating a more centralized and student-friendly pathway for CPL discovery and review. The portal helps students understand what CPL is, build a single CPL profile, upload documents once, see personalized CPL opportunities across colleges, and initiate review through MAP-connected intake workflows. This represents a major expansion of MAP’s student-facing capacity and supports a more seamless experience from awareness to action.</w:t>
+              <w:t xml:space="preserve">The Student Portal is live and recently received a major release of roughly 30 enhancements, including improved college location mapping, a simpler CPL profile builder, accessibility updates, and petition language revised to align with the Landing Page. Upcoming improvements will display the colleges that match a student’s CPL profile while also giving students an easy way to contact any college, whether or not a match was found. A new user-supplied credential tagging feature will further improve match accuracy. Near-term priorities remain production verification and usage measurement. We have also released custom Student Portal Quick Start guides for Veterans and Workforce Board clients.</w:t>
             </w:r>
           </w:p>
           <w:p>
@@ -4976,7 +4975,7 @@
                 <w:szCs w:val="20"/>
                 <w:rFonts w:ascii="Cambria" w:cs="Cambria" w:eastAsia="Cambria" w:hAnsi="Cambria"/>
               </w:rPr>
-              <w:t xml:space="preserve">MAP participated in a multi-stakeholder planning session with the Chancellor's Office, LWDA, WestEd, Cradle to Career, and Career Passport to align on the California Credential Registry vision and approach. The group clarified that the Credential Registry will serve as statewide infrastructure for comprehensive credential information, while Career Passport will function as the learner- and employer-facing application, with LWDA leading initial development in coordination with MAP. Next steps include developing shared technical requirements, aligning registry features across related tools, and establishing a governance structure.</w:t>
+              <w:t xml:space="preserve">California Credential Registry planning has advanced across three coordinated tracks: technical infrastructure, statewide governance, and user-centered design. COCI data has been received and CTDL-aligned sample publishing is underway, while stakeholders are defining authoritative publishing responsibilities and a phased implementation approach.</w:t>
             </w:r>
           </w:p>
           <w:p>
@@ -7941,7 +7940,7 @@
                 <w:szCs w:val="20"/>
                 <w:rFonts w:ascii="Cambria" w:cs="Cambria" w:eastAsia="Cambria" w:hAnsi="Cambria"/>
               </w:rPr>
-              <w:t xml:space="preserve">The new MAP exhibit module with Credential Engine competency search and tagging is built and pending release, with WestEd scanning credentials and skills statewide and conversations underway with CBEN, ACE, and others to identify skill frameworks. MAP is participating in the CPL/AI project to generate proposed CPL alignments and extract skills, with the plan that CTDL competencies pulled in during course-to-credential alignment will be designated as faculty-validated skills upon CPL approval.</w:t>
+              <w:t xml:space="preserve">The MAP Exhibit Module’s Credential Engine competency-search and tagging functionality has been built and is being tested. MAP-to-CTDL mapping and AI-assisted skill extraction are also advancing, with faculty approval remaining the point at which competencies become validated skills. The reported count remains at zero until the module is released and the faculty-validation workflow produces approved results. Other possible avenues for collecting and documenting validated skills are being explored as well including Career Passport, Credential Engine, Vametric, and others, though no sustainable source of validated skills has been found at this time. The infrastructure is there though when these are found.</w:t>
             </w:r>
           </w:p>
           <w:p>
@@ -13026,7 +13025,7 @@
                 <w:szCs w:val="20"/>
                 <w:rFonts w:ascii="Cambria" w:cs="Cambria" w:eastAsia="Cambria" w:hAnsi="Cambria"/>
               </w:rPr>
-              <w:t xml:space="preserve">Work continued on student impact measurement and student storytelling. The Student Impact Rate Survey has not yet launched, but the required infrastructure is being completed through the Student Portal, which will create a more reliable way to identify students, capture CPL activity, and support future survey distribution and response tracking. In parallel, student story collection has begun through coordination with college contacts in the field and the launch of a new MAP student stories webpage. These efforts will help MAP document both quantitative outcomes and student-centered narratives that demonstrate the value of CPL.</w:t>
+              <w:t xml:space="preserve">The formal Student Impact Rate Survey has not yet launched. However, the Student Portal infrastructure needed to identify participants, capture CPL activity, and support future survey distribution has advanced significantly. Parallel student-story collection has exceeded its initial goal, but the survey instrument, automated triggers, and reporting workflow still need to be designed and deployed. With the student portal now live, this work can begin.</w:t>
             </w:r>
           </w:p>
           <w:p>
@@ -13714,7 +13713,7 @@
                 <w:szCs w:val="20"/>
                 <w:rFonts w:ascii="Cambria" w:cs="Cambria" w:eastAsia="Cambria" w:hAnsi="Cambria"/>
               </w:rPr>
-              <w:t xml:space="preserve">Work continued on student impact measurement and student storytelling. The Student Impact Rate Survey has not yet launched, but the required infrastructure is being completed through the Student Portal, which will create a more reliable way to identify students, capture CPL activity, and support future survey distribution and response tracking. In parallel, student story collection has begun through coordination with college contacts in the field and the launch of a new MAP student stories webpage. These efforts will help MAP document both quantitative outcomes and student-centered narratives that demonstrate the value of CPL.</w:t>
+              <w:t xml:space="preserve">We are up to 50 student success stories, collected from various statewide and role-based groups.</w:t>
             </w:r>
           </w:p>
           <w:p>
@@ -15746,7 +15745,7 @@
                 <w:szCs w:val="20"/>
                 <w:rFonts w:ascii="Cambria" w:cs="Cambria" w:eastAsia="Cambria" w:hAnsi="Cambria"/>
               </w:rPr>
-              <w:t xml:space="preserve">Initial work began on MIS data reconciliation to better compare college-reported CPL activity with MAP-tracked outcomes, identify gaps or inconsistencies, and improve statewide CPL reporting accuracy over time.</w:t>
+              <w:t xml:space="preserve">Work has progressed from scoping into active reconciliation tasks including source tracking, student-status rules, bulk-upload validation, veteran/active-duty classifications, and college-level outlier review, with current priority on validating MAP and MIS figures before recognition or funding reporting. A significant slow-down in CO data sharing has decreased velocity, prompting MAP to initiate college workgroups discussing transcription and MIS reporting best practices. Procedures and supporting tools are delayed due to the data sharing, though best practices and effort on the college side still slated for completion by end of 2026.</w:t>
             </w:r>
           </w:p>
           <w:p>
@@ -19439,7 +19438,7 @@
                 <w:szCs w:val="20"/>
                 <w:rFonts w:ascii="Cambria" w:cs="Cambria" w:eastAsia="Cambria" w:hAnsi="Cambria"/>
               </w:rPr>
-              <w:t xml:space="preserve">The N2N apprenticeship project made meaningful progress toward scalable apprenticeship CPL infrastructure. Work advanced on data-sharing pathways, Santiago Canyon-to-N2N-to-MAP integration, API-based MAP intake, and structured cohort data collection for large apprenticeship populations. The project is also testing skill- and competency-based alignment between apprenticeship training and college coursework, with faculty validation remaining central to the model. This work supports future apprenticeship CPL mapping, student outreach, and statewide reporting.</w:t>
+              <w:t xml:space="preserve">The N2N/Prism pilot has expanded from Santiago Canyon to American River College and additional statewide use cases, achieving 93–95% course-mapping accuracy with human review, petition generation, and approved CPL data push to MAP. PeopleSoft integration is planned for American River, and MAP is evaluating complementary competency-reconstruction tools for apprenticeship-to-course comparison while prioritizing reliable implementation at initial colleges.</w:t>
             </w:r>
           </w:p>
           <w:p>
@@ -29677,7 +29676,7 @@
           <w:szCs w:val="22"/>
           <w:rFonts w:ascii="Cambria" w:cs="Cambria" w:eastAsia="Cambria" w:hAnsi="Cambria"/>
         </w:rPr>
-        <w:t xml:space="preserve">The CPL Initiative has moved from pilot to scale, demonstrating measurable impact in student access, credit attainment, and system engagement. With 55,133 students served, 14,356 statewide credit recommendations, and 103 actively participating colleges, the initiative has surpassed most 2025–26 benchmarks ahead of schedule.</w:t>
+        <w:t xml:space="preserve">The CPL Initiative has moved from pilot to scale, demonstrating measurable impact in student access, credit attainment, and system engagement. With 57,395 students served, 14,361 statewide credit recommendations, and 103 actively participating colleges, the initiative has surpassed most 2025–26 benchmarks ahead of schedule.</w:t>
       </w:r>
     </w:p>
     <w:p>
@@ -29728,7 +29727,7 @@
           <w:szCs w:val="20"/>
           <w:rFonts w:ascii="Cambria" w:cs="Cambria" w:eastAsia="Cambria" w:hAnsi="Cambria"/>
         </w:rPr>
-        <w:t xml:space="preserve">October 15, 2026</w:t>
+        <w:t xml:space="preserve">October 16, 2026</w:t>
       </w:r>
     </w:p>
     <w:sectPr>
@@ -29765,7 +29764,7 @@
         <w:szCs w:val="14"/>
         <w:rFonts w:ascii="Cambria" w:cs="Cambria" w:eastAsia="Cambria" w:hAnsi="Cambria"/>
       </w:rPr>
-      <w:t xml:space="preserve">Generated October 15, 2026  |  California Community Colleges  |  CPL Initiative</w:t>
+      <w:t xml:space="preserve">Generated October 16, 2026  |  California Community Colleges  |  CPL Initiative</w:t>
     </w:r>
     <w:r>
       <w:rPr>

</xml_diff>

<commit_message>
Daily dashboard update — 2026-10-17
</commit_message>
<xml_diff>
--- a/reports/CPL_Master_Report.docx
+++ b/reports/CPL_Master_Report.docx
@@ -141,7 +141,7 @@
           <w:szCs w:val="22"/>
           <w:rFonts w:ascii="Cambria" w:cs="Cambria" w:eastAsia="Cambria" w:hAnsi="Cambria"/>
         </w:rPr>
-        <w:t xml:space="preserve">As of October 16, 2026, the CPL initiative is ahead of schedule, with most 2025–2026 targets met or exceeded and core infrastructure nearing completion. The work has expanded student access, increased transcripted units, and established the foundation for a permanent, statewide CPL service under Vision 2030.</w:t>
+        <w:t xml:space="preserve">As of October 17, 2026, the CPL initiative is ahead of schedule, with most 2025–2026 targets met or exceeded and core infrastructure nearing completion. The work has expanded student access, increased transcripted units, and established the foundation for a permanent, statewide CPL service under Vision 2030.</w:t>
       </w:r>
     </w:p>
     <w:p>
@@ -167,7 +167,7 @@
           <w:szCs w:val="21"/>
           <w:rFonts w:ascii="Cambria" w:cs="Cambria" w:eastAsia="Cambria" w:hAnsi="Cambria"/>
         </w:rPr>
-        <w:t xml:space="preserve">57,399 cumulative students served with CPL awards, surpassing annual targets.</w:t>
+        <w:t xml:space="preserve">57,414 cumulative students served with CPL awards, surpassing annual targets.</w:t>
       </w:r>
     </w:p>
     <w:p>
@@ -221,7 +221,7 @@
           <w:szCs w:val="21"/>
           <w:rFonts w:ascii="Cambria" w:cs="Cambria" w:eastAsia="Cambria" w:hAnsi="Cambria"/>
         </w:rPr>
-        <w:t xml:space="preserve">14,361 statewide credit recommendations, driven by faculty discipline workgroups spanning high-demand fields.</w:t>
+        <w:t xml:space="preserve">14,494 statewide credit recommendations, driven by faculty discipline workgroups spanning high-demand fields.</w:t>
       </w:r>
     </w:p>
     <w:p>
@@ -424,7 +424,7 @@
                 <w:szCs w:val="20"/>
                 <w:rFonts w:ascii="Cambria" w:cs="Cambria" w:eastAsia="Cambria" w:hAnsi="Cambria"/>
               </w:rPr>
-              <w:t xml:space="preserve">57,399</w:t>
+              <w:t xml:space="preserve">57,414</w:t>
             </w:r>
           </w:p>
         </w:tc>
@@ -564,7 +564,7 @@
                 <w:szCs w:val="20"/>
                 <w:rFonts w:ascii="Cambria" w:cs="Cambria" w:eastAsia="Cambria" w:hAnsi="Cambria"/>
               </w:rPr>
-              <w:t xml:space="preserve">14,361</w:t>
+              <w:t xml:space="preserve">14,494</w:t>
             </w:r>
           </w:p>
         </w:tc>
@@ -29676,7 +29676,7 @@
           <w:szCs w:val="22"/>
           <w:rFonts w:ascii="Cambria" w:cs="Cambria" w:eastAsia="Cambria" w:hAnsi="Cambria"/>
         </w:rPr>
-        <w:t xml:space="preserve">The CPL Initiative has moved from pilot to scale, demonstrating measurable impact in student access, credit attainment, and system engagement. With 57,399 students served, 14,361 statewide credit recommendations, and 103 actively participating colleges, the initiative has surpassed most 2025–26 benchmarks ahead of schedule.</w:t>
+        <w:t xml:space="preserve">The CPL Initiative has moved from pilot to scale, demonstrating measurable impact in student access, credit attainment, and system engagement. With 57,414 students served, 14,494 statewide credit recommendations, and 103 actively participating colleges, the initiative has surpassed most 2025–26 benchmarks ahead of schedule.</w:t>
       </w:r>
     </w:p>
     <w:p>
@@ -29727,7 +29727,7 @@
           <w:szCs w:val="20"/>
           <w:rFonts w:ascii="Cambria" w:cs="Cambria" w:eastAsia="Cambria" w:hAnsi="Cambria"/>
         </w:rPr>
-        <w:t xml:space="preserve">October 16, 2026</w:t>
+        <w:t xml:space="preserve">October 17, 2026</w:t>
       </w:r>
     </w:p>
     <w:sectPr>
@@ -29764,7 +29764,7 @@
         <w:szCs w:val="14"/>
         <w:rFonts w:ascii="Cambria" w:cs="Cambria" w:eastAsia="Cambria" w:hAnsi="Cambria"/>
       </w:rPr>
-      <w:t xml:space="preserve">Generated October 16, 2026  |  California Community Colleges  |  CPL Initiative</w:t>
+      <w:t xml:space="preserve">Generated October 17, 2026  |  California Community Colleges  |  CPL Initiative</w:t>
     </w:r>
     <w:r>
       <w:rPr>

</xml_diff>

<commit_message>
Daily dashboard update — 2026-10-18
</commit_message>
<xml_diff>
--- a/reports/CPL_Master_Report.docx
+++ b/reports/CPL_Master_Report.docx
@@ -141,7 +141,7 @@
           <w:szCs w:val="22"/>
           <w:rFonts w:ascii="Cambria" w:cs="Cambria" w:eastAsia="Cambria" w:hAnsi="Cambria"/>
         </w:rPr>
-        <w:t xml:space="preserve">As of October 17, 2026, the CPL initiative is ahead of schedule, with most 2025–2026 targets met or exceeded and core infrastructure nearing completion. The work has expanded student access, increased transcripted units, and established the foundation for a permanent, statewide CPL service under Vision 2030.</w:t>
+        <w:t xml:space="preserve">As of October 18, 2026, the CPL initiative is ahead of schedule, with most 2025–2026 targets met or exceeded and core infrastructure nearing completion. The work has expanded student access, increased transcripted units, and established the foundation for a permanent, statewide CPL service under Vision 2030.</w:t>
       </w:r>
     </w:p>
     <w:p>
@@ -29727,7 +29727,7 @@
           <w:szCs w:val="20"/>
           <w:rFonts w:ascii="Cambria" w:cs="Cambria" w:eastAsia="Cambria" w:hAnsi="Cambria"/>
         </w:rPr>
-        <w:t xml:space="preserve">October 17, 2026</w:t>
+        <w:t xml:space="preserve">October 18, 2026</w:t>
       </w:r>
     </w:p>
     <w:sectPr>
@@ -29764,7 +29764,7 @@
         <w:szCs w:val="14"/>
         <w:rFonts w:ascii="Cambria" w:cs="Cambria" w:eastAsia="Cambria" w:hAnsi="Cambria"/>
       </w:rPr>
-      <w:t xml:space="preserve">Generated October 17, 2026  |  California Community Colleges  |  CPL Initiative</w:t>
+      <w:t xml:space="preserve">Generated October 18, 2026  |  California Community Colleges  |  CPL Initiative</w:t>
     </w:r>
     <w:r>
       <w:rPr>

</xml_diff>

<commit_message>
Daily dashboard update — 2026-10-19
</commit_message>
<xml_diff>
--- a/reports/CPL_Master_Report.docx
+++ b/reports/CPL_Master_Report.docx
@@ -141,7 +141,7 @@
           <w:szCs w:val="22"/>
           <w:rFonts w:ascii="Cambria" w:cs="Cambria" w:eastAsia="Cambria" w:hAnsi="Cambria"/>
         </w:rPr>
-        <w:t xml:space="preserve">As of October 18, 2026, the CPL initiative is ahead of schedule, with most 2025–2026 targets met or exceeded and core infrastructure nearing completion. The work has expanded student access, increased transcripted units, and established the foundation for a permanent, statewide CPL service under Vision 2030.</w:t>
+        <w:t xml:space="preserve">As of October 19, 2026, the CPL initiative is ahead of schedule, with most 2025–2026 targets met or exceeded and core infrastructure nearing completion. The work has expanded student access, increased transcripted units, and established the foundation for a permanent, statewide CPL service under Vision 2030.</w:t>
       </w:r>
     </w:p>
     <w:p>
@@ -167,7 +167,7 @@
           <w:szCs w:val="21"/>
           <w:rFonts w:ascii="Cambria" w:cs="Cambria" w:eastAsia="Cambria" w:hAnsi="Cambria"/>
         </w:rPr>
-        <w:t xml:space="preserve">57,422 cumulative students served with CPL awards, surpassing annual targets.</w:t>
+        <w:t xml:space="preserve">57,423 cumulative students served with CPL awards, surpassing annual targets.</w:t>
       </w:r>
     </w:p>
     <w:p>
@@ -424,7 +424,7 @@
                 <w:szCs w:val="20"/>
                 <w:rFonts w:ascii="Cambria" w:cs="Cambria" w:eastAsia="Cambria" w:hAnsi="Cambria"/>
               </w:rPr>
-              <w:t xml:space="preserve">57,422</w:t>
+              <w:t xml:space="preserve">57,423</w:t>
             </w:r>
           </w:p>
         </w:tc>
@@ -5876,7 +5876,7 @@
                 <w:szCs w:val="20"/>
                 <w:rFonts w:ascii="Cambria" w:cs="Cambria" w:eastAsia="Cambria" w:hAnsi="Cambria"/>
               </w:rPr>
-              <w:t xml:space="preserve">As of June 30, 2026, we have exceeded the goal of 200 CRs from our faculty workgroups. Due to the nature of certain academic disciplines, some groups will have a very high number of CRs on exhibits while others may have single CRs to an IC or ACE CR. With that said, with a total of 288 CRs currently, we can safety state that we are well on our way to achieve the 2026/27 goal of 400 CRs within the next 12 months.</w:t>
+              <w:t xml:space="preserve">We have expanded statewide credit recommendations to include construction management and HVAC programs, with specific counts of new exhibits and credit recommendations to be added once received from the team. We are now awaiting the ASCCC Pathways to Credit work to commence with faculty statewide credit recommendations. The goal for Item 2.1 is met and we are aiming to meet the stretch goal now.</w:t>
             </w:r>
           </w:p>
           <w:p>
@@ -6564,7 +6564,7 @@
                 <w:szCs w:val="20"/>
                 <w:rFonts w:ascii="Cambria" w:cs="Cambria" w:eastAsia="Cambria" w:hAnsi="Cambria"/>
               </w:rPr>
-              <w:t xml:space="preserve">As of June 30, 2026, 11 faculty workgroups have completed their work which is ahead of target pace. If one splits out EMT and Wildland, as those two academic disciplines do have distinct TOPS codes from Fire Technology, we would total 13 faculty workgroups. In July 2026, we will begin meeting with HVAC faculty yet the ASCCC holds a contract to begin convening faculty workgroups to produce CPL recommendations. We are well on our way to meet the goal of 15 by June 2027.</w:t>
+              <w:t xml:space="preserve">The Faculty Discipline Workgroups have grown to 13 distinct groups, including the HVAC workgroup that concluded in September 2026. Leadership of these workgroups is transitioning to ASCCC Pathways to Credit.</w:t>
             </w:r>
           </w:p>
           <w:p>
@@ -8839,7 +8839,7 @@
                 <w:szCs w:val="20"/>
                 <w:rFonts w:ascii="Cambria" w:cs="Cambria" w:eastAsia="Cambria" w:hAnsi="Cambria"/>
               </w:rPr>
-              <w:t xml:space="preserve">As of June 30, 2026 we have met our annual goal and have significant plans with CX, SE and App CPL to meet the next annual benchmark for transcribed CPL in MAP. Most college lack MIS reporting for SY codes and we are incorporating this into our technical assistance and professional development with a goal of having MAP Platform data and MIS submissions begin to parallel each other.  We are now offering more technical assistance in the form of a monthly webinar in which the August iteration will focus on data collection of transcribed CPL.</w:t>
+              <w:t xml:space="preserve">As of October 18, 2026, we are on track to meet our annual benchmark for transcribed CPL in MAP and to reach 90,000 transcribed units by June 2027. Most colleges continue to lack MIS reporting for SY codes, which we are addressing through technical assistance and professional development aimed at aligning MAP Platform data with MIS submissions. Platform usage is increasing, with significant growth in Cx, SE, and JST credit being loaded to reflect campus activity.</w:t>
             </w:r>
           </w:p>
           <w:p>
@@ -12337,7 +12337,7 @@
                 <w:szCs w:val="20"/>
                 <w:rFonts w:ascii="Cambria" w:cs="Cambria" w:eastAsia="Cambria" w:hAnsi="Cambria"/>
               </w:rPr>
-              <w:t xml:space="preserve">All but one community college has accepted 2025/26 funding and the established funding priorities. We anticipate exceeding expectations with over 110 community colleges participating in the CPL Initiative by June 2027.</w:t>
+              <w:t xml:space="preserve">We have exceeded our goal with over 60 colleges now active in the MAP Platform and successfully onboarded one of three target CSU campuses ahead of the June 2027 milestone. This activity is exceeding expectations.</w:t>
             </w:r>
           </w:p>
           <w:p>
@@ -15073,7 +15073,7 @@
                 <w:szCs w:val="20"/>
                 <w:rFonts w:ascii="Cambria" w:cs="Cambria" w:eastAsia="Cambria" w:hAnsi="Cambria"/>
               </w:rPr>
-              <w:t xml:space="preserve">The RP Group CPL Field Survey will employ a mixed-methods research study combining quantitative analysis of student outcomes with qualitative data from institutional interviews, focus groups, and/or student surveys to examine how Credit for Prior Learning influences student success and institutional effectiveness across participating California Community Colleges. The study will analyze CPL's impact on certificate and degree completion, compare outcomes between CPL recipients and non-CPL students with attention to historically underserved populations, and assess institutional implementation practices to provide evidence-based recommendations for strengthening statewide CPL implementation and promoting equitable student success.</w:t>
+              <w:t xml:space="preserve">We are actively in contract with the RP Group for performing CPL research on our behalf.</w:t>
             </w:r>
           </w:p>
           <w:p>
@@ -29676,7 +29676,7 @@
           <w:szCs w:val="22"/>
           <w:rFonts w:ascii="Cambria" w:cs="Cambria" w:eastAsia="Cambria" w:hAnsi="Cambria"/>
         </w:rPr>
-        <w:t xml:space="preserve">The CPL Initiative has moved from pilot to scale, demonstrating measurable impact in student access, credit attainment, and system engagement. With 57,422 students served, 14,503 statewide credit recommendations, and 103 actively participating colleges, the initiative has surpassed most 2025–26 benchmarks ahead of schedule.</w:t>
+        <w:t xml:space="preserve">The CPL Initiative has moved from pilot to scale, demonstrating measurable impact in student access, credit attainment, and system engagement. With 57,423 students served, 14,503 statewide credit recommendations, and 103 actively participating colleges, the initiative has surpassed most 2025–26 benchmarks ahead of schedule.</w:t>
       </w:r>
     </w:p>
     <w:p>
@@ -29727,7 +29727,7 @@
           <w:szCs w:val="20"/>
           <w:rFonts w:ascii="Cambria" w:cs="Cambria" w:eastAsia="Cambria" w:hAnsi="Cambria"/>
         </w:rPr>
-        <w:t xml:space="preserve">October 18, 2026</w:t>
+        <w:t xml:space="preserve">October 19, 2026</w:t>
       </w:r>
     </w:p>
     <w:sectPr>
@@ -29764,7 +29764,7 @@
         <w:szCs w:val="14"/>
         <w:rFonts w:ascii="Cambria" w:cs="Cambria" w:eastAsia="Cambria" w:hAnsi="Cambria"/>
       </w:rPr>
-      <w:t xml:space="preserve">Generated October 18, 2026  |  California Community Colleges  |  CPL Initiative</w:t>
+      <w:t xml:space="preserve">Generated October 19, 2026  |  California Community Colleges  |  CPL Initiative</w:t>
     </w:r>
     <w:r>
       <w:rPr>

</xml_diff>

<commit_message>
Daily dashboard update — 2026-10-20
</commit_message>
<xml_diff>
--- a/reports/CPL_Master_Report.docx
+++ b/reports/CPL_Master_Report.docx
@@ -141,7 +141,7 @@
           <w:szCs w:val="22"/>
           <w:rFonts w:ascii="Cambria" w:cs="Cambria" w:eastAsia="Cambria" w:hAnsi="Cambria"/>
         </w:rPr>
-        <w:t xml:space="preserve">As of October 19, 2026, the CPL initiative is ahead of schedule, with most 2025–2026 targets met or exceeded and core infrastructure nearing completion. The work has expanded student access, increased transcripted units, and established the foundation for a permanent, statewide CPL service under Vision 2030.</w:t>
+        <w:t xml:space="preserve">As of October 20, 2026, the CPL initiative is ahead of schedule, with most 2025–2026 targets met or exceeded and core infrastructure nearing completion. The work has expanded student access, increased transcripted units, and established the foundation for a permanent, statewide CPL service under Vision 2030.</w:t>
       </w:r>
     </w:p>
     <w:p>
@@ -167,7 +167,7 @@
           <w:szCs w:val="21"/>
           <w:rFonts w:ascii="Cambria" w:cs="Cambria" w:eastAsia="Cambria" w:hAnsi="Cambria"/>
         </w:rPr>
-        <w:t xml:space="preserve">57,434 cumulative students served with CPL awards, surpassing annual targets.</w:t>
+        <w:t xml:space="preserve">57,439 cumulative students served with CPL awards, surpassing annual targets.</w:t>
       </w:r>
     </w:p>
     <w:p>
@@ -221,7 +221,7 @@
           <w:szCs w:val="21"/>
           <w:rFonts w:ascii="Cambria" w:cs="Cambria" w:eastAsia="Cambria" w:hAnsi="Cambria"/>
         </w:rPr>
-        <w:t xml:space="preserve">14,497 statewide credit recommendations, driven by faculty discipline workgroups spanning high-demand fields.</w:t>
+        <w:t xml:space="preserve">14,498 statewide credit recommendations, driven by faculty discipline workgroups spanning high-demand fields.</w:t>
       </w:r>
     </w:p>
     <w:p>
@@ -239,7 +239,7 @@
           <w:szCs w:val="21"/>
           <w:rFonts w:ascii="Cambria" w:cs="Cambria" w:eastAsia="Cambria" w:hAnsi="Cambria"/>
         </w:rPr>
-        <w:t xml:space="preserve">The Veteran Sprint has uploaded 62 JSTs to MAP, with estimated student savings of $391M and projected 20-year economic impact of $1.59B.</w:t>
+        <w:t xml:space="preserve">The Veteran Sprint has uploaded 63 JSTs to MAP, with estimated student savings of $391M and projected 20-year economic impact of $1.59B.</w:t>
       </w:r>
     </w:p>
     <w:p>
@@ -424,7 +424,7 @@
                 <w:szCs w:val="20"/>
                 <w:rFonts w:ascii="Cambria" w:cs="Cambria" w:eastAsia="Cambria" w:hAnsi="Cambria"/>
               </w:rPr>
-              <w:t xml:space="preserve">57,434</w:t>
+              <w:t xml:space="preserve">57,439</w:t>
             </w:r>
           </w:p>
         </w:tc>
@@ -564,7 +564,7 @@
                 <w:szCs w:val="20"/>
                 <w:rFonts w:ascii="Cambria" w:cs="Cambria" w:eastAsia="Cambria" w:hAnsi="Cambria"/>
               </w:rPr>
-              <w:t xml:space="preserve">14,497</w:t>
+              <w:t xml:space="preserve">14,498</w:t>
             </w:r>
           </w:p>
         </w:tc>
@@ -704,7 +704,7 @@
                 <w:szCs w:val="20"/>
                 <w:rFonts w:ascii="Cambria" w:cs="Cambria" w:eastAsia="Cambria" w:hAnsi="Cambria"/>
               </w:rPr>
-              <w:t xml:space="preserve">62</w:t>
+              <w:t xml:space="preserve">63</w:t>
             </w:r>
           </w:p>
         </w:tc>
@@ -5876,7 +5876,7 @@
                 <w:szCs w:val="20"/>
                 <w:rFonts w:ascii="Cambria" w:cs="Cambria" w:eastAsia="Cambria" w:hAnsi="Cambria"/>
               </w:rPr>
-              <w:t xml:space="preserve">We have expanded statewide credit recommendations to include construction management and HVAC programs, with specific counts of new exhibits and credit recommendations to be added once received from the team. We are now awaiting the ASCCC Pathways to Credit work to commence with faculty statewide credit recommendations. The goal for Item 2.1 is met and we are aiming to meet the stretch goal now.</w:t>
+              <w:t xml:space="preserve">As of October 2026, we have almost 15,000 statewide CRs for colleges to adopt locally. We have expanded statewide credit recommendations to include construction management and HVAC programs, with specific counts of new exhibits and credit recommendations to be added once received from the team. We are now awaiting the ASCCC Pathways to Credit work to commence with faculty statewide credit recommendations. The goal for Item 2.1 is met and we are aiming to meet the stretch goal now.</w:t>
             </w:r>
           </w:p>
           <w:p>
@@ -6564,7 +6564,7 @@
                 <w:szCs w:val="20"/>
                 <w:rFonts w:ascii="Cambria" w:cs="Cambria" w:eastAsia="Cambria" w:hAnsi="Cambria"/>
               </w:rPr>
-              <w:t xml:space="preserve">The Faculty Discipline Workgroups have grown to 13 distinct groups, including the HVAC workgroup that concluded in September 2026. Leadership of these workgroups is transitioning to ASCCC Pathways to Credit.</w:t>
+              <w:t xml:space="preserve">As of October 2026, the Faculty Discipline Workgroups have grown to 13 distinct groups, including the HVAC workgroup that concluded in September 2026. Leadership of these workgroups is transitioning to ASCCC Pathways to Credit.</w:t>
             </w:r>
           </w:p>
           <w:p>
@@ -8839,7 +8839,7 @@
                 <w:szCs w:val="20"/>
                 <w:rFonts w:ascii="Cambria" w:cs="Cambria" w:eastAsia="Cambria" w:hAnsi="Cambria"/>
               </w:rPr>
-              <w:t xml:space="preserve">As of October 18, 2026, we are on track to meet our annual benchmark for transcribed CPL in MAP and to reach 90,000 transcribed units by June 2027. Most colleges continue to lack MIS reporting for SY codes, which we are addressing through technical assistance and professional development aimed at aligning MAP Platform data with MIS submissions. Platform usage is increasing, with significant growth in Cx, SE, and JST credit being loaded to reflect campus activity.</w:t>
+              <w:t xml:space="preserve">As of October 2026, we are on track to meet our annual benchmark for transcribed CPL in MAP and to reach 90,000 transcribed units by June 2027. Most colleges continue to lack MIS reporting for SY codes, which we are addressing through technical assistance and professional development aimed at aligning MAP Platform data with MIS submissions. Platform usage is increasing, with significant growth in Cx, SE, and JST credit being loaded to reflect campus activity. Those three areas are primary in our ability to attain 90,000 units transcribed.</w:t>
             </w:r>
           </w:p>
           <w:p>
@@ -12334,7 +12334,7 @@
                 <w:szCs w:val="20"/>
                 <w:rFonts w:ascii="Cambria" w:cs="Cambria" w:eastAsia="Cambria" w:hAnsi="Cambria"/>
               </w:rPr>
-              <w:t xml:space="preserve">We have exceeded our goal with over 60 colleges now active in the MAP Platform and successfully onboarded one of three target CSU campuses ahead of the June 2027 milestone. This activity is exceeding expectations.</w:t>
+              <w:t xml:space="preserve">We have exceeded our goal of over 60 colleges active in the MAP Platform and have now successfully onboarded one of three target CSU campuses ahead of the June 2027 milestone. This activity is exceeding expectations.</w:t>
             </w:r>
           </w:p>
           <w:p>
@@ -14398,7 +14398,7 @@
                 <w:szCs w:val="20"/>
                 <w:rFonts w:ascii="Cambria" w:cs="Cambria" w:eastAsia="Cambria" w:hAnsi="Cambria"/>
               </w:rPr>
-              <w:t xml:space="preserve">Colleges with &gt;75% JST documentation for reported veterans receive gold star recognition on the MAP Dashboard, which has increased participation and acceptance of this procedure. Icons will be integrated on the dashboard to recognize platform use levels and keep local staff informed of their progress.</w:t>
+              <w:t xml:space="preserve">At the 7th Annual CPL Summit, 10 additional colleges and their CPL champions will be recognized, bringing the total to 13 and exceeding the June 2027 goal.</w:t>
             </w:r>
           </w:p>
           <w:p>
@@ -29799,7 +29799,7 @@
           <w:szCs w:val="22"/>
           <w:rFonts w:ascii="Cambria" w:cs="Cambria" w:eastAsia="Cambria" w:hAnsi="Cambria"/>
         </w:rPr>
-        <w:t xml:space="preserve">The CPL Initiative has moved from pilot to scale, demonstrating measurable impact in student access, credit attainment, and system engagement. With 57,434 students served, 14,497 statewide credit recommendations, and 103 actively participating colleges, the initiative has surpassed most 2025–26 benchmarks ahead of schedule.</w:t>
+        <w:t xml:space="preserve">The CPL Initiative has moved from pilot to scale, demonstrating measurable impact in student access, credit attainment, and system engagement. With 57,439 students served, 14,498 statewide credit recommendations, and 103 actively participating colleges, the initiative has surpassed most 2025–26 benchmarks ahead of schedule.</w:t>
       </w:r>
     </w:p>
     <w:p>
@@ -29850,7 +29850,7 @@
           <w:szCs w:val="20"/>
           <w:rFonts w:ascii="Cambria" w:cs="Cambria" w:eastAsia="Cambria" w:hAnsi="Cambria"/>
         </w:rPr>
-        <w:t xml:space="preserve">October 19, 2026</w:t>
+        <w:t xml:space="preserve">October 20, 2026</w:t>
       </w:r>
     </w:p>
     <w:sectPr>
@@ -29887,7 +29887,7 @@
         <w:szCs w:val="14"/>
         <w:rFonts w:ascii="Cambria" w:cs="Cambria" w:eastAsia="Cambria" w:hAnsi="Cambria"/>
       </w:rPr>
-      <w:t xml:space="preserve">Generated October 19, 2026  |  California Community Colleges  |  CPL Initiative</w:t>
+      <w:t xml:space="preserve">Generated October 20, 2026  |  California Community Colleges  |  CPL Initiative</w:t>
     </w:r>
     <w:r>
       <w:rPr>

</xml_diff>

<commit_message>
Daily dashboard update — 2026-10-21
</commit_message>
<xml_diff>
--- a/reports/CPL_Master_Report.docx
+++ b/reports/CPL_Master_Report.docx
@@ -141,7 +141,7 @@
           <w:szCs w:val="22"/>
           <w:rFonts w:ascii="Cambria" w:cs="Cambria" w:eastAsia="Cambria" w:hAnsi="Cambria"/>
         </w:rPr>
-        <w:t xml:space="preserve">As of October 20, 2026, the CPL initiative is ahead of schedule, with most 2025–2026 targets met or exceeded and core infrastructure nearing completion. The work has expanded student access, increased transcripted units, and established the foundation for a permanent, statewide CPL service under Vision 2030.</w:t>
+        <w:t xml:space="preserve">As of October 21, 2026, the CPL initiative is ahead of schedule, with most 2025–2026 targets met or exceeded and core infrastructure nearing completion. The work has expanded student access, increased transcripted units, and established the foundation for a permanent, statewide CPL service under Vision 2030.</w:t>
       </w:r>
     </w:p>
     <w:p>
@@ -167,7 +167,7 @@
           <w:szCs w:val="21"/>
           <w:rFonts w:ascii="Cambria" w:cs="Cambria" w:eastAsia="Cambria" w:hAnsi="Cambria"/>
         </w:rPr>
-        <w:t xml:space="preserve">57,447 cumulative students served with CPL awards, surpassing annual targets.</w:t>
+        <w:t xml:space="preserve">57,450 cumulative students served with CPL awards, surpassing annual targets.</w:t>
       </w:r>
     </w:p>
     <w:p>
@@ -221,7 +221,7 @@
           <w:szCs w:val="21"/>
           <w:rFonts w:ascii="Cambria" w:cs="Cambria" w:eastAsia="Cambria" w:hAnsi="Cambria"/>
         </w:rPr>
-        <w:t xml:space="preserve">14,504 statewide credit recommendations, driven by faculty discipline workgroups spanning high-demand fields.</w:t>
+        <w:t xml:space="preserve">14,526 statewide credit recommendations, driven by faculty discipline workgroups spanning high-demand fields.</w:t>
       </w:r>
     </w:p>
     <w:p>
@@ -424,7 +424,7 @@
                 <w:szCs w:val="20"/>
                 <w:rFonts w:ascii="Cambria" w:cs="Cambria" w:eastAsia="Cambria" w:hAnsi="Cambria"/>
               </w:rPr>
-              <w:t xml:space="preserve">57,447</w:t>
+              <w:t xml:space="preserve">57,450</w:t>
             </w:r>
           </w:p>
         </w:tc>
@@ -564,7 +564,7 @@
                 <w:szCs w:val="20"/>
                 <w:rFonts w:ascii="Cambria" w:cs="Cambria" w:eastAsia="Cambria" w:hAnsi="Cambria"/>
               </w:rPr>
-              <w:t xml:space="preserve">14,504</w:t>
+              <w:t xml:space="preserve">14,526</w:t>
             </w:r>
           </w:p>
         </w:tc>
@@ -29799,7 +29799,7 @@
           <w:szCs w:val="22"/>
           <w:rFonts w:ascii="Cambria" w:cs="Cambria" w:eastAsia="Cambria" w:hAnsi="Cambria"/>
         </w:rPr>
-        <w:t xml:space="preserve">The CPL Initiative has moved from pilot to scale, demonstrating measurable impact in student access, credit attainment, and system engagement. With 57,447 students served, 14,504 statewide credit recommendations, and 103 actively participating colleges, the initiative has surpassed most 2025–26 benchmarks ahead of schedule.</w:t>
+        <w:t xml:space="preserve">The CPL Initiative has moved from pilot to scale, demonstrating measurable impact in student access, credit attainment, and system engagement. With 57,450 students served, 14,526 statewide credit recommendations, and 103 actively participating colleges, the initiative has surpassed most 2025–26 benchmarks ahead of schedule.</w:t>
       </w:r>
     </w:p>
     <w:p>
@@ -29850,7 +29850,7 @@
           <w:szCs w:val="20"/>
           <w:rFonts w:ascii="Cambria" w:cs="Cambria" w:eastAsia="Cambria" w:hAnsi="Cambria"/>
         </w:rPr>
-        <w:t xml:space="preserve">October 20, 2026</w:t>
+        <w:t xml:space="preserve">October 21, 2026</w:t>
       </w:r>
     </w:p>
     <w:sectPr>
@@ -29887,7 +29887,7 @@
         <w:szCs w:val="14"/>
         <w:rFonts w:ascii="Cambria" w:cs="Cambria" w:eastAsia="Cambria" w:hAnsi="Cambria"/>
       </w:rPr>
-      <w:t xml:space="preserve">Generated October 20, 2026  |  California Community Colleges  |  CPL Initiative</w:t>
+      <w:t xml:space="preserve">Generated October 21, 2026  |  California Community Colleges  |  CPL Initiative</w:t>
     </w:r>
     <w:r>
       <w:rPr>

</xml_diff>

<commit_message>
Daily dashboard update — 2026-10-22
</commit_message>
<xml_diff>
--- a/reports/CPL_Master_Report.docx
+++ b/reports/CPL_Master_Report.docx
@@ -141,7 +141,7 @@
           <w:szCs w:val="22"/>
           <w:rFonts w:ascii="Cambria" w:cs="Cambria" w:eastAsia="Cambria" w:hAnsi="Cambria"/>
         </w:rPr>
-        <w:t xml:space="preserve">As of October 21, 2026, the CPL initiative is ahead of schedule, with most 2025–2026 targets met or exceeded and core infrastructure nearing completion. The work has expanded student access, increased transcripted units, and established the foundation for a permanent, statewide CPL service under Vision 2030.</w:t>
+        <w:t xml:space="preserve">As of October 22, 2026, the CPL initiative is ahead of schedule, with most 2025–2026 targets met or exceeded and core infrastructure nearing completion. The work has expanded student access, increased transcripted units, and established the foundation for a permanent, statewide CPL service under Vision 2030.</w:t>
       </w:r>
     </w:p>
     <w:p>
@@ -167,7 +167,7 @@
           <w:szCs w:val="21"/>
           <w:rFonts w:ascii="Cambria" w:cs="Cambria" w:eastAsia="Cambria" w:hAnsi="Cambria"/>
         </w:rPr>
-        <w:t xml:space="preserve">57,465 cumulative students served with CPL awards, surpassing annual targets.</w:t>
+        <w:t xml:space="preserve">57,504 cumulative students served with CPL awards, surpassing annual targets.</w:t>
       </w:r>
     </w:p>
     <w:p>
@@ -185,7 +185,7 @@
           <w:szCs w:val="21"/>
           <w:rFonts w:ascii="Cambria" w:cs="Cambria" w:eastAsia="Cambria" w:hAnsi="Cambria"/>
         </w:rPr>
-        <w:t xml:space="preserve">276k CPL units transcripted across the system.</w:t>
+        <w:t xml:space="preserve">277k CPL units transcripted across the system.</w:t>
       </w:r>
     </w:p>
     <w:p>
@@ -221,7 +221,7 @@
           <w:szCs w:val="21"/>
           <w:rFonts w:ascii="Cambria" w:cs="Cambria" w:eastAsia="Cambria" w:hAnsi="Cambria"/>
         </w:rPr>
-        <w:t xml:space="preserve">14,529 statewide credit recommendations, driven by faculty discipline workgroups spanning high-demand fields.</w:t>
+        <w:t xml:space="preserve">14,564 statewide credit recommendations, driven by faculty discipline workgroups spanning high-demand fields.</w:t>
       </w:r>
     </w:p>
     <w:p>
@@ -239,7 +239,7 @@
           <w:szCs w:val="21"/>
           <w:rFonts w:ascii="Cambria" w:cs="Cambria" w:eastAsia="Cambria" w:hAnsi="Cambria"/>
         </w:rPr>
-        <w:t xml:space="preserve">The Veteran Sprint has uploaded 63 JSTs to MAP, with estimated student savings of $391M and projected 20-year economic impact of $1.59B.</w:t>
+        <w:t xml:space="preserve">The Veteran Sprint has uploaded 63 JSTs to MAP, with estimated student savings of $392M and projected 20-year economic impact of $1.59B.</w:t>
       </w:r>
     </w:p>
     <w:p>
@@ -424,7 +424,7 @@
                 <w:szCs w:val="20"/>
                 <w:rFonts w:ascii="Cambria" w:cs="Cambria" w:eastAsia="Cambria" w:hAnsi="Cambria"/>
               </w:rPr>
-              <w:t xml:space="preserve">57,465</w:t>
+              <w:t xml:space="preserve">57,504</w:t>
             </w:r>
           </w:p>
         </w:tc>
@@ -494,7 +494,7 @@
                 <w:szCs w:val="20"/>
                 <w:rFonts w:ascii="Cambria" w:cs="Cambria" w:eastAsia="Cambria" w:hAnsi="Cambria"/>
               </w:rPr>
-              <w:t xml:space="preserve">276k</w:t>
+              <w:t xml:space="preserve">277k</w:t>
             </w:r>
           </w:p>
         </w:tc>
@@ -564,7 +564,7 @@
                 <w:szCs w:val="20"/>
                 <w:rFonts w:ascii="Cambria" w:cs="Cambria" w:eastAsia="Cambria" w:hAnsi="Cambria"/>
               </w:rPr>
-              <w:t xml:space="preserve">14,529</w:t>
+              <w:t xml:space="preserve">14,564</w:t>
             </w:r>
           </w:p>
         </w:tc>
@@ -774,7 +774,7 @@
                 <w:szCs w:val="20"/>
                 <w:rFonts w:ascii="Cambria" w:cs="Cambria" w:eastAsia="Cambria" w:hAnsi="Cambria"/>
               </w:rPr>
-              <w:t xml:space="preserve">$391M</w:t>
+              <w:t xml:space="preserve">$392M</w:t>
             </w:r>
           </w:p>
         </w:tc>
@@ -29799,7 +29799,7 @@
           <w:szCs w:val="22"/>
           <w:rFonts w:ascii="Cambria" w:cs="Cambria" w:eastAsia="Cambria" w:hAnsi="Cambria"/>
         </w:rPr>
-        <w:t xml:space="preserve">The CPL Initiative has moved from pilot to scale, demonstrating measurable impact in student access, credit attainment, and system engagement. With 57,465 students served, 14,529 statewide credit recommendations, and 103 actively participating colleges, the initiative has surpassed most 2025–26 benchmarks ahead of schedule.</w:t>
+        <w:t xml:space="preserve">The CPL Initiative has moved from pilot to scale, demonstrating measurable impact in student access, credit attainment, and system engagement. With 57,504 students served, 14,564 statewide credit recommendations, and 103 actively participating colleges, the initiative has surpassed most 2025–26 benchmarks ahead of schedule.</w:t>
       </w:r>
     </w:p>
     <w:p>
@@ -29850,7 +29850,7 @@
           <w:szCs w:val="20"/>
           <w:rFonts w:ascii="Cambria" w:cs="Cambria" w:eastAsia="Cambria" w:hAnsi="Cambria"/>
         </w:rPr>
-        <w:t xml:space="preserve">October 21, 2026</w:t>
+        <w:t xml:space="preserve">October 22, 2026</w:t>
       </w:r>
     </w:p>
     <w:sectPr>
@@ -29887,7 +29887,7 @@
         <w:szCs w:val="14"/>
         <w:rFonts w:ascii="Cambria" w:cs="Cambria" w:eastAsia="Cambria" w:hAnsi="Cambria"/>
       </w:rPr>
-      <w:t xml:space="preserve">Generated October 21, 2026  |  California Community Colleges  |  CPL Initiative</w:t>
+      <w:t xml:space="preserve">Generated October 22, 2026  |  California Community Colleges  |  CPL Initiative</w:t>
     </w:r>
     <w:r>
       <w:rPr>

</xml_diff>

<commit_message>
Daily dashboard update — 2026-10-23
</commit_message>
<xml_diff>
--- a/reports/CPL_Master_Report.docx
+++ b/reports/CPL_Master_Report.docx
@@ -141,7 +141,7 @@
           <w:szCs w:val="22"/>
           <w:rFonts w:ascii="Cambria" w:cs="Cambria" w:eastAsia="Cambria" w:hAnsi="Cambria"/>
         </w:rPr>
-        <w:t xml:space="preserve">As of October 22, 2026, the CPL initiative is ahead of schedule, with most 2025–2026 targets met or exceeded and core infrastructure nearing completion. The work has expanded student access, increased transcripted units, and established the foundation for a permanent, statewide CPL service under Vision 2030.</w:t>
+        <w:t xml:space="preserve">As of October 23, 2026, the CPL initiative is ahead of schedule, with most 2025–2026 targets met or exceeded and core infrastructure nearing completion. The work has expanded student access, increased transcripted units, and established the foundation for a permanent, statewide CPL service under Vision 2030.</w:t>
       </w:r>
     </w:p>
     <w:p>
@@ -167,7 +167,7 @@
           <w:szCs w:val="21"/>
           <w:rFonts w:ascii="Cambria" w:cs="Cambria" w:eastAsia="Cambria" w:hAnsi="Cambria"/>
         </w:rPr>
-        <w:t xml:space="preserve">57,518 cumulative students served with CPL awards, surpassing annual targets.</w:t>
+        <w:t xml:space="preserve">57,552 cumulative students served with CPL awards, surpassing annual targets.</w:t>
       </w:r>
     </w:p>
     <w:p>
@@ -203,7 +203,7 @@
           <w:szCs w:val="21"/>
           <w:rFonts w:ascii="Cambria" w:cs="Cambria" w:eastAsia="Cambria" w:hAnsi="Cambria"/>
         </w:rPr>
-        <w:t xml:space="preserve">103 colleges meeting active participation thresholds, exceeding the goal of 50.</w:t>
+        <w:t xml:space="preserve">104 colleges meeting active participation thresholds, exceeding the goal of 50.</w:t>
       </w:r>
     </w:p>
     <w:p>
@@ -221,7 +221,7 @@
           <w:szCs w:val="21"/>
           <w:rFonts w:ascii="Cambria" w:cs="Cambria" w:eastAsia="Cambria" w:hAnsi="Cambria"/>
         </w:rPr>
-        <w:t xml:space="preserve">14,583 statewide credit recommendations, driven by faculty discipline workgroups spanning high-demand fields.</w:t>
+        <w:t xml:space="preserve">14,593 statewide credit recommendations, driven by faculty discipline workgroups spanning high-demand fields.</w:t>
       </w:r>
     </w:p>
     <w:p>
@@ -424,7 +424,7 @@
                 <w:szCs w:val="20"/>
                 <w:rFonts w:ascii="Cambria" w:cs="Cambria" w:eastAsia="Cambria" w:hAnsi="Cambria"/>
               </w:rPr>
-              <w:t xml:space="preserve">57,518</w:t>
+              <w:t xml:space="preserve">57,552</w:t>
             </w:r>
           </w:p>
         </w:tc>
@@ -564,7 +564,7 @@
                 <w:szCs w:val="20"/>
                 <w:rFonts w:ascii="Cambria" w:cs="Cambria" w:eastAsia="Cambria" w:hAnsi="Cambria"/>
               </w:rPr>
-              <w:t xml:space="preserve">14,583</w:t>
+              <w:t xml:space="preserve">14,593</w:t>
             </w:r>
           </w:p>
         </w:tc>
@@ -634,7 +634,7 @@
                 <w:szCs w:val="20"/>
                 <w:rFonts w:ascii="Cambria" w:cs="Cambria" w:eastAsia="Cambria" w:hAnsi="Cambria"/>
               </w:rPr>
-              <w:t xml:space="preserve">103</w:t>
+              <w:t xml:space="preserve">104</w:t>
             </w:r>
           </w:p>
         </w:tc>
@@ -29799,7 +29799,7 @@
           <w:szCs w:val="22"/>
           <w:rFonts w:ascii="Cambria" w:cs="Cambria" w:eastAsia="Cambria" w:hAnsi="Cambria"/>
         </w:rPr>
-        <w:t xml:space="preserve">The CPL Initiative has moved from pilot to scale, demonstrating measurable impact in student access, credit attainment, and system engagement. With 57,518 students served, 14,583 statewide credit recommendations, and 103 actively participating colleges, the initiative has surpassed most 2025–26 benchmarks ahead of schedule.</w:t>
+        <w:t xml:space="preserve">The CPL Initiative has moved from pilot to scale, demonstrating measurable impact in student access, credit attainment, and system engagement. With 57,552 students served, 14,593 statewide credit recommendations, and 104 actively participating colleges, the initiative has surpassed most 2025–26 benchmarks ahead of schedule.</w:t>
       </w:r>
     </w:p>
     <w:p>
@@ -29850,7 +29850,7 @@
           <w:szCs w:val="20"/>
           <w:rFonts w:ascii="Cambria" w:cs="Cambria" w:eastAsia="Cambria" w:hAnsi="Cambria"/>
         </w:rPr>
-        <w:t xml:space="preserve">October 22, 2026</w:t>
+        <w:t xml:space="preserve">October 23, 2026</w:t>
       </w:r>
     </w:p>
     <w:sectPr>
@@ -29887,7 +29887,7 @@
         <w:szCs w:val="14"/>
         <w:rFonts w:ascii="Cambria" w:cs="Cambria" w:eastAsia="Cambria" w:hAnsi="Cambria"/>
       </w:rPr>
-      <w:t xml:space="preserve">Generated October 22, 2026  |  California Community Colleges  |  CPL Initiative</w:t>
+      <w:t xml:space="preserve">Generated October 23, 2026  |  California Community Colleges  |  CPL Initiative</w:t>
     </w:r>
     <w:r>
       <w:rPr>

</xml_diff>

<commit_message>
Daily dashboard update — 2026-10-24
</commit_message>
<xml_diff>
--- a/reports/CPL_Master_Report.docx
+++ b/reports/CPL_Master_Report.docx
@@ -141,7 +141,7 @@
           <w:szCs w:val="22"/>
           <w:rFonts w:ascii="Cambria" w:cs="Cambria" w:eastAsia="Cambria" w:hAnsi="Cambria"/>
         </w:rPr>
-        <w:t xml:space="preserve">As of October 23, 2026, the CPL initiative is ahead of schedule, with most 2025–2026 targets met or exceeded and core infrastructure nearing completion. The work has expanded student access, increased transcripted units, and established the foundation for a permanent, statewide CPL service under Vision 2030.</w:t>
+        <w:t xml:space="preserve">As of October 24, 2026, the CPL initiative is ahead of schedule, with most 2025–2026 targets met or exceeded and core infrastructure nearing completion. The work has expanded student access, increased transcripted units, and established the foundation for a permanent, statewide CPL service under Vision 2030.</w:t>
       </w:r>
     </w:p>
     <w:p>
@@ -167,7 +167,7 @@
           <w:szCs w:val="21"/>
           <w:rFonts w:ascii="Cambria" w:cs="Cambria" w:eastAsia="Cambria" w:hAnsi="Cambria"/>
         </w:rPr>
-        <w:t xml:space="preserve">57,567 cumulative students served with CPL awards, surpassing annual targets.</w:t>
+        <w:t xml:space="preserve">57,664 cumulative students served with CPL awards, surpassing annual targets.</w:t>
       </w:r>
     </w:p>
     <w:p>
@@ -203,7 +203,7 @@
           <w:szCs w:val="21"/>
           <w:rFonts w:ascii="Cambria" w:cs="Cambria" w:eastAsia="Cambria" w:hAnsi="Cambria"/>
         </w:rPr>
-        <w:t xml:space="preserve">104 colleges meeting active participation thresholds, exceeding the goal of 50.</w:t>
+        <w:t xml:space="preserve">105 colleges meeting active participation thresholds, exceeding the goal of 50.</w:t>
       </w:r>
     </w:p>
     <w:p>
@@ -221,7 +221,7 @@
           <w:szCs w:val="21"/>
           <w:rFonts w:ascii="Cambria" w:cs="Cambria" w:eastAsia="Cambria" w:hAnsi="Cambria"/>
         </w:rPr>
-        <w:t xml:space="preserve">14,593 statewide credit recommendations, driven by faculty discipline workgroups spanning high-demand fields.</w:t>
+        <w:t xml:space="preserve">14,524 statewide credit recommendations, driven by faculty discipline workgroups spanning high-demand fields.</w:t>
       </w:r>
     </w:p>
     <w:p>
@@ -424,7 +424,7 @@
                 <w:szCs w:val="20"/>
                 <w:rFonts w:ascii="Cambria" w:cs="Cambria" w:eastAsia="Cambria" w:hAnsi="Cambria"/>
               </w:rPr>
-              <w:t xml:space="preserve">57,567</w:t>
+              <w:t xml:space="preserve">57,664</w:t>
             </w:r>
           </w:p>
         </w:tc>
@@ -564,7 +564,7 @@
                 <w:szCs w:val="20"/>
                 <w:rFonts w:ascii="Cambria" w:cs="Cambria" w:eastAsia="Cambria" w:hAnsi="Cambria"/>
               </w:rPr>
-              <w:t xml:space="preserve">14,593</w:t>
+              <w:t xml:space="preserve">14,524</w:t>
             </w:r>
           </w:p>
         </w:tc>
@@ -634,7 +634,7 @@
                 <w:szCs w:val="20"/>
                 <w:rFonts w:ascii="Cambria" w:cs="Cambria" w:eastAsia="Cambria" w:hAnsi="Cambria"/>
               </w:rPr>
-              <w:t xml:space="preserve">104</w:t>
+              <w:t xml:space="preserve">105</w:t>
             </w:r>
           </w:p>
         </w:tc>
@@ -5257,6 +5257,31 @@
     </w:p>
     <w:p>
       <w:pPr>
+        <w:spacing w:after="160"/>
+      </w:pPr>
+      <w:r>
+        <w:rPr>
+          <w:b/>
+          <w:bCs/>
+          <w:color w:val="163A5F"/>
+          <w:sz w:val="20"/>
+          <w:szCs w:val="20"/>
+          <w:rFonts w:ascii="Cambria" w:cs="Cambria" w:eastAsia="Cambria" w:hAnsi="Cambria"/>
+        </w:rPr>
+        <w:t xml:space="preserve">Latest update (2026-10-23): </w:t>
+      </w:r>
+      <w:r>
+        <w:rPr>
+          <w:color w:val="444444"/>
+          <w:sz w:val="20"/>
+          <w:szCs w:val="20"/>
+          <w:rFonts w:ascii="Cambria" w:cs="Cambria" w:eastAsia="Cambria" w:hAnsi="Cambria"/>
+        </w:rPr>
+        <w:t xml:space="preserve">Faculty workgroups continue to advance Credit for Prior Learning (CPL) efforts through the review, development, and implementation of statewide credit recommendations, helping to expand consistent CPL opportunities across the system. A STAT Excel worksheet was developed and is being shared with colleges upon request, providing a snapshot of each college’s alignment between existing CPL offerings and applicable statewide credit recommendations. This resource has helped colleges identify opportunities for expansion, and areas of strong alignment. In addition, several colleges are choosing to develop local CPL exhibits in lieu of adopting statewide exhibits, and these locally developed exhibits are being captured and tracked within MAP.</w:t>
+      </w:r>
+    </w:p>
+    <w:p>
+      <w:pPr>
         <w:spacing w:after="200"/>
       </w:pPr>
       <w:r>
@@ -5876,7 +5901,7 @@
                 <w:szCs w:val="20"/>
                 <w:rFonts w:ascii="Cambria" w:cs="Cambria" w:eastAsia="Cambria" w:hAnsi="Cambria"/>
               </w:rPr>
-              <w:t xml:space="preserve">As of October 2026, we have almost 15,000 statewide CRs for colleges to adopt locally. We have expanded statewide credit recommendations to include construction management and HVAC programs, with specific counts of new exhibits and credit recommendations to be added once received from the team. We are now awaiting the ASCCC Pathways to Credit work to commence with faculty statewide credit recommendations. The goal for Item 2.1 is met and we are aiming to meet the stretch goal now.</w:t>
+              <w:t xml:space="preserve">As of 10/23/2026, colleges continue to advance Credit for Prior Learning (CPL) efforts through the review and adoption of statewide credit recommendations, helping to expand consistent CPL opportunities across the system. A STAT Excel worksheet was developed and is being shared with colleges upon request, providing a snapshot of each college’s alignment between existing CPL offerings and applicable statewide credit recommendations. This resource has helped colleges identify opportunities for expansion, and areas of strong alignment. In addition, several colleges are choosing to develop local CPL exhibits in lieu of adopting statewide exhibits, and these locally developed exhibits are being captured and tracked within MAP.</w:t>
             </w:r>
           </w:p>
           <w:p>
@@ -12334,7 +12359,7 @@
                 <w:szCs w:val="20"/>
                 <w:rFonts w:ascii="Cambria" w:cs="Cambria" w:eastAsia="Cambria" w:hAnsi="Cambria"/>
               </w:rPr>
-              <w:t xml:space="preserve">We have exceeded our goal of over 60 colleges active in the MAP Platform and have now successfully onboarded one of three target CSU campuses ahead of the June 2027 milestone. This activity is exceeding expectations.</w:t>
+              <w:t xml:space="preserve">Knowledge of statewide adoptions continue to grow throughout the state with the creation of a STAT Excel worksheet being shared with colleges upon request, providing a snapshot of each college’s alignment between existing CPL offerings and applicable statewide credit recommendations. This resource is helping colleges identify CPL opportunities within the 12 disciplines.</w:t>
             </w:r>
           </w:p>
           <w:p>
@@ -29799,7 +29824,7 @@
           <w:szCs w:val="22"/>
           <w:rFonts w:ascii="Cambria" w:cs="Cambria" w:eastAsia="Cambria" w:hAnsi="Cambria"/>
         </w:rPr>
-        <w:t xml:space="preserve">The CPL Initiative has moved from pilot to scale, demonstrating measurable impact in student access, credit attainment, and system engagement. With 57,567 students served, 14,593 statewide credit recommendations, and 104 actively participating colleges, the initiative has surpassed most 2025–26 benchmarks ahead of schedule.</w:t>
+        <w:t xml:space="preserve">The CPL Initiative has moved from pilot to scale, demonstrating measurable impact in student access, credit attainment, and system engagement. With 57,664 students served, 14,524 statewide credit recommendations, and 105 actively participating colleges, the initiative has surpassed most 2025–26 benchmarks ahead of schedule.</w:t>
       </w:r>
     </w:p>
     <w:p>
@@ -29850,7 +29875,7 @@
           <w:szCs w:val="20"/>
           <w:rFonts w:ascii="Cambria" w:cs="Cambria" w:eastAsia="Cambria" w:hAnsi="Cambria"/>
         </w:rPr>
-        <w:t xml:space="preserve">October 23, 2026</w:t>
+        <w:t xml:space="preserve">October 24, 2026</w:t>
       </w:r>
     </w:p>
     <w:sectPr>
@@ -29887,7 +29912,7 @@
         <w:szCs w:val="14"/>
         <w:rFonts w:ascii="Cambria" w:cs="Cambria" w:eastAsia="Cambria" w:hAnsi="Cambria"/>
       </w:rPr>
-      <w:t xml:space="preserve">Generated October 23, 2026  |  California Community Colleges  |  CPL Initiative</w:t>
+      <w:t xml:space="preserve">Generated October 24, 2026  |  California Community Colleges  |  CPL Initiative</w:t>
     </w:r>
     <w:r>
       <w:rPr>

</xml_diff>

<commit_message>
Daily dashboard update — 2026-10-25
</commit_message>
<xml_diff>
--- a/reports/CPL_Master_Report.docx
+++ b/reports/CPL_Master_Report.docx
@@ -141,7 +141,7 @@
           <w:szCs w:val="22"/>
           <w:rFonts w:ascii="Cambria" w:cs="Cambria" w:eastAsia="Cambria" w:hAnsi="Cambria"/>
         </w:rPr>
-        <w:t xml:space="preserve">As of October 24, 2026, the CPL initiative is ahead of schedule, with most 2025–2026 targets met or exceeded and core infrastructure nearing completion. The work has expanded student access, increased transcripted units, and established the foundation for a permanent, statewide CPL service under Vision 2030.</w:t>
+        <w:t xml:space="preserve">As of October 25, 2026, the CPL initiative is ahead of schedule, with most 2025–2026 targets met or exceeded and core infrastructure nearing completion. The work has expanded student access, increased transcripted units, and established the foundation for a permanent, statewide CPL service under Vision 2030.</w:t>
       </w:r>
     </w:p>
     <w:p>
@@ -29875,7 +29875,7 @@
           <w:szCs w:val="20"/>
           <w:rFonts w:ascii="Cambria" w:cs="Cambria" w:eastAsia="Cambria" w:hAnsi="Cambria"/>
         </w:rPr>
-        <w:t xml:space="preserve">October 24, 2026</w:t>
+        <w:t xml:space="preserve">October 25, 2026</w:t>
       </w:r>
     </w:p>
     <w:sectPr>
@@ -29912,7 +29912,7 @@
         <w:szCs w:val="14"/>
         <w:rFonts w:ascii="Cambria" w:cs="Cambria" w:eastAsia="Cambria" w:hAnsi="Cambria"/>
       </w:rPr>
-      <w:t xml:space="preserve">Generated October 24, 2026  |  California Community Colleges  |  CPL Initiative</w:t>
+      <w:t xml:space="preserve">Generated October 25, 2026  |  California Community Colleges  |  CPL Initiative</w:t>
     </w:r>
     <w:r>
       <w:rPr>

</xml_diff>

<commit_message>
Daily dashboard update — 2026-10-26
</commit_message>
<xml_diff>
--- a/reports/CPL_Master_Report.docx
+++ b/reports/CPL_Master_Report.docx
@@ -141,7 +141,7 @@
           <w:szCs w:val="22"/>
           <w:rFonts w:ascii="Cambria" w:cs="Cambria" w:eastAsia="Cambria" w:hAnsi="Cambria"/>
         </w:rPr>
-        <w:t xml:space="preserve">As of October 25, 2026, the CPL initiative is ahead of schedule, with most 2025–2026 targets met or exceeded and core infrastructure nearing completion. The work has expanded student access, increased transcripted units, and established the foundation for a permanent, statewide CPL service under Vision 2030.</w:t>
+        <w:t xml:space="preserve">As of October 26, 2026, the CPL initiative is ahead of schedule, with most 2025–2026 targets met or exceeded and core infrastructure nearing completion. The work has expanded student access, increased transcripted units, and established the foundation for a permanent, statewide CPL service under Vision 2030.</w:t>
       </w:r>
     </w:p>
     <w:p>
@@ -29875,7 +29875,7 @@
           <w:szCs w:val="20"/>
           <w:rFonts w:ascii="Cambria" w:cs="Cambria" w:eastAsia="Cambria" w:hAnsi="Cambria"/>
         </w:rPr>
-        <w:t xml:space="preserve">October 25, 2026</w:t>
+        <w:t xml:space="preserve">October 26, 2026</w:t>
       </w:r>
     </w:p>
     <w:sectPr>
@@ -29912,7 +29912,7 @@
         <w:szCs w:val="14"/>
         <w:rFonts w:ascii="Cambria" w:cs="Cambria" w:eastAsia="Cambria" w:hAnsi="Cambria"/>
       </w:rPr>
-      <w:t xml:space="preserve">Generated October 25, 2026  |  California Community Colleges  |  CPL Initiative</w:t>
+      <w:t xml:space="preserve">Generated October 26, 2026  |  California Community Colleges  |  CPL Initiative</w:t>
     </w:r>
     <w:r>
       <w:rPr>

</xml_diff>

<commit_message>
Daily dashboard update — 2026-10-27
</commit_message>
<xml_diff>
--- a/reports/CPL_Master_Report.docx
+++ b/reports/CPL_Master_Report.docx
@@ -141,7 +141,7 @@
           <w:szCs w:val="22"/>
           <w:rFonts w:ascii="Cambria" w:cs="Cambria" w:eastAsia="Cambria" w:hAnsi="Cambria"/>
         </w:rPr>
-        <w:t xml:space="preserve">As of October 26, 2026, the CPL initiative is ahead of schedule, with most 2025–2026 targets met or exceeded and core infrastructure nearing completion. The work has expanded student access, increased transcripted units, and established the foundation for a permanent, statewide CPL service under Vision 2030.</w:t>
+        <w:t xml:space="preserve">As of October 27, 2026, the CPL initiative is ahead of schedule, with most 2025–2026 targets met or exceeded and core infrastructure nearing completion. The work has expanded student access, increased transcripted units, and established the foundation for a permanent, statewide CPL service under Vision 2030.</w:t>
       </w:r>
     </w:p>
     <w:p>
@@ -167,7 +167,7 @@
           <w:szCs w:val="21"/>
           <w:rFonts w:ascii="Cambria" w:cs="Cambria" w:eastAsia="Cambria" w:hAnsi="Cambria"/>
         </w:rPr>
-        <w:t xml:space="preserve">57,776 cumulative students served with CPL awards, surpassing annual targets.</w:t>
+        <w:t xml:space="preserve">57,967 cumulative students served with CPL awards, surpassing annual targets.</w:t>
       </w:r>
     </w:p>
     <w:p>
@@ -185,7 +185,7 @@
           <w:szCs w:val="21"/>
           <w:rFonts w:ascii="Cambria" w:cs="Cambria" w:eastAsia="Cambria" w:hAnsi="Cambria"/>
         </w:rPr>
-        <w:t xml:space="preserve">277k CPL units transcripted across the system.</w:t>
+        <w:t xml:space="preserve">278k CPL units transcripted across the system.</w:t>
       </w:r>
     </w:p>
     <w:p>
@@ -239,7 +239,7 @@
           <w:szCs w:val="21"/>
           <w:rFonts w:ascii="Cambria" w:cs="Cambria" w:eastAsia="Cambria" w:hAnsi="Cambria"/>
         </w:rPr>
-        <w:t xml:space="preserve">The Veteran Sprint has uploaded 64 JSTs to MAP, with estimated student savings of $393M and projected 20-year economic impact of $1.6B.</w:t>
+        <w:t xml:space="preserve">The Veteran Sprint has uploaded 64 JSTs to MAP, with estimated student savings of $394M and projected 20-year economic impact of $1.6B.</w:t>
       </w:r>
     </w:p>
     <w:p>
@@ -424,7 +424,7 @@
                 <w:szCs w:val="20"/>
                 <w:rFonts w:ascii="Cambria" w:cs="Cambria" w:eastAsia="Cambria" w:hAnsi="Cambria"/>
               </w:rPr>
-              <w:t xml:space="preserve">57,776</w:t>
+              <w:t xml:space="preserve">57,967</w:t>
             </w:r>
           </w:p>
         </w:tc>
@@ -494,7 +494,7 @@
                 <w:szCs w:val="20"/>
                 <w:rFonts w:ascii="Cambria" w:cs="Cambria" w:eastAsia="Cambria" w:hAnsi="Cambria"/>
               </w:rPr>
-              <w:t xml:space="preserve">277k</w:t>
+              <w:t xml:space="preserve">278k</w:t>
             </w:r>
           </w:p>
         </w:tc>
@@ -774,7 +774,7 @@
                 <w:szCs w:val="20"/>
                 <w:rFonts w:ascii="Cambria" w:cs="Cambria" w:eastAsia="Cambria" w:hAnsi="Cambria"/>
               </w:rPr>
-              <w:t xml:space="preserve">$393M</w:t>
+              <w:t xml:space="preserve">$394M</w:t>
             </w:r>
           </w:p>
         </w:tc>
@@ -29824,7 +29824,7 @@
           <w:szCs w:val="22"/>
           <w:rFonts w:ascii="Cambria" w:cs="Cambria" w:eastAsia="Cambria" w:hAnsi="Cambria"/>
         </w:rPr>
-        <w:t xml:space="preserve">The CPL Initiative has moved from pilot to scale, demonstrating measurable impact in student access, credit attainment, and system engagement. With 57,776 students served, 14,524 statewide credit recommendations, and 105 actively participating colleges, the initiative has surpassed most 2025–26 benchmarks ahead of schedule.</w:t>
+        <w:t xml:space="preserve">The CPL Initiative has moved from pilot to scale, demonstrating measurable impact in student access, credit attainment, and system engagement. With 57,967 students served, 14,524 statewide credit recommendations, and 105 actively participating colleges, the initiative has surpassed most 2025–26 benchmarks ahead of schedule.</w:t>
       </w:r>
     </w:p>
     <w:p>
@@ -29875,7 +29875,7 @@
           <w:szCs w:val="20"/>
           <w:rFonts w:ascii="Cambria" w:cs="Cambria" w:eastAsia="Cambria" w:hAnsi="Cambria"/>
         </w:rPr>
-        <w:t xml:space="preserve">October 26, 2026</w:t>
+        <w:t xml:space="preserve">October 27, 2026</w:t>
       </w:r>
     </w:p>
     <w:sectPr>
@@ -29912,7 +29912,7 @@
         <w:szCs w:val="14"/>
         <w:rFonts w:ascii="Cambria" w:cs="Cambria" w:eastAsia="Cambria" w:hAnsi="Cambria"/>
       </w:rPr>
-      <w:t xml:space="preserve">Generated October 26, 2026  |  California Community Colleges  |  CPL Initiative</w:t>
+      <w:t xml:space="preserve">Generated October 27, 2026  |  California Community Colleges  |  CPL Initiative</w:t>
     </w:r>
     <w:r>
       <w:rPr>

</xml_diff>

<commit_message>
Daily dashboard update — 2026-10-28
</commit_message>
<xml_diff>
--- a/reports/CPL_Master_Report.docx
+++ b/reports/CPL_Master_Report.docx
@@ -141,7 +141,7 @@
           <w:szCs w:val="22"/>
           <w:rFonts w:ascii="Cambria" w:cs="Cambria" w:eastAsia="Cambria" w:hAnsi="Cambria"/>
         </w:rPr>
-        <w:t xml:space="preserve">As of October 27, 2026, the CPL initiative is ahead of schedule, with most 2025–2026 targets met or exceeded and core infrastructure nearing completion. The work has expanded student access, increased transcripted units, and established the foundation for a permanent, statewide CPL service under Vision 2030.</w:t>
+        <w:t xml:space="preserve">As of October 28, 2026, the CPL initiative is ahead of schedule, with most 2025–2026 targets met or exceeded and core infrastructure nearing completion. The work has expanded student access, increased transcripted units, and established the foundation for a permanent, statewide CPL service under Vision 2030.</w:t>
       </w:r>
     </w:p>
     <w:p>
@@ -167,7 +167,7 @@
           <w:szCs w:val="21"/>
           <w:rFonts w:ascii="Cambria" w:cs="Cambria" w:eastAsia="Cambria" w:hAnsi="Cambria"/>
         </w:rPr>
-        <w:t xml:space="preserve">58,020 cumulative students served with CPL awards, surpassing annual targets.</w:t>
+        <w:t xml:space="preserve">58,235 cumulative students served with CPL awards, surpassing annual targets.</w:t>
       </w:r>
     </w:p>
     <w:p>
@@ -185,7 +185,7 @@
           <w:szCs w:val="21"/>
           <w:rFonts w:ascii="Cambria" w:cs="Cambria" w:eastAsia="Cambria" w:hAnsi="Cambria"/>
         </w:rPr>
-        <w:t xml:space="preserve">278k CPL units transcripted across the system.</w:t>
+        <w:t xml:space="preserve">279k CPL units transcripted across the system.</w:t>
       </w:r>
     </w:p>
     <w:p>
@@ -221,7 +221,7 @@
           <w:szCs w:val="21"/>
           <w:rFonts w:ascii="Cambria" w:cs="Cambria" w:eastAsia="Cambria" w:hAnsi="Cambria"/>
         </w:rPr>
-        <w:t xml:space="preserve">14,524 statewide credit recommendations, driven by faculty discipline workgroups spanning high-demand fields.</w:t>
+        <w:t xml:space="preserve">14,727 statewide credit recommendations, driven by faculty discipline workgroups spanning high-demand fields.</w:t>
       </w:r>
     </w:p>
     <w:p>
@@ -239,7 +239,7 @@
           <w:szCs w:val="21"/>
           <w:rFonts w:ascii="Cambria" w:cs="Cambria" w:eastAsia="Cambria" w:hAnsi="Cambria"/>
         </w:rPr>
-        <w:t xml:space="preserve">The Veteran Sprint has uploaded 64 JSTs to MAP, with estimated student savings of $394M and projected 20-year economic impact of $1.6B.</w:t>
+        <w:t xml:space="preserve">The Veteran Sprint has uploaded 65 JSTs to MAP, with estimated student savings of $395M and projected 20-year economic impact of $1.6B.</w:t>
       </w:r>
     </w:p>
     <w:p>
@@ -424,7 +424,7 @@
                 <w:szCs w:val="20"/>
                 <w:rFonts w:ascii="Cambria" w:cs="Cambria" w:eastAsia="Cambria" w:hAnsi="Cambria"/>
               </w:rPr>
-              <w:t xml:space="preserve">58,020</w:t>
+              <w:t xml:space="preserve">58,235</w:t>
             </w:r>
           </w:p>
         </w:tc>
@@ -494,7 +494,7 @@
                 <w:szCs w:val="20"/>
                 <w:rFonts w:ascii="Cambria" w:cs="Cambria" w:eastAsia="Cambria" w:hAnsi="Cambria"/>
               </w:rPr>
-              <w:t xml:space="preserve">278k</w:t>
+              <w:t xml:space="preserve">279k</w:t>
             </w:r>
           </w:p>
         </w:tc>
@@ -564,7 +564,7 @@
                 <w:szCs w:val="20"/>
                 <w:rFonts w:ascii="Cambria" w:cs="Cambria" w:eastAsia="Cambria" w:hAnsi="Cambria"/>
               </w:rPr>
-              <w:t xml:space="preserve">14,524</w:t>
+              <w:t xml:space="preserve">14,727</w:t>
             </w:r>
           </w:p>
         </w:tc>
@@ -704,7 +704,7 @@
                 <w:szCs w:val="20"/>
                 <w:rFonts w:ascii="Cambria" w:cs="Cambria" w:eastAsia="Cambria" w:hAnsi="Cambria"/>
               </w:rPr>
-              <w:t xml:space="preserve">64</w:t>
+              <w:t xml:space="preserve">65</w:t>
             </w:r>
           </w:p>
         </w:tc>
@@ -774,7 +774,7 @@
                 <w:szCs w:val="20"/>
                 <w:rFonts w:ascii="Cambria" w:cs="Cambria" w:eastAsia="Cambria" w:hAnsi="Cambria"/>
               </w:rPr>
-              <w:t xml:space="preserve">$394M</w:t>
+              <w:t xml:space="preserve">$395M</w:t>
             </w:r>
           </w:p>
         </w:tc>
@@ -29824,7 +29824,7 @@
           <w:szCs w:val="22"/>
           <w:rFonts w:ascii="Cambria" w:cs="Cambria" w:eastAsia="Cambria" w:hAnsi="Cambria"/>
         </w:rPr>
-        <w:t xml:space="preserve">The CPL Initiative has moved from pilot to scale, demonstrating measurable impact in student access, credit attainment, and system engagement. With 58,020 students served, 14,524 statewide credit recommendations, and 105 actively participating colleges, the initiative has surpassed most 2025–26 benchmarks ahead of schedule.</w:t>
+        <w:t xml:space="preserve">The CPL Initiative has moved from pilot to scale, demonstrating measurable impact in student access, credit attainment, and system engagement. With 58,235 students served, 14,727 statewide credit recommendations, and 105 actively participating colleges, the initiative has surpassed most 2025–26 benchmarks ahead of schedule.</w:t>
       </w:r>
     </w:p>
     <w:p>
@@ -29875,7 +29875,7 @@
           <w:szCs w:val="20"/>
           <w:rFonts w:ascii="Cambria" w:cs="Cambria" w:eastAsia="Cambria" w:hAnsi="Cambria"/>
         </w:rPr>
-        <w:t xml:space="preserve">October 27, 2026</w:t>
+        <w:t xml:space="preserve">October 28, 2026</w:t>
       </w:r>
     </w:p>
     <w:sectPr>
@@ -29912,7 +29912,7 @@
         <w:szCs w:val="14"/>
         <w:rFonts w:ascii="Cambria" w:cs="Cambria" w:eastAsia="Cambria" w:hAnsi="Cambria"/>
       </w:rPr>
-      <w:t xml:space="preserve">Generated October 27, 2026  |  California Community Colleges  |  CPL Initiative</w:t>
+      <w:t xml:space="preserve">Generated October 28, 2026  |  California Community Colleges  |  CPL Initiative</w:t>
     </w:r>
     <w:r>
       <w:rPr>

</xml_diff>

<commit_message>
Daily dashboard update — 2026-10-29
</commit_message>
<xml_diff>
--- a/reports/CPL_Master_Report.docx
+++ b/reports/CPL_Master_Report.docx
@@ -141,7 +141,7 @@
           <w:szCs w:val="22"/>
           <w:rFonts w:ascii="Cambria" w:cs="Cambria" w:eastAsia="Cambria" w:hAnsi="Cambria"/>
         </w:rPr>
-        <w:t xml:space="preserve">As of October 28, 2026, the CPL initiative is ahead of schedule, with most 2025–2026 targets met or exceeded and core infrastructure nearing completion. The work has expanded student access, increased transcripted units, and established the foundation for a permanent, statewide CPL service under Vision 2030.</w:t>
+        <w:t xml:space="preserve">As of October 29, 2026, the CPL initiative is ahead of schedule, with most 2025–2026 targets met or exceeded and core infrastructure nearing completion. The work has expanded student access, increased transcripted units, and established the foundation for a permanent, statewide CPL service under Vision 2030.</w:t>
       </w:r>
     </w:p>
     <w:p>
@@ -167,7 +167,7 @@
           <w:szCs w:val="21"/>
           <w:rFonts w:ascii="Cambria" w:cs="Cambria" w:eastAsia="Cambria" w:hAnsi="Cambria"/>
         </w:rPr>
-        <w:t xml:space="preserve">58,469 cumulative students served with CPL awards, surpassing annual targets.</w:t>
+        <w:t xml:space="preserve">58,567 cumulative students served with CPL awards, surpassing annual targets.</w:t>
       </w:r>
     </w:p>
     <w:p>
@@ -221,7 +221,7 @@
           <w:szCs w:val="21"/>
           <w:rFonts w:ascii="Cambria" w:cs="Cambria" w:eastAsia="Cambria" w:hAnsi="Cambria"/>
         </w:rPr>
-        <w:t xml:space="preserve">14,727 statewide credit recommendations, driven by faculty discipline workgroups spanning high-demand fields.</w:t>
+        <w:t xml:space="preserve">14,764 statewide credit recommendations, driven by faculty discipline workgroups spanning high-demand fields.</w:t>
       </w:r>
     </w:p>
     <w:p>
@@ -239,7 +239,7 @@
           <w:szCs w:val="21"/>
           <w:rFonts w:ascii="Cambria" w:cs="Cambria" w:eastAsia="Cambria" w:hAnsi="Cambria"/>
         </w:rPr>
-        <w:t xml:space="preserve">The Veteran Sprint has uploaded 66 JSTs to MAP, with estimated student savings of $395M and projected 20-year economic impact of $1.61B.</w:t>
+        <w:t xml:space="preserve">The Veteran Sprint has uploaded 67 JSTs to MAP, with estimated student savings of $396M and projected 20-year economic impact of $1.61B.</w:t>
       </w:r>
     </w:p>
     <w:p>
@@ -424,7 +424,7 @@
                 <w:szCs w:val="20"/>
                 <w:rFonts w:ascii="Cambria" w:cs="Cambria" w:eastAsia="Cambria" w:hAnsi="Cambria"/>
               </w:rPr>
-              <w:t xml:space="preserve">58,469</w:t>
+              <w:t xml:space="preserve">58,567</w:t>
             </w:r>
           </w:p>
         </w:tc>
@@ -564,7 +564,7 @@
                 <w:szCs w:val="20"/>
                 <w:rFonts w:ascii="Cambria" w:cs="Cambria" w:eastAsia="Cambria" w:hAnsi="Cambria"/>
               </w:rPr>
-              <w:t xml:space="preserve">14,727</w:t>
+              <w:t xml:space="preserve">14,764</w:t>
             </w:r>
           </w:p>
         </w:tc>
@@ -704,7 +704,7 @@
                 <w:szCs w:val="20"/>
                 <w:rFonts w:ascii="Cambria" w:cs="Cambria" w:eastAsia="Cambria" w:hAnsi="Cambria"/>
               </w:rPr>
-              <w:t xml:space="preserve">66</w:t>
+              <w:t xml:space="preserve">67</w:t>
             </w:r>
           </w:p>
         </w:tc>
@@ -774,7 +774,7 @@
                 <w:szCs w:val="20"/>
                 <w:rFonts w:ascii="Cambria" w:cs="Cambria" w:eastAsia="Cambria" w:hAnsi="Cambria"/>
               </w:rPr>
-              <w:t xml:space="preserve">$395M</w:t>
+              <w:t xml:space="preserve">$396M</w:t>
             </w:r>
           </w:p>
         </w:tc>
@@ -29824,7 +29824,7 @@
           <w:szCs w:val="22"/>
           <w:rFonts w:ascii="Cambria" w:cs="Cambria" w:eastAsia="Cambria" w:hAnsi="Cambria"/>
         </w:rPr>
-        <w:t xml:space="preserve">The CPL Initiative has moved from pilot to scale, demonstrating measurable impact in student access, credit attainment, and system engagement. With 58,469 students served, 14,727 statewide credit recommendations, and 105 actively participating colleges, the initiative has surpassed most 2025–26 benchmarks ahead of schedule.</w:t>
+        <w:t xml:space="preserve">The CPL Initiative has moved from pilot to scale, demonstrating measurable impact in student access, credit attainment, and system engagement. With 58,567 students served, 14,764 statewide credit recommendations, and 105 actively participating colleges, the initiative has surpassed most 2025–26 benchmarks ahead of schedule.</w:t>
       </w:r>
     </w:p>
     <w:p>
@@ -29875,7 +29875,7 @@
           <w:szCs w:val="20"/>
           <w:rFonts w:ascii="Cambria" w:cs="Cambria" w:eastAsia="Cambria" w:hAnsi="Cambria"/>
         </w:rPr>
-        <w:t xml:space="preserve">October 28, 2026</w:t>
+        <w:t xml:space="preserve">October 29, 2026</w:t>
       </w:r>
     </w:p>
     <w:sectPr>
@@ -29912,7 +29912,7 @@
         <w:szCs w:val="14"/>
         <w:rFonts w:ascii="Cambria" w:cs="Cambria" w:eastAsia="Cambria" w:hAnsi="Cambria"/>
       </w:rPr>
-      <w:t xml:space="preserve">Generated October 28, 2026  |  California Community Colleges  |  CPL Initiative</w:t>
+      <w:t xml:space="preserve">Generated October 29, 2026  |  California Community Colleges  |  CPL Initiative</w:t>
     </w:r>
     <w:r>
       <w:rPr>

</xml_diff>

<commit_message>
Daily dashboard update — 2026-10-30
</commit_message>
<xml_diff>
--- a/reports/CPL_Master_Report.docx
+++ b/reports/CPL_Master_Report.docx
@@ -141,7 +141,7 @@
           <w:szCs w:val="22"/>
           <w:rFonts w:ascii="Cambria" w:cs="Cambria" w:eastAsia="Cambria" w:hAnsi="Cambria"/>
         </w:rPr>
-        <w:t xml:space="preserve">As of October 29, 2026, the CPL initiative is ahead of schedule, with most 2025–2026 targets met or exceeded and core infrastructure nearing completion. The work has expanded student access, increased transcripted units, and established the foundation for a permanent, statewide CPL service under Vision 2030.</w:t>
+        <w:t xml:space="preserve">As of October 30, 2026, the CPL initiative is ahead of schedule, with most 2025–2026 targets met or exceeded and core infrastructure nearing completion. The work has expanded student access, increased transcripted units, and established the foundation for a permanent, statewide CPL service under Vision 2030.</w:t>
       </w:r>
     </w:p>
     <w:p>
@@ -167,7 +167,7 @@
           <w:szCs w:val="21"/>
           <w:rFonts w:ascii="Cambria" w:cs="Cambria" w:eastAsia="Cambria" w:hAnsi="Cambria"/>
         </w:rPr>
-        <w:t xml:space="preserve">58,701 cumulative students served with CPL awards, surpassing annual targets.</w:t>
+        <w:t xml:space="preserve">59,050 cumulative students served with CPL awards, surpassing annual targets.</w:t>
       </w:r>
     </w:p>
     <w:p>
@@ -185,7 +185,7 @@
           <w:szCs w:val="21"/>
           <w:rFonts w:ascii="Cambria" w:cs="Cambria" w:eastAsia="Cambria" w:hAnsi="Cambria"/>
         </w:rPr>
-        <w:t xml:space="preserve">280k CPL units transcripted across the system.</w:t>
+        <w:t xml:space="preserve">282k CPL units transcripted across the system.</w:t>
       </w:r>
     </w:p>
     <w:p>
@@ -221,7 +221,7 @@
           <w:szCs w:val="21"/>
           <w:rFonts w:ascii="Cambria" w:cs="Cambria" w:eastAsia="Cambria" w:hAnsi="Cambria"/>
         </w:rPr>
-        <w:t xml:space="preserve">14,848 statewide credit recommendations, driven by faculty discipline workgroups spanning high-demand fields.</w:t>
+        <w:t xml:space="preserve">14,840 statewide credit recommendations, driven by faculty discipline workgroups spanning high-demand fields.</w:t>
       </w:r>
     </w:p>
     <w:p>
@@ -239,7 +239,7 @@
           <w:szCs w:val="21"/>
           <w:rFonts w:ascii="Cambria" w:cs="Cambria" w:eastAsia="Cambria" w:hAnsi="Cambria"/>
         </w:rPr>
-        <w:t xml:space="preserve">The Veteran Sprint has uploaded 68 JSTs to MAP, with estimated student savings of $397M and projected 20-year economic impact of $1.61B.</w:t>
+        <w:t xml:space="preserve">The Veteran Sprint has uploaded 70 JSTs to MAP, with estimated student savings of $401M and projected 20-year economic impact of $1.62B.</w:t>
       </w:r>
     </w:p>
     <w:p>
@@ -424,7 +424,7 @@
                 <w:szCs w:val="20"/>
                 <w:rFonts w:ascii="Cambria" w:cs="Cambria" w:eastAsia="Cambria" w:hAnsi="Cambria"/>
               </w:rPr>
-              <w:t xml:space="preserve">58,701</w:t>
+              <w:t xml:space="preserve">59,050</w:t>
             </w:r>
           </w:p>
         </w:tc>
@@ -494,7 +494,7 @@
                 <w:szCs w:val="20"/>
                 <w:rFonts w:ascii="Cambria" w:cs="Cambria" w:eastAsia="Cambria" w:hAnsi="Cambria"/>
               </w:rPr>
-              <w:t xml:space="preserve">280k</w:t>
+              <w:t xml:space="preserve">282k</w:t>
             </w:r>
           </w:p>
         </w:tc>
@@ -564,7 +564,7 @@
                 <w:szCs w:val="20"/>
                 <w:rFonts w:ascii="Cambria" w:cs="Cambria" w:eastAsia="Cambria" w:hAnsi="Cambria"/>
               </w:rPr>
-              <w:t xml:space="preserve">14,848</w:t>
+              <w:t xml:space="preserve">14,840</w:t>
             </w:r>
           </w:p>
         </w:tc>
@@ -704,7 +704,7 @@
                 <w:szCs w:val="20"/>
                 <w:rFonts w:ascii="Cambria" w:cs="Cambria" w:eastAsia="Cambria" w:hAnsi="Cambria"/>
               </w:rPr>
-              <w:t xml:space="preserve">68</w:t>
+              <w:t xml:space="preserve">70</w:t>
             </w:r>
           </w:p>
         </w:tc>
@@ -774,7 +774,7 @@
                 <w:szCs w:val="20"/>
                 <w:rFonts w:ascii="Cambria" w:cs="Cambria" w:eastAsia="Cambria" w:hAnsi="Cambria"/>
               </w:rPr>
-              <w:t xml:space="preserve">$397M</w:t>
+              <w:t xml:space="preserve">$401M</w:t>
             </w:r>
           </w:p>
         </w:tc>
@@ -844,7 +844,7 @@
                 <w:szCs w:val="20"/>
                 <w:rFonts w:ascii="Cambria" w:cs="Cambria" w:eastAsia="Cambria" w:hAnsi="Cambria"/>
               </w:rPr>
-              <w:t xml:space="preserve">$1.61B</w:t>
+              <w:t xml:space="preserve">$1.62B</w:t>
             </w:r>
           </w:p>
         </w:tc>
@@ -29824,7 +29824,7 @@
           <w:szCs w:val="22"/>
           <w:rFonts w:ascii="Cambria" w:cs="Cambria" w:eastAsia="Cambria" w:hAnsi="Cambria"/>
         </w:rPr>
-        <w:t xml:space="preserve">The CPL Initiative has moved from pilot to scale, demonstrating measurable impact in student access, credit attainment, and system engagement. With 58,701 students served, 14,848 statewide credit recommendations, and 105 actively participating colleges, the initiative has surpassed most 2025–26 benchmarks ahead of schedule.</w:t>
+        <w:t xml:space="preserve">The CPL Initiative has moved from pilot to scale, demonstrating measurable impact in student access, credit attainment, and system engagement. With 59,050 students served, 14,840 statewide credit recommendations, and 105 actively participating colleges, the initiative has surpassed most 2025–26 benchmarks ahead of schedule.</w:t>
       </w:r>
     </w:p>
     <w:p>
@@ -29875,7 +29875,7 @@
           <w:szCs w:val="20"/>
           <w:rFonts w:ascii="Cambria" w:cs="Cambria" w:eastAsia="Cambria" w:hAnsi="Cambria"/>
         </w:rPr>
-        <w:t xml:space="preserve">October 29, 2026</w:t>
+        <w:t xml:space="preserve">October 30, 2026</w:t>
       </w:r>
     </w:p>
     <w:sectPr>
@@ -29912,7 +29912,7 @@
         <w:szCs w:val="14"/>
         <w:rFonts w:ascii="Cambria" w:cs="Cambria" w:eastAsia="Cambria" w:hAnsi="Cambria"/>
       </w:rPr>
-      <w:t xml:space="preserve">Generated October 29, 2026  |  California Community Colleges  |  CPL Initiative</w:t>
+      <w:t xml:space="preserve">Generated October 30, 2026  |  California Community Colleges  |  CPL Initiative</w:t>
     </w:r>
     <w:r>
       <w:rPr>

</xml_diff>

<commit_message>
Daily dashboard update — 2026-10-31
</commit_message>
<xml_diff>
--- a/reports/CPL_Master_Report.docx
+++ b/reports/CPL_Master_Report.docx
@@ -141,7 +141,7 @@
           <w:szCs w:val="22"/>
           <w:rFonts w:ascii="Cambria" w:cs="Cambria" w:eastAsia="Cambria" w:hAnsi="Cambria"/>
         </w:rPr>
-        <w:t xml:space="preserve">As of October 30, 2026, the CPL initiative is ahead of schedule, with most 2025–2026 targets met or exceeded and core infrastructure nearing completion. The work has expanded student access, increased transcripted units, and established the foundation for a permanent, statewide CPL service under Vision 2030.</w:t>
+        <w:t xml:space="preserve">As of October 31, 2026, the CPL initiative is ahead of schedule, with most 2025–2026 targets met or exceeded and core infrastructure nearing completion. The work has expanded student access, increased transcripted units, and established the foundation for a permanent, statewide CPL service under Vision 2030.</w:t>
       </w:r>
     </w:p>
     <w:p>
@@ -167,7 +167,7 @@
           <w:szCs w:val="21"/>
           <w:rFonts w:ascii="Cambria" w:cs="Cambria" w:eastAsia="Cambria" w:hAnsi="Cambria"/>
         </w:rPr>
-        <w:t xml:space="preserve">59,052 cumulative students served with CPL awards, surpassing annual targets.</w:t>
+        <w:t xml:space="preserve">59,130 cumulative students served with CPL awards, surpassing annual targets.</w:t>
       </w:r>
     </w:p>
     <w:p>
@@ -185,7 +185,7 @@
           <w:szCs w:val="21"/>
           <w:rFonts w:ascii="Cambria" w:cs="Cambria" w:eastAsia="Cambria" w:hAnsi="Cambria"/>
         </w:rPr>
-        <w:t xml:space="preserve">282k CPL units transcripted across the system.</w:t>
+        <w:t xml:space="preserve">283k CPL units transcripted across the system.</w:t>
       </w:r>
     </w:p>
     <w:p>
@@ -221,7 +221,7 @@
           <w:szCs w:val="21"/>
           <w:rFonts w:ascii="Cambria" w:cs="Cambria" w:eastAsia="Cambria" w:hAnsi="Cambria"/>
         </w:rPr>
-        <w:t xml:space="preserve">14,840 statewide credit recommendations, driven by faculty discipline workgroups spanning high-demand fields.</w:t>
+        <w:t xml:space="preserve">14,859 statewide credit recommendations, driven by faculty discipline workgroups spanning high-demand fields.</w:t>
       </w:r>
     </w:p>
     <w:p>
@@ -239,7 +239,7 @@
           <w:szCs w:val="21"/>
           <w:rFonts w:ascii="Cambria" w:cs="Cambria" w:eastAsia="Cambria" w:hAnsi="Cambria"/>
         </w:rPr>
-        <w:t xml:space="preserve">The Veteran Sprint has uploaded 70 JSTs to MAP, with estimated student savings of $401M and projected 20-year economic impact of $1.62B.</w:t>
+        <w:t xml:space="preserve">The Veteran Sprint has uploaded 70 JSTs to MAP, with estimated student savings of $402M and projected 20-year economic impact of $1.63B.</w:t>
       </w:r>
     </w:p>
     <w:p>
@@ -424,7 +424,7 @@
                 <w:szCs w:val="20"/>
                 <w:rFonts w:ascii="Cambria" w:cs="Cambria" w:eastAsia="Cambria" w:hAnsi="Cambria"/>
               </w:rPr>
-              <w:t xml:space="preserve">59,052</w:t>
+              <w:t xml:space="preserve">59,130</w:t>
             </w:r>
           </w:p>
         </w:tc>
@@ -494,7 +494,7 @@
                 <w:szCs w:val="20"/>
                 <w:rFonts w:ascii="Cambria" w:cs="Cambria" w:eastAsia="Cambria" w:hAnsi="Cambria"/>
               </w:rPr>
-              <w:t xml:space="preserve">282k</w:t>
+              <w:t xml:space="preserve">283k</w:t>
             </w:r>
           </w:p>
         </w:tc>
@@ -564,7 +564,7 @@
                 <w:szCs w:val="20"/>
                 <w:rFonts w:ascii="Cambria" w:cs="Cambria" w:eastAsia="Cambria" w:hAnsi="Cambria"/>
               </w:rPr>
-              <w:t xml:space="preserve">14,840</w:t>
+              <w:t xml:space="preserve">14,859</w:t>
             </w:r>
           </w:p>
         </w:tc>
@@ -774,7 +774,7 @@
                 <w:szCs w:val="20"/>
                 <w:rFonts w:ascii="Cambria" w:cs="Cambria" w:eastAsia="Cambria" w:hAnsi="Cambria"/>
               </w:rPr>
-              <w:t xml:space="preserve">$401M</w:t>
+              <w:t xml:space="preserve">$402M</w:t>
             </w:r>
           </w:p>
         </w:tc>
@@ -844,7 +844,7 @@
                 <w:szCs w:val="20"/>
                 <w:rFonts w:ascii="Cambria" w:cs="Cambria" w:eastAsia="Cambria" w:hAnsi="Cambria"/>
               </w:rPr>
-              <w:t xml:space="preserve">$1.62B</w:t>
+              <w:t xml:space="preserve">$1.63B</w:t>
             </w:r>
           </w:p>
         </w:tc>
@@ -29824,7 +29824,7 @@
           <w:szCs w:val="22"/>
           <w:rFonts w:ascii="Cambria" w:cs="Cambria" w:eastAsia="Cambria" w:hAnsi="Cambria"/>
         </w:rPr>
-        <w:t xml:space="preserve">The CPL Initiative has moved from pilot to scale, demonstrating measurable impact in student access, credit attainment, and system engagement. With 59,052 students served, 14,840 statewide credit recommendations, and 105 actively participating colleges, the initiative has surpassed most 2025–26 benchmarks ahead of schedule.</w:t>
+        <w:t xml:space="preserve">The CPL Initiative has moved from pilot to scale, demonstrating measurable impact in student access, credit attainment, and system engagement. With 59,130 students served, 14,859 statewide credit recommendations, and 105 actively participating colleges, the initiative has surpassed most 2025–26 benchmarks ahead of schedule.</w:t>
       </w:r>
     </w:p>
     <w:p>
@@ -29875,7 +29875,7 @@
           <w:szCs w:val="20"/>
           <w:rFonts w:ascii="Cambria" w:cs="Cambria" w:eastAsia="Cambria" w:hAnsi="Cambria"/>
         </w:rPr>
-        <w:t xml:space="preserve">October 30, 2026</w:t>
+        <w:t xml:space="preserve">October 31, 2026</w:t>
       </w:r>
     </w:p>
     <w:sectPr>
@@ -29912,7 +29912,7 @@
         <w:szCs w:val="14"/>
         <w:rFonts w:ascii="Cambria" w:cs="Cambria" w:eastAsia="Cambria" w:hAnsi="Cambria"/>
       </w:rPr>
-      <w:t xml:space="preserve">Generated October 30, 2026  |  California Community Colleges  |  CPL Initiative</w:t>
+      <w:t xml:space="preserve">Generated October 31, 2026  |  California Community Colleges  |  CPL Initiative</w:t>
     </w:r>
     <w:r>
       <w:rPr>

</xml_diff>

<commit_message>
Daily dashboard update — 2026-11-01
</commit_message>
<xml_diff>
--- a/reports/CPL_Master_Report.docx
+++ b/reports/CPL_Master_Report.docx
@@ -35,7 +35,7 @@
           <w:szCs w:val="36"/>
           <w:rFonts w:ascii="Cambria" w:cs="Cambria" w:eastAsia="Cambria" w:hAnsi="Cambria"/>
         </w:rPr>
-        <w:t xml:space="preserve">October 2026</w:t>
+        <w:t xml:space="preserve">November 2026</w:t>
       </w:r>
     </w:p>
     <w:p>
@@ -141,7 +141,7 @@
           <w:szCs w:val="22"/>
           <w:rFonts w:ascii="Cambria" w:cs="Cambria" w:eastAsia="Cambria" w:hAnsi="Cambria"/>
         </w:rPr>
-        <w:t xml:space="preserve">As of October 31, 2026, the CPL initiative is ahead of schedule, with most 2025–2026 targets met or exceeded and core infrastructure nearing completion. The work has expanded student access, increased transcripted units, and established the foundation for a permanent, statewide CPL service under Vision 2030.</w:t>
+        <w:t xml:space="preserve">As of November 1, 2026, the CPL initiative is ahead of schedule, with most 2025–2026 targets met or exceeded and core infrastructure nearing completion. The work has expanded student access, increased transcripted units, and established the foundation for a permanent, statewide CPL service under Vision 2030.</w:t>
       </w:r>
     </w:p>
     <w:p>
@@ -29875,7 +29875,7 @@
           <w:szCs w:val="20"/>
           <w:rFonts w:ascii="Cambria" w:cs="Cambria" w:eastAsia="Cambria" w:hAnsi="Cambria"/>
         </w:rPr>
-        <w:t xml:space="preserve">October 31, 2026</w:t>
+        <w:t xml:space="preserve">November 1, 2026</w:t>
       </w:r>
     </w:p>
     <w:sectPr>
@@ -29912,7 +29912,7 @@
         <w:szCs w:val="14"/>
         <w:rFonts w:ascii="Cambria" w:cs="Cambria" w:eastAsia="Cambria" w:hAnsi="Cambria"/>
       </w:rPr>
-      <w:t xml:space="preserve">Generated October 31, 2026  |  California Community Colleges  |  CPL Initiative</w:t>
+      <w:t xml:space="preserve">Generated November 1, 2026  |  California Community Colleges  |  CPL Initiative</w:t>
     </w:r>
     <w:r>
       <w:rPr>

</xml_diff>